<commit_message>
feat(worksheet): implement standard first-line indent and adaptive single-page spacing
</commit_message>
<xml_diff>
--- a/examples/三年级上/第03课_了解信息处理工具/03_了解信息处理工具_导学案.docx
+++ b/examples/三年级上/第03课_了解信息处理工具/03_了解信息处理工具_导学案.docx
@@ -6,7 +6,7 @@
     <w:p>
       <w:pPr>
         <w:pStyle w:val="1"/>
-        <w:spacing w:before="80" w:after="160" w:line="288" w:lineRule="auto"/>
+        <w:spacing w:before="120" w:after="280" w:line="312" w:lineRule="auto"/>
         <w:ind w:firstLine="0"/>
         <w:jc w:val="center"/>
       </w:pPr>
@@ -15,7 +15,7 @@
           <w:rFonts w:hint="eastAsia" w:ascii="黑体" w:hAnsi="黑体" w:eastAsia="黑体"/>
           <w:b/>
           <w:color w:val="1F2A44"/>
-          <w:sz w:val="32"/>
+          <w:sz w:val="34"/>
         </w:rPr>
         <w:t xml:space="preserve">第3课</w:t>
       </w:r>
@@ -24,7 +24,7 @@
           <w:rFonts w:ascii="黑体" w:hAnsi="黑体" w:eastAsia="黑体"/>
           <w:b/>
           <w:color w:val="1F2A44"/>
-          <w:sz w:val="32"/>
+          <w:sz w:val="34"/>
         </w:rPr>
         <w:t xml:space="preserve"> </w:t>
       </w:r>
@@ -33,7 +33,7 @@
           <w:rFonts w:hint="eastAsia" w:ascii="黑体" w:hAnsi="黑体" w:eastAsia="黑体"/>
           <w:b/>
           <w:color w:val="1F2A44"/>
-          <w:sz w:val="32"/>
+          <w:sz w:val="34"/>
         </w:rPr>
         <w:t xml:space="preserve">了解信息处理工具</w:t>
       </w:r>
@@ -42,7 +42,7 @@
           <w:rFonts w:ascii="黑体" w:hAnsi="黑体" w:eastAsia="黑体"/>
           <w:b/>
           <w:color w:val="1F2A44"/>
-          <w:sz w:val="32"/>
+          <w:sz w:val="34"/>
         </w:rPr>
         <w:t xml:space="preserve"> · </w:t>
       </w:r>
@@ -51,7 +51,7 @@
           <w:rFonts w:hint="eastAsia" w:ascii="黑体" w:hAnsi="黑体" w:eastAsia="黑体"/>
           <w:b/>
           <w:color w:val="1F2A44"/>
-          <w:sz w:val="32"/>
+          <w:sz w:val="34"/>
         </w:rPr>
         <w:t xml:space="preserve">课堂导学单</w:t>
       </w:r>
@@ -59,7 +59,7 @@
     <w:p>
       <w:pPr>
         <w:pStyle w:val="FirstParagraph"/>
-        <w:spacing w:before="40" w:after="240" w:line="288" w:lineRule="auto"/>
+        <w:spacing w:before="80" w:after="320" w:line="312" w:lineRule="auto"/>
         <w:ind w:firstLine="0"/>
         <w:jc w:val="center"/>
       </w:pPr>
@@ -160,35 +160,40 @@
     <w:p>
       <w:pPr>
         <w:pStyle w:val="aa"/>
-        <w:spacing w:before="20" w:after="40" w:line="288" w:lineRule="auto"/>
-        <w:ind w:firstLine="0"/>
-      </w:pPr>
-      <w:r>
-        <w:rPr>
-          <w:rFonts w:ascii="宋体" w:hAnsi="宋体" w:eastAsia="宋体"/>
+        <w:spacing w:before="120" w:after="320" w:line="324" w:lineRule="auto"/>
+        <w:ind w:left="160" w:firstLine="0"/>
+        <w:jc w:val="left"/>
+      </w:pPr>
+      <w:r>
+        <w:rPr>
+          <w:rFonts w:ascii="楷体" w:hAnsi="楷体" w:eastAsia="楷体"/>
+          <w:color w:val="2E405E"/>
           <w:sz w:val="21"/>
         </w:rPr>
         <w:t xml:space="preserve">🎯</w:t>
       </w:r>
       <w:r>
         <w:rPr>
-          <w:rFonts w:ascii="宋体" w:hAnsi="宋体" w:eastAsia="宋体"/>
+          <w:rFonts w:ascii="楷体" w:hAnsi="楷体" w:eastAsia="楷体"/>
+          <w:color w:val="2E405E"/>
           <w:sz w:val="21"/>
         </w:rPr>
         <w:t xml:space="preserve"> </w:t>
       </w:r>
       <w:r>
         <w:rPr>
-          <w:rFonts w:hint="eastAsia" w:ascii="宋体" w:hAnsi="宋体" w:eastAsia="宋体"/>
+          <w:rFonts w:hint="eastAsia" w:ascii="楷体" w:hAnsi="楷体" w:eastAsia="楷体"/>
           <w:b/>
           <w:bCs/>
+          <w:color w:val="2E405E"/>
           <w:sz w:val="21"/>
         </w:rPr>
         <w:t xml:space="preserve">通关目标</w:t>
       </w:r>
       <w:r>
         <w:rPr>
-          <w:rFonts w:hint="eastAsia" w:ascii="宋体" w:hAnsi="宋体" w:eastAsia="宋体"/>
+          <w:rFonts w:hint="eastAsia" w:ascii="楷体" w:hAnsi="楷体" w:eastAsia="楷体"/>
+          <w:color w:val="2E405E"/>
           <w:sz w:val="21"/>
         </w:rPr>
         <w:t xml:space="preserve">：认识身边常见信息工具，解密电脑主机，规范操作鼠标键盘！</w:t>
@@ -198,7 +203,7 @@
     <w:p>
       <w:pPr>
         <w:pStyle w:val="3"/>
-        <w:spacing w:before="240" w:after="80" w:line="288" w:lineRule="auto"/>
+        <w:spacing w:before="320" w:after="120" w:line="300" w:lineRule="auto"/>
         <w:ind w:firstLine="0"/>
         <w:jc w:val="left"/>
       </w:pPr>
@@ -207,7 +212,7 @@
           <w:rFonts w:ascii="黑体" w:hAnsi="黑体" w:eastAsia="黑体"/>
           <w:b/>
           <w:color w:val="1F3A60"/>
-          <w:sz w:val="24"/>
+          <w:sz w:val="25"/>
         </w:rPr>
         <w:t xml:space="preserve">⭐ </w:t>
       </w:r>
@@ -216,7 +221,7 @@
           <w:rFonts w:hint="eastAsia" w:ascii="黑体" w:hAnsi="黑体" w:eastAsia="黑体"/>
           <w:b/>
           <w:color w:val="1F3A60"/>
-          <w:sz w:val="24"/>
+          <w:sz w:val="25"/>
         </w:rPr>
         <w:t xml:space="preserve">第一关：火眼金睛</w:t>
       </w:r>
@@ -225,7 +230,7 @@
           <w:rFonts w:ascii="黑体" w:hAnsi="黑体" w:eastAsia="黑体"/>
           <w:b/>
           <w:color w:val="1F3A60"/>
-          <w:sz w:val="24"/>
+          <w:sz w:val="25"/>
         </w:rPr>
         <w:t xml:space="preserve"> · </w:t>
       </w:r>
@@ -234,7 +239,7 @@
           <w:rFonts w:hint="eastAsia" w:ascii="黑体" w:hAnsi="黑体" w:eastAsia="黑体"/>
           <w:b/>
           <w:color w:val="1F3A60"/>
-          <w:sz w:val="24"/>
+          <w:sz w:val="25"/>
         </w:rPr>
         <w:t xml:space="preserve">工具本领连连看</w:t>
       </w:r>
@@ -242,8 +247,8 @@
     <w:p>
       <w:pPr>
         <w:pStyle w:val="FirstParagraph"/>
-        <w:spacing w:before="20" w:after="40" w:line="288" w:lineRule="auto"/>
-        <w:ind w:firstLine="0"/>
+        <w:spacing w:before="60" w:after="120" w:line="331" w:lineRule="auto"/>
+        <w:ind w:left="0" w:firstLine="420"/>
       </w:pPr>
       <w:r>
         <w:rPr>
@@ -273,9 +278,9 @@
       <w:tblPr>
         <w:tblStyle w:val="Table"/>
         <w:tblW w:type="pct" w:w="5000"/>
-        <w:jc w:val="center"/>
         <w:tblLayout w:type="fixed"/>
         <w:tblLook w:firstRow="1" w:lastRow="0" w:firstColumn="0" w:lastColumn="0" w:noHBand="0" w:noVBand="0" w:val="0020"/>
+        <w:jc w:val="center"/>
         <w:tblBorders>
           <w:top w:val="single" w:sz="4" w:space="0" w:color="A0A0A0"/>
           <w:left w:val="single" w:sz="4" w:space="0" w:color="A0A0A0"/>
@@ -285,10 +290,10 @@
           <w:insideV w:val="single" w:sz="4" w:space="0" w:color="C0C0C0"/>
         </w:tblBorders>
         <w:tblCellMar>
-          <w:top w:w="80" w:type="dxa"/>
-          <w:bottom w:w="80" w:type="dxa"/>
-          <w:left w:w="120" w:type="dxa"/>
-          <w:right w:w="120" w:type="dxa"/>
+          <w:top w:w="130" w:type="dxa"/>
+          <w:bottom w:w="130" w:type="dxa"/>
+          <w:left w:w="150" w:type="dxa"/>
+          <w:right w:w="150" w:type="dxa"/>
         </w:tblCellMar>
       </w:tblPr>
       <w:tblGrid>
@@ -304,11 +309,12 @@
           <w:tcPr>
             <w:vAlign w:val="center"/>
             <w:shd w:fill="EDF2F7"/>
+            <w:shd w:fill="EDF2F7"/>
           </w:tcPr>
           <w:p>
             <w:pPr>
               <w:pStyle w:val="Compact"/>
-              <w:spacing w:before="20" w:after="20" w:line="276" w:lineRule="auto"/>
+              <w:spacing w:before="20" w:after="20" w:line="293" w:lineRule="auto"/>
               <w:ind w:firstLine="0"/>
               <w:jc w:val="left"/>
             </w:pPr>
@@ -316,7 +322,7 @@
               <w:rPr>
                 <w:rFonts w:hint="eastAsia" w:ascii="黑体" w:hAnsi="黑体" w:eastAsia="黑体"/>
                 <w:b/>
-                <w:sz w:val="19"/>
+                <w:sz w:val="20"/>
               </w:rPr>
               <w:t xml:space="preserve">常见信息工具</w:t>
             </w:r>
@@ -326,11 +332,12 @@
           <w:tcPr>
             <w:vAlign w:val="center"/>
             <w:shd w:fill="EDF2F7"/>
+            <w:shd w:fill="EDF2F7"/>
           </w:tcPr>
           <w:p>
             <w:pPr>
               <w:pStyle w:val="Compact"/>
-              <w:spacing w:before="20" w:after="20" w:line="276" w:lineRule="auto"/>
+              <w:spacing w:before="20" w:after="20" w:line="293" w:lineRule="auto"/>
               <w:ind w:firstLine="0"/>
               <w:jc w:val="left"/>
             </w:pPr>
@@ -338,7 +345,7 @@
               <w:rPr>
                 <w:rFonts w:hint="eastAsia" w:ascii="黑体" w:hAnsi="黑体" w:eastAsia="黑体"/>
                 <w:b/>
-                <w:sz w:val="19"/>
+                <w:sz w:val="20"/>
               </w:rPr>
               <w:t xml:space="preserve">主要本领与应用</w:t>
             </w:r>
@@ -348,11 +355,12 @@
           <w:tcPr>
             <w:vAlign w:val="center"/>
             <w:shd w:fill="EDF2F7"/>
+            <w:shd w:fill="EDF2F7"/>
           </w:tcPr>
           <w:p>
             <w:pPr>
               <w:pStyle w:val="Compact"/>
-              <w:spacing w:before="20" w:after="20" w:line="276" w:lineRule="auto"/>
+              <w:spacing w:before="20" w:after="20" w:line="293" w:lineRule="auto"/>
               <w:ind w:firstLine="0"/>
               <w:jc w:val="center"/>
             </w:pPr>
@@ -360,7 +368,7 @@
               <w:rPr>
                 <w:rFonts w:hint="eastAsia" w:ascii="黑体" w:hAnsi="黑体" w:eastAsia="黑体"/>
                 <w:b/>
-                <w:sz w:val="19"/>
+                <w:sz w:val="20"/>
               </w:rPr>
               <w:t xml:space="preserve">连线匹配</w:t>
             </w:r>
@@ -375,7 +383,7 @@
           <w:p>
             <w:pPr>
               <w:pStyle w:val="Compact"/>
-              <w:spacing w:before="20" w:after="20" w:line="276" w:lineRule="auto"/>
+              <w:spacing w:before="20" w:after="20" w:line="293" w:lineRule="auto"/>
               <w:ind w:firstLine="0"/>
               <w:jc w:val="left"/>
             </w:pPr>
@@ -384,7 +392,7 @@
                 <w:rFonts w:ascii="宋体" w:hAnsi="宋体" w:eastAsia="宋体"/>
                 <w:b/>
                 <w:bCs/>
-                <w:sz w:val="19"/>
+                <w:sz w:val="20"/>
               </w:rPr>
               <w:t xml:space="preserve">A. </w:t>
             </w:r>
@@ -393,7 +401,7 @@
                 <w:rFonts w:hint="eastAsia" w:ascii="宋体" w:hAnsi="宋体" w:eastAsia="宋体"/>
                 <w:b/>
                 <w:bCs/>
-                <w:sz w:val="19"/>
+                <w:sz w:val="20"/>
               </w:rPr>
               <w:t xml:space="preserve">测温枪</w:t>
             </w:r>
@@ -406,21 +414,21 @@
           <w:p>
             <w:pPr>
               <w:pStyle w:val="Compact"/>
-              <w:spacing w:before="20" w:after="20" w:line="276" w:lineRule="auto"/>
+              <w:spacing w:before="20" w:after="20" w:line="293" w:lineRule="auto"/>
               <w:ind w:firstLine="0"/>
               <w:jc w:val="left"/>
             </w:pPr>
             <w:r>
               <w:rPr>
                 <w:rFonts w:ascii="宋体" w:hAnsi="宋体" w:eastAsia="宋体"/>
-                <w:sz w:val="19"/>
+                <w:sz w:val="20"/>
               </w:rPr>
               <w:t xml:space="preserve">① </w:t>
             </w:r>
             <w:r>
               <w:rPr>
                 <w:rFonts w:hint="eastAsia" w:ascii="宋体" w:hAnsi="宋体" w:eastAsia="宋体"/>
-                <w:sz w:val="19"/>
+                <w:sz w:val="20"/>
               </w:rPr>
               <w:t xml:space="preserve">液晶屏直显尺寸，精准测量零部件</w:t>
             </w:r>
@@ -433,35 +441,35 @@
           <w:p>
             <w:pPr>
               <w:pStyle w:val="Compact"/>
-              <w:spacing w:before="20" w:after="20" w:line="276" w:lineRule="auto"/>
+              <w:spacing w:before="20" w:after="20" w:line="293" w:lineRule="auto"/>
               <w:ind w:firstLine="0"/>
               <w:jc w:val="center"/>
             </w:pPr>
             <w:r>
               <w:rPr>
                 <w:rFonts w:ascii="宋体" w:hAnsi="宋体" w:eastAsia="宋体"/>
-                <w:sz w:val="19"/>
+                <w:sz w:val="20"/>
               </w:rPr>
               <w:t xml:space="preserve">A ➔ </w:t>
             </w:r>
             <w:r>
               <w:rPr>
                 <w:rFonts w:hint="eastAsia" w:ascii="宋体" w:hAnsi="宋体" w:eastAsia="宋体"/>
-                <w:sz w:val="19"/>
+                <w:sz w:val="20"/>
               </w:rPr>
               <w:t xml:space="preserve">（</w:t>
             </w:r>
             <w:r>
               <w:rPr>
                 <w:rFonts w:ascii="宋体" w:hAnsi="宋体" w:eastAsia="宋体"/>
-                <w:sz w:val="19"/>
+                <w:sz w:val="20"/>
               </w:rPr>
               <w:t xml:space="preserve">   </w:t>
             </w:r>
             <w:r>
               <w:rPr>
                 <w:rFonts w:hint="eastAsia" w:ascii="宋体" w:hAnsi="宋体" w:eastAsia="宋体"/>
-                <w:sz w:val="19"/>
+                <w:sz w:val="20"/>
               </w:rPr>
               <w:t xml:space="preserve">）</w:t>
             </w:r>
@@ -476,7 +484,7 @@
           <w:p>
             <w:pPr>
               <w:pStyle w:val="Compact"/>
-              <w:spacing w:before="20" w:after="20" w:line="276" w:lineRule="auto"/>
+              <w:spacing w:before="20" w:after="20" w:line="293" w:lineRule="auto"/>
               <w:ind w:firstLine="0"/>
               <w:jc w:val="left"/>
             </w:pPr>
@@ -485,7 +493,7 @@
                 <w:rFonts w:ascii="宋体" w:hAnsi="宋体" w:eastAsia="宋体"/>
                 <w:b/>
                 <w:bCs/>
-                <w:sz w:val="19"/>
+                <w:sz w:val="20"/>
               </w:rPr>
               <w:t xml:space="preserve">B. </w:t>
             </w:r>
@@ -494,7 +502,7 @@
                 <w:rFonts w:hint="eastAsia" w:ascii="宋体" w:hAnsi="宋体" w:eastAsia="宋体"/>
                 <w:b/>
                 <w:bCs/>
-                <w:sz w:val="19"/>
+                <w:sz w:val="20"/>
               </w:rPr>
               <w:t xml:space="preserve">数显卡尺</w:t>
             </w:r>
@@ -507,21 +515,21 @@
           <w:p>
             <w:pPr>
               <w:pStyle w:val="Compact"/>
-              <w:spacing w:before="20" w:after="20" w:line="276" w:lineRule="auto"/>
+              <w:spacing w:before="20" w:after="20" w:line="293" w:lineRule="auto"/>
               <w:ind w:firstLine="0"/>
               <w:jc w:val="left"/>
             </w:pPr>
             <w:r>
               <w:rPr>
                 <w:rFonts w:ascii="宋体" w:hAnsi="宋体" w:eastAsia="宋体"/>
-                <w:sz w:val="19"/>
+                <w:sz w:val="20"/>
               </w:rPr>
               <w:t xml:space="preserve">② </w:t>
             </w:r>
             <w:r>
               <w:rPr>
                 <w:rFonts w:hint="eastAsia" w:ascii="宋体" w:hAnsi="宋体" w:eastAsia="宋体"/>
-                <w:sz w:val="19"/>
+                <w:sz w:val="20"/>
               </w:rPr>
               <w:t xml:space="preserve">1秒快速测体温，守护身体健康</w:t>
             </w:r>
@@ -534,35 +542,35 @@
           <w:p>
             <w:pPr>
               <w:pStyle w:val="Compact"/>
-              <w:spacing w:before="20" w:after="20" w:line="276" w:lineRule="auto"/>
+              <w:spacing w:before="20" w:after="20" w:line="293" w:lineRule="auto"/>
               <w:ind w:firstLine="0"/>
               <w:jc w:val="center"/>
             </w:pPr>
             <w:r>
               <w:rPr>
                 <w:rFonts w:ascii="宋体" w:hAnsi="宋体" w:eastAsia="宋体"/>
-                <w:sz w:val="19"/>
+                <w:sz w:val="20"/>
               </w:rPr>
               <w:t xml:space="preserve">B ➔ </w:t>
             </w:r>
             <w:r>
               <w:rPr>
                 <w:rFonts w:hint="eastAsia" w:ascii="宋体" w:hAnsi="宋体" w:eastAsia="宋体"/>
-                <w:sz w:val="19"/>
+                <w:sz w:val="20"/>
               </w:rPr>
               <w:t xml:space="preserve">（</w:t>
             </w:r>
             <w:r>
               <w:rPr>
                 <w:rFonts w:ascii="宋体" w:hAnsi="宋体" w:eastAsia="宋体"/>
-                <w:sz w:val="19"/>
+                <w:sz w:val="20"/>
               </w:rPr>
               <w:t xml:space="preserve">   </w:t>
             </w:r>
             <w:r>
               <w:rPr>
                 <w:rFonts w:hint="eastAsia" w:ascii="宋体" w:hAnsi="宋体" w:eastAsia="宋体"/>
-                <w:sz w:val="19"/>
+                <w:sz w:val="20"/>
               </w:rPr>
               <w:t xml:space="preserve">）</w:t>
             </w:r>
@@ -577,7 +585,7 @@
           <w:p>
             <w:pPr>
               <w:pStyle w:val="Compact"/>
-              <w:spacing w:before="20" w:after="20" w:line="276" w:lineRule="auto"/>
+              <w:spacing w:before="20" w:after="20" w:line="293" w:lineRule="auto"/>
               <w:ind w:firstLine="0"/>
               <w:jc w:val="left"/>
             </w:pPr>
@@ -586,7 +594,7 @@
                 <w:rFonts w:ascii="宋体" w:hAnsi="宋体" w:eastAsia="宋体"/>
                 <w:b/>
                 <w:bCs/>
-                <w:sz w:val="19"/>
+                <w:sz w:val="20"/>
               </w:rPr>
               <w:t xml:space="preserve">C. </w:t>
             </w:r>
@@ -595,7 +603,7 @@
                 <w:rFonts w:hint="eastAsia" w:ascii="宋体" w:hAnsi="宋体" w:eastAsia="宋体"/>
                 <w:b/>
                 <w:bCs/>
-                <w:sz w:val="19"/>
+                <w:sz w:val="20"/>
               </w:rPr>
               <w:t xml:space="preserve">智能道闸</w:t>
             </w:r>
@@ -608,21 +616,21 @@
           <w:p>
             <w:pPr>
               <w:pStyle w:val="Compact"/>
-              <w:spacing w:before="20" w:after="20" w:line="276" w:lineRule="auto"/>
+              <w:spacing w:before="20" w:after="20" w:line="293" w:lineRule="auto"/>
               <w:ind w:firstLine="0"/>
               <w:jc w:val="left"/>
             </w:pPr>
             <w:r>
               <w:rPr>
                 <w:rFonts w:ascii="宋体" w:hAnsi="宋体" w:eastAsia="宋体"/>
-                <w:sz w:val="19"/>
+                <w:sz w:val="20"/>
               </w:rPr>
               <w:t xml:space="preserve">③ </w:t>
             </w:r>
             <w:r>
               <w:rPr>
                 <w:rFonts w:hint="eastAsia" w:ascii="宋体" w:hAnsi="宋体" w:eastAsia="宋体"/>
-                <w:sz w:val="19"/>
+                <w:sz w:val="20"/>
               </w:rPr>
               <w:t xml:space="preserve">功能全面算力强，现代信息处理全能大师</w:t>
             </w:r>
@@ -635,35 +643,35 @@
           <w:p>
             <w:pPr>
               <w:pStyle w:val="Compact"/>
-              <w:spacing w:before="20" w:after="20" w:line="276" w:lineRule="auto"/>
+              <w:spacing w:before="20" w:after="20" w:line="293" w:lineRule="auto"/>
               <w:ind w:firstLine="0"/>
               <w:jc w:val="center"/>
             </w:pPr>
             <w:r>
               <w:rPr>
                 <w:rFonts w:ascii="宋体" w:hAnsi="宋体" w:eastAsia="宋体"/>
-                <w:sz w:val="19"/>
+                <w:sz w:val="20"/>
               </w:rPr>
               <w:t xml:space="preserve">C ➔ </w:t>
             </w:r>
             <w:r>
               <w:rPr>
                 <w:rFonts w:hint="eastAsia" w:ascii="宋体" w:hAnsi="宋体" w:eastAsia="宋体"/>
-                <w:sz w:val="19"/>
+                <w:sz w:val="20"/>
               </w:rPr>
               <w:t xml:space="preserve">（</w:t>
             </w:r>
             <w:r>
               <w:rPr>
                 <w:rFonts w:ascii="宋体" w:hAnsi="宋体" w:eastAsia="宋体"/>
-                <w:sz w:val="19"/>
+                <w:sz w:val="20"/>
               </w:rPr>
               <w:t xml:space="preserve">   </w:t>
             </w:r>
             <w:r>
               <w:rPr>
                 <w:rFonts w:hint="eastAsia" w:ascii="宋体" w:hAnsi="宋体" w:eastAsia="宋体"/>
-                <w:sz w:val="19"/>
+                <w:sz w:val="20"/>
               </w:rPr>
               <w:t xml:space="preserve">）</w:t>
             </w:r>
@@ -678,7 +686,7 @@
           <w:p>
             <w:pPr>
               <w:pStyle w:val="Compact"/>
-              <w:spacing w:before="20" w:after="20" w:line="276" w:lineRule="auto"/>
+              <w:spacing w:before="20" w:after="20" w:line="293" w:lineRule="auto"/>
               <w:ind w:firstLine="0"/>
               <w:jc w:val="left"/>
             </w:pPr>
@@ -687,7 +695,7 @@
                 <w:rFonts w:ascii="宋体" w:hAnsi="宋体" w:eastAsia="宋体"/>
                 <w:b/>
                 <w:bCs/>
-                <w:sz w:val="19"/>
+                <w:sz w:val="20"/>
               </w:rPr>
               <w:t xml:space="preserve">D. </w:t>
             </w:r>
@@ -696,7 +704,7 @@
                 <w:rFonts w:hint="eastAsia" w:ascii="宋体" w:hAnsi="宋体" w:eastAsia="宋体"/>
                 <w:b/>
                 <w:bCs/>
-                <w:sz w:val="19"/>
+                <w:sz w:val="20"/>
               </w:rPr>
               <w:t xml:space="preserve">电子计算机</w:t>
             </w:r>
@@ -709,21 +717,21 @@
           <w:p>
             <w:pPr>
               <w:pStyle w:val="Compact"/>
-              <w:spacing w:before="20" w:after="20" w:line="276" w:lineRule="auto"/>
+              <w:spacing w:before="20" w:after="20" w:line="293" w:lineRule="auto"/>
               <w:ind w:firstLine="0"/>
               <w:jc w:val="left"/>
             </w:pPr>
             <w:r>
               <w:rPr>
                 <w:rFonts w:ascii="宋体" w:hAnsi="宋体" w:eastAsia="宋体"/>
-                <w:sz w:val="19"/>
+                <w:sz w:val="20"/>
               </w:rPr>
               <w:t xml:space="preserve">④ </w:t>
             </w:r>
             <w:r>
               <w:rPr>
                 <w:rFonts w:hint="eastAsia" w:ascii="宋体" w:hAnsi="宋体" w:eastAsia="宋体"/>
-                <w:sz w:val="19"/>
+                <w:sz w:val="20"/>
               </w:rPr>
               <w:t xml:space="preserve">刷脸刷卡秒抬杆，快速记录人员出入</w:t>
             </w:r>
@@ -736,35 +744,35 @@
           <w:p>
             <w:pPr>
               <w:pStyle w:val="Compact"/>
-              <w:spacing w:before="20" w:after="20" w:line="276" w:lineRule="auto"/>
+              <w:spacing w:before="20" w:after="20" w:line="293" w:lineRule="auto"/>
               <w:ind w:firstLine="0"/>
               <w:jc w:val="center"/>
             </w:pPr>
             <w:r>
               <w:rPr>
                 <w:rFonts w:ascii="宋体" w:hAnsi="宋体" w:eastAsia="宋体"/>
-                <w:sz w:val="19"/>
+                <w:sz w:val="20"/>
               </w:rPr>
               <w:t xml:space="preserve">D ➔ </w:t>
             </w:r>
             <w:r>
               <w:rPr>
                 <w:rFonts w:hint="eastAsia" w:ascii="宋体" w:hAnsi="宋体" w:eastAsia="宋体"/>
-                <w:sz w:val="19"/>
+                <w:sz w:val="20"/>
               </w:rPr>
               <w:t xml:space="preserve">（</w:t>
             </w:r>
             <w:r>
               <w:rPr>
                 <w:rFonts w:ascii="宋体" w:hAnsi="宋体" w:eastAsia="宋体"/>
-                <w:sz w:val="19"/>
+                <w:sz w:val="20"/>
               </w:rPr>
               <w:t xml:space="preserve">   </w:t>
             </w:r>
             <w:r>
               <w:rPr>
                 <w:rFonts w:hint="eastAsia" w:ascii="宋体" w:hAnsi="宋体" w:eastAsia="宋体"/>
-                <w:sz w:val="19"/>
+                <w:sz w:val="20"/>
               </w:rPr>
               <w:t xml:space="preserve">）</w:t>
             </w:r>
@@ -775,8 +783,8 @@
     <w:p>
       <w:pPr>
         <w:pStyle w:val="FirstParagraph"/>
-        <w:spacing w:before="20" w:after="40" w:line="288" w:lineRule="auto"/>
-        <w:ind w:firstLine="0"/>
+        <w:spacing w:before="60" w:after="120" w:line="331" w:lineRule="auto"/>
+        <w:ind w:left="0" w:firstLine="420"/>
       </w:pPr>
       <w:r>
         <w:rPr>
@@ -802,7 +810,7 @@
     <w:p>
       <w:pPr>
         <w:pStyle w:val="3"/>
-        <w:spacing w:before="240" w:after="80" w:line="288" w:lineRule="auto"/>
+        <w:spacing w:before="320" w:after="120" w:line="300" w:lineRule="auto"/>
         <w:ind w:firstLine="0"/>
         <w:jc w:val="left"/>
       </w:pPr>
@@ -811,7 +819,7 @@
           <w:rFonts w:ascii="黑体" w:hAnsi="黑体" w:eastAsia="黑体"/>
           <w:b/>
           <w:color w:val="1F3A60"/>
-          <w:sz w:val="24"/>
+          <w:sz w:val="25"/>
         </w:rPr>
         <w:t xml:space="preserve">⭐⭐ </w:t>
       </w:r>
@@ -820,7 +828,7 @@
           <w:rFonts w:hint="eastAsia" w:ascii="黑体" w:hAnsi="黑体" w:eastAsia="黑体"/>
           <w:b/>
           <w:color w:val="1F3A60"/>
-          <w:sz w:val="24"/>
+          <w:sz w:val="25"/>
         </w:rPr>
         <w:t xml:space="preserve">第二关：透视机箱</w:t>
       </w:r>
@@ -829,7 +837,7 @@
           <w:rFonts w:ascii="黑体" w:hAnsi="黑体" w:eastAsia="黑体"/>
           <w:b/>
           <w:color w:val="1F3A60"/>
-          <w:sz w:val="24"/>
+          <w:sz w:val="25"/>
         </w:rPr>
         <w:t xml:space="preserve"> · </w:t>
       </w:r>
@@ -838,7 +846,7 @@
           <w:rFonts w:hint="eastAsia" w:ascii="黑体" w:hAnsi="黑体" w:eastAsia="黑体"/>
           <w:b/>
           <w:color w:val="1F3A60"/>
-          <w:sz w:val="24"/>
+          <w:sz w:val="25"/>
         </w:rPr>
         <w:t xml:space="preserve">核心构件小档案</w:t>
       </w:r>
@@ -846,8 +854,8 @@
     <w:p>
       <w:pPr>
         <w:pStyle w:val="FirstParagraph"/>
-        <w:spacing w:before="20" w:after="40" w:line="288" w:lineRule="auto"/>
-        <w:ind w:firstLine="0"/>
+        <w:spacing w:before="60" w:after="120" w:line="331" w:lineRule="auto"/>
+        <w:ind w:left="0" w:firstLine="420"/>
       </w:pPr>
       <w:r>
         <w:rPr>
@@ -955,12 +963,8 @@
     <w:p>
       <w:pPr>
         <w:pStyle w:val="Compact"/>
-        <w:numPr>
-          <w:ilvl w:val="0"/>
-          <w:numId w:val="1001"/>
-        </w:numPr>
-        <w:spacing w:before="20" w:after="40" w:line="288" w:lineRule="auto"/>
-        <w:ind w:firstLine="0"/>
+        <w:spacing w:before="40" w:after="80" w:line="312" w:lineRule="auto"/>
+        <w:ind w:left="280" w:firstLine="0"/>
       </w:pPr>
       <w:r>
         <w:rPr>
@@ -987,12 +991,8 @@
     <w:p>
       <w:pPr>
         <w:pStyle w:val="Compact"/>
-        <w:numPr>
-          <w:ilvl w:val="0"/>
-          <w:numId w:val="1001"/>
-        </w:numPr>
-        <w:spacing w:before="20" w:after="40" w:line="288" w:lineRule="auto"/>
-        <w:ind w:firstLine="0"/>
+        <w:spacing w:before="40" w:after="80" w:line="312" w:lineRule="auto"/>
+        <w:ind w:left="280" w:firstLine="0"/>
       </w:pPr>
       <w:r>
         <w:rPr>
@@ -1019,12 +1019,8 @@
     <w:p>
       <w:pPr>
         <w:pStyle w:val="Compact"/>
-        <w:numPr>
-          <w:ilvl w:val="0"/>
-          <w:numId w:val="1001"/>
-        </w:numPr>
-        <w:spacing w:before="20" w:after="40" w:line="288" w:lineRule="auto"/>
-        <w:ind w:firstLine="0"/>
+        <w:spacing w:before="40" w:after="80" w:line="312" w:lineRule="auto"/>
+        <w:ind w:left="280" w:firstLine="0"/>
       </w:pPr>
       <w:r>
         <w:rPr>
@@ -1051,12 +1047,8 @@
     <w:p>
       <w:pPr>
         <w:pStyle w:val="Compact"/>
-        <w:numPr>
-          <w:ilvl w:val="0"/>
-          <w:numId w:val="1001"/>
-        </w:numPr>
-        <w:spacing w:before="20" w:after="40" w:line="288" w:lineRule="auto"/>
-        <w:ind w:firstLine="0"/>
+        <w:spacing w:before="40" w:after="80" w:line="312" w:lineRule="auto"/>
+        <w:ind w:left="280" w:firstLine="0"/>
       </w:pPr>
       <w:r>
         <w:rPr>
@@ -1085,7 +1077,7 @@
     <w:p>
       <w:pPr>
         <w:pStyle w:val="3"/>
-        <w:spacing w:before="240" w:after="80" w:line="288" w:lineRule="auto"/>
+        <w:spacing w:before="320" w:after="120" w:line="300" w:lineRule="auto"/>
         <w:ind w:firstLine="0"/>
         <w:jc w:val="left"/>
       </w:pPr>
@@ -1094,7 +1086,7 @@
           <w:rFonts w:ascii="黑体" w:hAnsi="黑体" w:eastAsia="黑体"/>
           <w:b/>
           <w:color w:val="1F3A60"/>
-          <w:sz w:val="24"/>
+          <w:sz w:val="25"/>
         </w:rPr>
         <w:t xml:space="preserve">⭐⭐⭐ </w:t>
       </w:r>
@@ -1103,7 +1095,7 @@
           <w:rFonts w:hint="eastAsia" w:ascii="黑体" w:hAnsi="黑体" w:eastAsia="黑体"/>
           <w:b/>
           <w:color w:val="1F3A60"/>
-          <w:sz w:val="24"/>
+          <w:sz w:val="25"/>
         </w:rPr>
         <w:t xml:space="preserve">第三关：上机实操</w:t>
       </w:r>
@@ -1112,7 +1104,7 @@
           <w:rFonts w:ascii="黑体" w:hAnsi="黑体" w:eastAsia="黑体"/>
           <w:b/>
           <w:color w:val="1F3A60"/>
-          <w:sz w:val="24"/>
+          <w:sz w:val="25"/>
         </w:rPr>
         <w:t xml:space="preserve"> · </w:t>
       </w:r>
@@ -1121,7 +1113,7 @@
           <w:rFonts w:hint="eastAsia" w:ascii="黑体" w:hAnsi="黑体" w:eastAsia="黑体"/>
           <w:b/>
           <w:color w:val="1F3A60"/>
-          <w:sz w:val="24"/>
+          <w:sz w:val="25"/>
         </w:rPr>
         <w:t xml:space="preserve">鼠标键盘大练兵</w:t>
       </w:r>
@@ -1129,8 +1121,8 @@
     <w:p>
       <w:pPr>
         <w:pStyle w:val="FirstParagraph"/>
-        <w:spacing w:before="20" w:after="40" w:line="288" w:lineRule="auto"/>
-        <w:ind w:firstLine="0"/>
+        <w:spacing w:before="60" w:after="120" w:line="331" w:lineRule="auto"/>
+        <w:ind w:left="0" w:firstLine="420"/>
       </w:pPr>
       <w:r>
         <w:rPr>
@@ -1143,12 +1135,8 @@
     <w:p>
       <w:pPr>
         <w:pStyle w:val="Compact"/>
-        <w:numPr>
-          <w:ilvl w:val="0"/>
-          <w:numId w:val="1002"/>
-        </w:numPr>
-        <w:spacing w:before="20" w:after="40" w:line="288" w:lineRule="auto"/>
-        <w:ind w:firstLine="0"/>
+        <w:spacing w:before="40" w:after="80" w:line="312" w:lineRule="auto"/>
+        <w:ind w:left="280" w:firstLine="0"/>
       </w:pPr>
       <w:r>
         <w:rPr>
@@ -1170,12 +1158,8 @@
     <w:p>
       <w:pPr>
         <w:pStyle w:val="Compact"/>
-        <w:numPr>
-          <w:ilvl w:val="0"/>
-          <w:numId w:val="1003"/>
-        </w:numPr>
-        <w:spacing w:before="20" w:after="40" w:line="288" w:lineRule="auto"/>
-        <w:ind w:firstLine="0"/>
+        <w:spacing w:before="40" w:after="80" w:line="312" w:lineRule="auto"/>
+        <w:ind w:left="280" w:firstLine="0"/>
       </w:pPr>
       <w:r>
         <w:rPr>
@@ -1213,12 +1197,8 @@
     <w:p>
       <w:pPr>
         <w:pStyle w:val="Compact"/>
-        <w:numPr>
-          <w:ilvl w:val="0"/>
-          <w:numId w:val="1004"/>
-        </w:numPr>
-        <w:spacing w:before="20" w:after="40" w:line="288" w:lineRule="auto"/>
-        <w:ind w:firstLine="0"/>
+        <w:spacing w:before="40" w:after="80" w:line="312" w:lineRule="auto"/>
+        <w:ind w:left="280" w:firstLine="0"/>
       </w:pPr>
       <w:r>
         <w:rPr>
@@ -1250,7 +1230,7 @@
     <w:p>
       <w:pPr>
         <w:pStyle w:val="3"/>
-        <w:spacing w:before="240" w:after="80" w:line="288" w:lineRule="auto"/>
+        <w:spacing w:before="320" w:after="120" w:line="300" w:lineRule="auto"/>
         <w:ind w:firstLine="0"/>
         <w:jc w:val="left"/>
       </w:pPr>
@@ -1259,7 +1239,7 @@
           <w:rFonts w:ascii="黑体" w:hAnsi="黑体" w:eastAsia="黑体"/>
           <w:b/>
           <w:color w:val="1F3A60"/>
-          <w:sz w:val="24"/>
+          <w:sz w:val="25"/>
         </w:rPr>
         <w:t xml:space="preserve">🏆 </w:t>
       </w:r>
@@ -1268,7 +1248,7 @@
           <w:rFonts w:hint="eastAsia" w:ascii="黑体" w:hAnsi="黑体" w:eastAsia="黑体"/>
           <w:b/>
           <w:color w:val="1F3A60"/>
-          <w:sz w:val="24"/>
+          <w:sz w:val="25"/>
         </w:rPr>
         <w:t xml:space="preserve">机房好习惯与自评打卡</w:t>
       </w:r>
@@ -1276,20 +1256,20 @@
     <w:p>
       <w:pPr>
         <w:pStyle w:val="Compact"/>
-        <w:spacing w:before="20" w:after="30" w:line="283" w:lineRule="auto"/>
-        <w:ind w:firstLine="0" w:left="240"/>
+        <w:spacing w:before="40" w:after="80" w:line="312" w:lineRule="auto"/>
+        <w:ind w:left="280" w:firstLine="0"/>
       </w:pPr>
       <w:r>
         <w:rPr>
           <w:rFonts w:ascii="宋体" w:hAnsi="宋体" w:eastAsia="宋体"/>
-          <w:sz w:val="20"/>
+          <w:sz w:val="21"/>
         </w:rPr>
         <w:t>□</w:t>
       </w:r>
       <w:r>
         <w:rPr>
           <w:rFonts w:ascii="宋体" w:hAnsi="宋体" w:eastAsia="宋体"/>
-          <w:sz w:val="20"/>
+          <w:sz w:val="21"/>
         </w:rPr>
         <w:t xml:space="preserve"> </w:t>
       </w:r>
@@ -1298,14 +1278,14 @@
           <w:rFonts w:hint="eastAsia" w:ascii="宋体" w:hAnsi="宋体" w:eastAsia="宋体"/>
           <w:b/>
           <w:bCs/>
-          <w:sz w:val="20"/>
+          <w:sz w:val="21"/>
         </w:rPr>
         <w:t xml:space="preserve">文明关机</w:t>
       </w:r>
       <w:r>
         <w:rPr>
           <w:rFonts w:hint="eastAsia" w:ascii="宋体" w:hAnsi="宋体" w:eastAsia="宋体"/>
-          <w:sz w:val="20"/>
+          <w:sz w:val="21"/>
         </w:rPr>
         <w:t xml:space="preserve">：下课点击【开始】➔【关机】，不直接拔电源。</w:t>
       </w:r>
@@ -1313,20 +1293,20 @@
     <w:p>
       <w:pPr>
         <w:pStyle w:val="Compact"/>
-        <w:spacing w:before="20" w:after="30" w:line="283" w:lineRule="auto"/>
-        <w:ind w:firstLine="0" w:left="240"/>
+        <w:spacing w:before="40" w:after="80" w:line="312" w:lineRule="auto"/>
+        <w:ind w:left="280" w:firstLine="0"/>
       </w:pPr>
       <w:r>
         <w:rPr>
           <w:rFonts w:ascii="宋体" w:hAnsi="宋体" w:eastAsia="宋体"/>
-          <w:sz w:val="20"/>
+          <w:sz w:val="21"/>
         </w:rPr>
         <w:t>□</w:t>
       </w:r>
       <w:r>
         <w:rPr>
           <w:rFonts w:ascii="宋体" w:hAnsi="宋体" w:eastAsia="宋体"/>
-          <w:sz w:val="20"/>
+          <w:sz w:val="21"/>
         </w:rPr>
         <w:t xml:space="preserve"> </w:t>
       </w:r>
@@ -1335,14 +1315,14 @@
           <w:rFonts w:hint="eastAsia" w:ascii="宋体" w:hAnsi="宋体" w:eastAsia="宋体"/>
           <w:b/>
           <w:bCs/>
-          <w:sz w:val="20"/>
+          <w:sz w:val="21"/>
         </w:rPr>
         <w:t xml:space="preserve">工位归位</w:t>
       </w:r>
       <w:r>
         <w:rPr>
           <w:rFonts w:hint="eastAsia" w:ascii="宋体" w:hAnsi="宋体" w:eastAsia="宋体"/>
-          <w:sz w:val="20"/>
+          <w:sz w:val="21"/>
         </w:rPr>
         <w:t xml:space="preserve">：键盘推入键盘槽，鼠标摆正，椅子推入课桌。</w:t>
       </w:r>
@@ -1350,64 +1330,64 @@
     <w:p>
       <w:pPr>
         <w:pStyle w:val="Compact"/>
-        <w:spacing w:before="80" w:after="80" w:line="288" w:lineRule="auto"/>
-        <w:ind w:firstLine="0" w:left="0"/>
+        <w:spacing w:before="160" w:after="120" w:line="312" w:lineRule="auto"/>
+        <w:ind w:left="0" w:firstLine="0"/>
       </w:pPr>
       <w:r>
         <w:rPr>
           <w:rFonts w:hint="eastAsia" w:ascii="宋体" w:hAnsi="宋体" w:eastAsia="宋体"/>
           <w:b/>
           <w:bCs/>
-          <w:sz w:val="20"/>
+          <w:sz w:val="21"/>
         </w:rPr>
         <w:t xml:space="preserve">今日我的自评</w:t>
       </w:r>
       <w:r>
         <w:rPr>
           <w:rFonts w:hint="eastAsia" w:ascii="宋体" w:hAnsi="宋体" w:eastAsia="宋体"/>
-          <w:sz w:val="20"/>
+          <w:sz w:val="21"/>
         </w:rPr>
         <w:t>：□</w:t>
       </w:r>
       <w:r>
         <w:rPr>
           <w:rFonts w:ascii="宋体" w:hAnsi="宋体" w:eastAsia="宋体"/>
-          <w:sz w:val="20"/>
+          <w:sz w:val="21"/>
         </w:rPr>
         <w:t xml:space="preserve"> ⭐ </w:t>
       </w:r>
       <w:r>
         <w:rPr>
           <w:rFonts w:hint="eastAsia" w:ascii="宋体" w:hAnsi="宋体" w:eastAsia="宋体"/>
-          <w:sz w:val="20"/>
+          <w:sz w:val="21"/>
         </w:rPr>
         <w:t xml:space="preserve">基础通关</w:t>
       </w:r>
       <w:r>
         <w:rPr>
           <w:rFonts w:ascii="宋体" w:hAnsi="宋体" w:eastAsia="宋体"/>
-          <w:sz w:val="20"/>
+          <w:sz w:val="21"/>
         </w:rPr>
         <w:t xml:space="preserve">    □ ⭐⭐ </w:t>
       </w:r>
       <w:r>
         <w:rPr>
           <w:rFonts w:hint="eastAsia" w:ascii="宋体" w:hAnsi="宋体" w:eastAsia="宋体"/>
-          <w:sz w:val="20"/>
+          <w:sz w:val="21"/>
         </w:rPr>
         <w:t xml:space="preserve">熟练标兵</w:t>
       </w:r>
       <w:r>
         <w:rPr>
           <w:rFonts w:ascii="宋体" w:hAnsi="宋体" w:eastAsia="宋体"/>
-          <w:sz w:val="20"/>
+          <w:sz w:val="21"/>
         </w:rPr>
         <w:t xml:space="preserve">    □ ⭐⭐⭐ </w:t>
       </w:r>
       <w:r>
         <w:rPr>
           <w:rFonts w:hint="eastAsia" w:ascii="宋体" w:hAnsi="宋体" w:eastAsia="宋体"/>
-          <w:sz w:val="20"/>
+          <w:sz w:val="21"/>
         </w:rPr>
         <w:t xml:space="preserve">探索小达人</w:t>
       </w:r>
@@ -1419,7 +1399,7 @@
         <w:numRestart w:val="eachSect"/>
       </w:footnotePr>
       <w:pgSz w:h="16834" w:w="11909"/>
-      <w:pgMar w:bottom="850" w:footer="720" w:gutter="0" w:header="720" w:left="1022" w:right="1022" w:top="850"/>
+      <w:pgMar w:bottom="1138" w:footer="720" w:gutter="0" w:header="720" w:left="1138" w:right="1138" w:top="1138"/>
       <w:cols w:space="720"/>
     </w:sectPr>
   </w:body>

</xml_diff>

<commit_message>
fix(worksheet): remove seat number, prevent 1-line overflow, and refine guidelines to single-page first
</commit_message>
<xml_diff>
--- a/examples/三年级上/第03课_了解信息处理工具/03_了解信息处理工具_导学案.docx
+++ b/examples/三年级上/第03课_了解信息处理工具/03_了解信息处理工具_导学案.docx
@@ -1,285 +1,236 @@
 
 <file path=word/document.xml><?xml version="1.0" encoding="utf-8"?>
-<w:document xmlns:w="http://schemas.openxmlformats.org/wordprocessingml/2006/main" xmlns:m="http://schemas.openxmlformats.org/officeDocument/2006/math" xmlns:r="http://schemas.openxmlformats.org/officeDocument/2006/relationships" xmlns:o="urn:schemas-microsoft-com:office:office" xmlns:v="urn:schemas-microsoft-com:vml" xmlns:w10="urn:schemas-microsoft-com:office:word" xmlns:a="http://schemas.openxmlformats.org/drawingml/2006/main" xmlns:pic="http://schemas.openxmlformats.org/drawingml/2006/picture" xmlns:wp="http://schemas.openxmlformats.org/drawingml/2006/wordprocessingDrawing">
+<w:document xmlns:wpc="http://schemas.microsoft.com/office/word/2010/wordprocessingCanvas" xmlns:cx="http://schemas.microsoft.com/office/drawing/2014/chartex" xmlns:cx1="http://schemas.microsoft.com/office/drawing/2015/9/8/chartex" xmlns:cx2="http://schemas.microsoft.com/office/drawing/2015/10/21/chartex" xmlns:cx3="http://schemas.microsoft.com/office/drawing/2016/5/9/chartex" xmlns:cx4="http://schemas.microsoft.com/office/drawing/2016/5/10/chartex" xmlns:cx5="http://schemas.microsoft.com/office/drawing/2016/5/11/chartex" xmlns:cx6="http://schemas.microsoft.com/office/drawing/2016/5/12/chartex" xmlns:cx7="http://schemas.microsoft.com/office/drawing/2016/5/13/chartex" xmlns:cx8="http://schemas.microsoft.com/office/drawing/2016/5/14/chartex" xmlns:mc="http://schemas.openxmlformats.org/markup-compatibility/2006" xmlns:aink="http://schemas.microsoft.com/office/drawing/2016/ink" xmlns:am3d="http://schemas.microsoft.com/office/drawing/2017/model3d" xmlns:o="urn:schemas-microsoft-com:office:office" xmlns:oel="http://schemas.microsoft.com/office/2019/extlst" xmlns:r="http://schemas.openxmlformats.org/officeDocument/2006/relationships" xmlns:m="http://schemas.openxmlformats.org/officeDocument/2006/math" xmlns:v="urn:schemas-microsoft-com:vml" xmlns:wp14="http://schemas.microsoft.com/office/word/2010/wordprocessingDrawing" xmlns:wp="http://schemas.openxmlformats.org/drawingml/2006/wordprocessingDrawing" xmlns:w10="urn:schemas-microsoft-com:office:word" xmlns:w="http://schemas.openxmlformats.org/wordprocessingml/2006/main" xmlns:w14="http://schemas.microsoft.com/office/word/2010/wordml" xmlns:w15="http://schemas.microsoft.com/office/word/2012/wordml" xmlns:w16cex="http://schemas.microsoft.com/office/word/2018/wordml/cex" xmlns:w16cid="http://schemas.microsoft.com/office/word/2016/wordml/cid" xmlns:w16="http://schemas.microsoft.com/office/word/2018/wordml" xmlns:w16du="http://schemas.microsoft.com/office/word/2023/wordml/word16du" xmlns:w16sdtdh="http://schemas.microsoft.com/office/word/2020/wordml/sdtdatahash" xmlns:w16sdtfl="http://schemas.microsoft.com/office/word/2024/wordml/sdtformatlock" xmlns:w16se="http://schemas.microsoft.com/office/word/2015/wordml/symex" xmlns:wpg="http://schemas.microsoft.com/office/word/2010/wordprocessingGroup" xmlns:wpi="http://schemas.microsoft.com/office/word/2010/wordprocessingInk" xmlns:wne="http://schemas.microsoft.com/office/word/2006/wordml" xmlns:wps="http://schemas.microsoft.com/office/word/2010/wordprocessingShape" mc:Ignorable="w14 w15 w16se w16cid w16 w16cex w16sdtdh w16sdtfl w16du wp14">
   <w:body>
-    <w:bookmarkStart w:id="13" w:name="_1b31f60afe0b9fd5711987b58f2a449fe2c220d"/>
     <w:p>
       <w:pPr>
         <w:pStyle w:val="1"/>
-        <w:spacing w:before="120" w:after="280" w:line="312" w:lineRule="auto"/>
-        <w:ind w:firstLine="0"/>
-        <w:jc w:val="center"/>
-      </w:pPr>
-      <w:r>
-        <w:rPr>
-          <w:rFonts w:hint="eastAsia" w:ascii="黑体" w:hAnsi="黑体" w:eastAsia="黑体"/>
+        <w:spacing w:before="0" w:after="120" w:line="288" w:lineRule="auto"/>
+      </w:pPr>
+      <w:bookmarkStart w:id="0" w:name="_1b31f60afe0b9fd5711987b58f2a449fe2c220d"/>
+      <w:r>
+        <w:rPr>
+          <w:rFonts w:ascii="黑体" w:eastAsia="黑体" w:hAnsi="黑体" w:hint="eastAsia"/>
           <w:b/>
           <w:color w:val="1F2A44"/>
-          <w:sz w:val="34"/>
-        </w:rPr>
-        <w:t xml:space="preserve">第3课</w:t>
-      </w:r>
-      <w:r>
-        <w:rPr>
-          <w:rFonts w:ascii="黑体" w:hAnsi="黑体" w:eastAsia="黑体"/>
+        </w:rPr>
+        <w:t>第3课</w:t>
+      </w:r>
+      <w:r>
+        <w:rPr>
+          <w:rFonts w:ascii="黑体" w:eastAsia="黑体" w:hAnsi="黑体"/>
           <w:b/>
           <w:color w:val="1F2A44"/>
-          <w:sz w:val="34"/>
         </w:rPr>
         <w:t xml:space="preserve"> </w:t>
       </w:r>
       <w:r>
         <w:rPr>
-          <w:rFonts w:hint="eastAsia" w:ascii="黑体" w:hAnsi="黑体" w:eastAsia="黑体"/>
+          <w:rFonts w:ascii="黑体" w:eastAsia="黑体" w:hAnsi="黑体" w:hint="eastAsia"/>
           <w:b/>
           <w:color w:val="1F2A44"/>
-          <w:sz w:val="34"/>
-        </w:rPr>
-        <w:t xml:space="preserve">了解信息处理工具</w:t>
-      </w:r>
-      <w:r>
-        <w:rPr>
-          <w:rFonts w:ascii="黑体" w:hAnsi="黑体" w:eastAsia="黑体"/>
+        </w:rPr>
+        <w:t>了解信息处理工具</w:t>
+      </w:r>
+      <w:r>
+        <w:rPr>
+          <w:rFonts w:ascii="黑体" w:eastAsia="黑体" w:hAnsi="黑体"/>
           <w:b/>
           <w:color w:val="1F2A44"/>
-          <w:sz w:val="34"/>
         </w:rPr>
         <w:t xml:space="preserve"> · </w:t>
       </w:r>
       <w:r>
         <w:rPr>
-          <w:rFonts w:hint="eastAsia" w:ascii="黑体" w:hAnsi="黑体" w:eastAsia="黑体"/>
+          <w:rFonts w:ascii="黑体" w:eastAsia="黑体" w:hAnsi="黑体" w:hint="eastAsia"/>
           <w:b/>
           <w:color w:val="1F2A44"/>
-          <w:sz w:val="34"/>
-        </w:rPr>
-        <w:t xml:space="preserve">课堂导学单</w:t>
+        </w:rPr>
+        <w:t>课堂导学单</w:t>
       </w:r>
     </w:p>
     <w:p>
       <w:pPr>
         <w:pStyle w:val="FirstParagraph"/>
-        <w:spacing w:before="80" w:after="320" w:line="312" w:lineRule="auto"/>
-        <w:ind w:firstLine="0"/>
+        <w:spacing w:before="20" w:after="160"/>
         <w:jc w:val="center"/>
       </w:pPr>
       <w:r>
         <w:rPr>
-          <w:rFonts w:hint="eastAsia" w:ascii="楷体" w:hAnsi="楷体" w:eastAsia="楷体"/>
-          <w:b w:val="0"/>
+          <w:rFonts w:ascii="楷体" w:eastAsia="楷体" w:hAnsi="楷体" w:hint="eastAsia"/>
           <w:bCs/>
           <w:color w:val="333333"/>
-          <w:sz w:val="21"/>
-        </w:rPr>
-        <w:t xml:space="preserve">班级</w:t>
-      </w:r>
-      <w:r>
-        <w:rPr>
-          <w:rFonts w:hint="eastAsia" w:ascii="楷体" w:hAnsi="楷体" w:eastAsia="楷体"/>
-          <w:b w:val="0"/>
+          <w:sz w:val="20"/>
+        </w:rPr>
+        <w:t>班级</w:t>
+      </w:r>
+      <w:r>
+        <w:rPr>
+          <w:rFonts w:ascii="楷体" w:eastAsia="楷体" w:hAnsi="楷体" w:hint="eastAsia"/>
           <w:color w:val="333333"/>
-          <w:sz w:val="21"/>
-        </w:rPr>
-        <w:t xml:space="preserve">：__________</w:t>
-      </w:r>
-      <w:r>
-        <w:rPr>
-          <w:rFonts w:ascii="楷体" w:hAnsi="楷体" w:eastAsia="楷体"/>
-          <w:b w:val="0"/>
+          <w:sz w:val="20"/>
+        </w:rPr>
+        <w:t>：__________</w:t>
+      </w:r>
+      <w:r>
+        <w:rPr>
+          <w:rFonts w:ascii="楷体" w:eastAsia="楷体" w:hAnsi="楷体"/>
           <w:color w:val="333333"/>
-          <w:sz w:val="21"/>
-        </w:rPr>
-        <w:t xml:space="preserve">         </w:t>
-      </w:r>
-      <w:r>
-        <w:rPr>
-          <w:rFonts w:ascii="楷体" w:hAnsi="楷体" w:eastAsia="楷体"/>
-          <w:b w:val="0"/>
-          <w:color w:val="333333"/>
-          <w:sz w:val="21"/>
-        </w:rPr>
-        <w:t xml:space="preserve"> </w:t>
-      </w:r>
-      <w:r>
-        <w:rPr>
-          <w:rFonts w:hint="eastAsia" w:ascii="楷体" w:hAnsi="楷体" w:eastAsia="楷体"/>
-          <w:b w:val="0"/>
+          <w:sz w:val="20"/>
+        </w:rPr>
+        <w:t xml:space="preserve">          </w:t>
+      </w:r>
+      <w:r>
+        <w:rPr>
+          <w:rFonts w:ascii="楷体" w:eastAsia="楷体" w:hAnsi="楷体" w:hint="eastAsia"/>
           <w:bCs/>
           <w:color w:val="333333"/>
-          <w:sz w:val="21"/>
-        </w:rPr>
-        <w:t xml:space="preserve">姓名</w:t>
-      </w:r>
-      <w:r>
-        <w:rPr>
-          <w:rFonts w:hint="eastAsia" w:ascii="楷体" w:hAnsi="楷体" w:eastAsia="楷体"/>
-          <w:b w:val="0"/>
+          <w:sz w:val="20"/>
+        </w:rPr>
+        <w:t>姓名</w:t>
+      </w:r>
+      <w:r>
+        <w:rPr>
+          <w:rFonts w:ascii="楷体" w:eastAsia="楷体" w:hAnsi="楷体" w:hint="eastAsia"/>
           <w:color w:val="333333"/>
-          <w:sz w:val="21"/>
-        </w:rPr>
-        <w:t xml:space="preserve">：__________</w:t>
-      </w:r>
-      <w:r>
-        <w:rPr>
-          <w:rFonts w:ascii="楷体" w:hAnsi="楷体" w:eastAsia="楷体"/>
-          <w:b w:val="0"/>
+          <w:sz w:val="20"/>
+        </w:rPr>
+        <w:t>：__________</w:t>
+      </w:r>
+      <w:r>
+        <w:rPr>
+          <w:rFonts w:ascii="楷体" w:eastAsia="楷体" w:hAnsi="楷体"/>
           <w:color w:val="333333"/>
-          <w:sz w:val="21"/>
-        </w:rPr>
-        <w:t xml:space="preserve">         </w:t>
-      </w:r>
-      <w:r>
-        <w:rPr>
-          <w:rFonts w:ascii="楷体" w:hAnsi="楷体" w:eastAsia="楷体"/>
-          <w:b w:val="0"/>
-          <w:color w:val="333333"/>
-          <w:sz w:val="21"/>
-        </w:rPr>
-        <w:t xml:space="preserve"> </w:t>
-      </w:r>
-      <w:r>
-        <w:rPr>
-          <w:rFonts w:hint="eastAsia" w:ascii="楷体" w:hAnsi="楷体" w:eastAsia="楷体"/>
-          <w:b w:val="0"/>
+          <w:sz w:val="20"/>
+        </w:rPr>
+        <w:t xml:space="preserve">          </w:t>
+      </w:r>
+      <w:r>
+        <w:rPr>
+          <w:rFonts w:ascii="楷体" w:eastAsia="楷体" w:hAnsi="楷体" w:hint="eastAsia"/>
           <w:bCs/>
           <w:color w:val="333333"/>
-          <w:sz w:val="21"/>
-        </w:rPr>
-        <w:t xml:space="preserve">评价</w:t>
-      </w:r>
-      <w:r>
-        <w:rPr>
-          <w:rFonts w:hint="eastAsia" w:ascii="楷体" w:hAnsi="楷体" w:eastAsia="楷体"/>
-          <w:b w:val="0"/>
+          <w:sz w:val="20"/>
+        </w:rPr>
+        <w:t>评价</w:t>
+      </w:r>
+      <w:r>
+        <w:rPr>
+          <w:rFonts w:ascii="楷体" w:eastAsia="楷体" w:hAnsi="楷体" w:hint="eastAsia"/>
           <w:color w:val="333333"/>
-          <w:sz w:val="21"/>
-        </w:rPr>
-        <w:t xml:space="preserve">：⭐⭐⭐</w:t>
+          <w:sz w:val="20"/>
+        </w:rPr>
+        <w:t>：⭐⭐⭐</w:t>
       </w:r>
     </w:p>
     <w:p>
       <w:pPr>
         <w:pStyle w:val="aa"/>
-        <w:spacing w:before="120" w:after="320" w:line="324" w:lineRule="auto"/>
-        <w:ind w:left="160" w:firstLine="0"/>
-        <w:jc w:val="left"/>
-      </w:pPr>
-      <w:r>
-        <w:rPr>
-          <w:rFonts w:ascii="楷体" w:hAnsi="楷体" w:eastAsia="楷体"/>
+        <w:spacing w:before="40" w:after="160" w:line="288" w:lineRule="auto"/>
+        <w:ind w:left="120"/>
+      </w:pPr>
+      <w:r>
+        <w:rPr>
+          <w:rFonts w:ascii="楷体" w:eastAsia="楷体" w:hAnsi="楷体"/>
           <w:color w:val="2E405E"/>
-          <w:sz w:val="21"/>
-        </w:rPr>
-        <w:t xml:space="preserve">🎯</w:t>
-      </w:r>
-      <w:r>
-        <w:rPr>
-          <w:rFonts w:ascii="楷体" w:hAnsi="楷体" w:eastAsia="楷体"/>
-          <w:color w:val="2E405E"/>
-          <w:sz w:val="21"/>
-        </w:rPr>
-        <w:t xml:space="preserve"> </w:t>
-      </w:r>
-      <w:r>
-        <w:rPr>
-          <w:rFonts w:hint="eastAsia" w:ascii="楷体" w:hAnsi="楷体" w:eastAsia="楷体"/>
+          <w:sz w:val="19"/>
+        </w:rPr>
+        <w:t xml:space="preserve">🎯 </w:t>
+      </w:r>
+      <w:r>
+        <w:rPr>
+          <w:rFonts w:ascii="楷体" w:eastAsia="楷体" w:hAnsi="楷体" w:hint="eastAsia"/>
           <w:b/>
           <w:bCs/>
           <w:color w:val="2E405E"/>
-          <w:sz w:val="21"/>
-        </w:rPr>
-        <w:t xml:space="preserve">通关目标</w:t>
-      </w:r>
-      <w:r>
-        <w:rPr>
-          <w:rFonts w:hint="eastAsia" w:ascii="楷体" w:hAnsi="楷体" w:eastAsia="楷体"/>
+          <w:sz w:val="19"/>
+        </w:rPr>
+        <w:t>通关目标</w:t>
+      </w:r>
+      <w:r>
+        <w:rPr>
+          <w:rFonts w:ascii="楷体" w:eastAsia="楷体" w:hAnsi="楷体" w:hint="eastAsia"/>
           <w:color w:val="2E405E"/>
-          <w:sz w:val="21"/>
-        </w:rPr>
-        <w:t xml:space="preserve">：认识身边常见信息工具，解密电脑主机，规范操作鼠标键盘！</w:t>
+          <w:sz w:val="19"/>
+        </w:rPr>
+        <w:t>：认识身边常见信息工具，解密电脑主机，规范操作鼠标键盘！</w:t>
       </w:r>
     </w:p>
-    <w:bookmarkStart w:id="9" w:name="_4dfdc38e0556b403711deb74b33ae7c6b1f9b0f"/>
     <w:p>
       <w:pPr>
         <w:pStyle w:val="3"/>
-        <w:spacing w:before="320" w:after="120" w:line="300" w:lineRule="auto"/>
-        <w:ind w:firstLine="0"/>
+        <w:spacing w:before="180" w:after="60" w:line="288" w:lineRule="auto"/>
         <w:jc w:val="left"/>
       </w:pPr>
-      <w:r>
-        <w:rPr>
-          <w:rFonts w:ascii="黑体" w:hAnsi="黑体" w:eastAsia="黑体"/>
+      <w:bookmarkStart w:id="1" w:name="_4dfdc38e0556b403711deb74b33ae7c6b1f9b0f"/>
+      <w:r>
+        <w:rPr>
+          <w:rFonts w:ascii="黑体" w:eastAsia="黑体" w:hAnsi="黑体"/>
           <w:b/>
           <w:color w:val="1F3A60"/>
-          <w:sz w:val="25"/>
+          <w:sz w:val="23"/>
         </w:rPr>
         <w:t xml:space="preserve">⭐ </w:t>
       </w:r>
       <w:r>
         <w:rPr>
-          <w:rFonts w:hint="eastAsia" w:ascii="黑体" w:hAnsi="黑体" w:eastAsia="黑体"/>
+          <w:rFonts w:ascii="黑体" w:eastAsia="黑体" w:hAnsi="黑体" w:hint="eastAsia"/>
           <w:b/>
           <w:color w:val="1F3A60"/>
-          <w:sz w:val="25"/>
-        </w:rPr>
-        <w:t xml:space="preserve">第一关：火眼金睛</w:t>
-      </w:r>
-      <w:r>
-        <w:rPr>
-          <w:rFonts w:ascii="黑体" w:hAnsi="黑体" w:eastAsia="黑体"/>
+          <w:sz w:val="23"/>
+        </w:rPr>
+        <w:t>第一关：火眼金睛</w:t>
+      </w:r>
+      <w:r>
+        <w:rPr>
+          <w:rFonts w:ascii="黑体" w:eastAsia="黑体" w:hAnsi="黑体"/>
           <w:b/>
           <w:color w:val="1F3A60"/>
-          <w:sz w:val="25"/>
+          <w:sz w:val="23"/>
         </w:rPr>
         <w:t xml:space="preserve"> · </w:t>
       </w:r>
       <w:r>
         <w:rPr>
-          <w:rFonts w:hint="eastAsia" w:ascii="黑体" w:hAnsi="黑体" w:eastAsia="黑体"/>
+          <w:rFonts w:ascii="黑体" w:eastAsia="黑体" w:hAnsi="黑体" w:hint="eastAsia"/>
           <w:b/>
           <w:color w:val="1F3A60"/>
-          <w:sz w:val="25"/>
-        </w:rPr>
-        <w:t xml:space="preserve">工具本领连连看</w:t>
+          <w:sz w:val="23"/>
+        </w:rPr>
+        <w:t>工具本领连连看</w:t>
       </w:r>
     </w:p>
     <w:p>
       <w:pPr>
         <w:pStyle w:val="FirstParagraph"/>
-        <w:spacing w:before="60" w:after="120" w:line="331" w:lineRule="auto"/>
-        <w:ind w:left="0" w:firstLine="420"/>
-      </w:pPr>
-      <w:r>
-        <w:rPr>
-          <w:rFonts w:hint="eastAsia" w:ascii="宋体" w:hAnsi="宋体" w:eastAsia="宋体"/>
-          <w:sz w:val="21"/>
-        </w:rPr>
-        <w:t xml:space="preserve">请将生活中的信息工具与它的</w:t>
-      </w:r>
-      <w:r>
-        <w:rPr>
-          <w:rFonts w:hint="eastAsia" w:ascii="宋体" w:hAnsi="宋体" w:eastAsia="宋体"/>
+        <w:spacing w:before="20" w:after="60" w:line="293" w:lineRule="auto"/>
+        <w:ind w:firstLine="420"/>
+      </w:pPr>
+      <w:r>
+        <w:rPr>
+          <w:rFonts w:ascii="宋体" w:hAnsi="宋体" w:hint="eastAsia"/>
+        </w:rPr>
+        <w:t>请将生活中的信息工具与它的</w:t>
+      </w:r>
+      <w:r>
+        <w:rPr>
+          <w:rFonts w:ascii="宋体" w:hAnsi="宋体" w:hint="eastAsia"/>
           <w:b/>
           <w:bCs/>
-          <w:sz w:val="21"/>
-        </w:rPr>
-        <w:t xml:space="preserve">超强本领</w:t>
-      </w:r>
-      <w:r>
-        <w:rPr>
-          <w:rFonts w:hint="eastAsia" w:ascii="宋体" w:hAnsi="宋体" w:eastAsia="宋体"/>
-          <w:sz w:val="21"/>
-        </w:rPr>
-        <w:t xml:space="preserve">连线（或在括号内填入序号）：</w:t>
+        </w:rPr>
+        <w:t>超强本领</w:t>
+      </w:r>
+      <w:r>
+        <w:rPr>
+          <w:rFonts w:ascii="宋体" w:hAnsi="宋体" w:hint="eastAsia"/>
+        </w:rPr>
+        <w:t>连线（或在括号内填入序号）：</w:t>
       </w:r>
     </w:p>
     <w:tbl>
       <w:tblPr>
         <w:tblStyle w:val="Table"/>
-        <w:tblW w:type="pct" w:w="5000"/>
-        <w:tblLayout w:type="fixed"/>
-        <w:tblLook w:firstRow="1" w:lastRow="0" w:firstColumn="0" w:lastColumn="0" w:noHBand="0" w:noVBand="0" w:val="0020"/>
+        <w:tblW w:w="5000" w:type="pct"/>
         <w:jc w:val="center"/>
         <w:tblBorders>
           <w:top w:val="single" w:sz="4" w:space="0" w:color="A0A0A0"/>
@@ -289,492 +240,495 @@
           <w:insideH w:val="single" w:sz="4" w:space="0" w:color="C0C0C0"/>
           <w:insideV w:val="single" w:sz="4" w:space="0" w:color="C0C0C0"/>
         </w:tblBorders>
+        <w:tblLayout w:type="fixed"/>
         <w:tblCellMar>
-          <w:top w:w="130" w:type="dxa"/>
-          <w:bottom w:w="130" w:type="dxa"/>
-          <w:left w:w="150" w:type="dxa"/>
-          <w:right w:w="150" w:type="dxa"/>
+          <w:top w:w="75" w:type="dxa"/>
+          <w:left w:w="120" w:type="dxa"/>
+          <w:bottom w:w="75" w:type="dxa"/>
+          <w:right w:w="120" w:type="dxa"/>
         </w:tblCellMar>
+        <w:tblLook w:val="0020" w:firstRow="1" w:lastRow="0" w:firstColumn="0" w:lastColumn="0" w:noHBand="0" w:noVBand="0"/>
       </w:tblPr>
       <w:tblGrid>
-        <w:gridCol w:w="1900"/>
-        <w:gridCol w:w="4329"/>
-        <w:gridCol w:w="1689"/>
+        <w:gridCol w:w="2392"/>
+        <w:gridCol w:w="5450"/>
+        <w:gridCol w:w="2127"/>
       </w:tblGrid>
       <w:tr>
         <w:trPr>
-          <w:tblHeader w:val="on"/>
+          <w:cnfStyle w:val="100000000000" w:firstRow="1" w:lastRow="0" w:firstColumn="0" w:lastColumn="0" w:oddVBand="0" w:evenVBand="0" w:oddHBand="0" w:evenHBand="0" w:firstRowFirstColumn="0" w:firstRowLastColumn="0" w:lastRowFirstColumn="0" w:lastRowLastColumn="0"/>
+          <w:tblHeader/>
+          <w:jc w:val="center"/>
         </w:trPr>
         <w:tc>
           <w:tcPr>
+            <w:tcW w:w="1900" w:type="dxa"/>
+            <w:shd w:val="clear" w:color="auto" w:fill="EDF2F7"/>
             <w:vAlign w:val="center"/>
-            <w:shd w:fill="EDF2F7"/>
-            <w:shd w:fill="EDF2F7"/>
           </w:tcPr>
           <w:p>
             <w:pPr>
               <w:pStyle w:val="Compact"/>
-              <w:spacing w:before="20" w:after="20" w:line="293" w:lineRule="auto"/>
-              <w:ind w:firstLine="0"/>
-              <w:jc w:val="left"/>
+              <w:spacing w:before="20" w:after="20"/>
             </w:pPr>
             <w:r>
               <w:rPr>
-                <w:rFonts w:hint="eastAsia" w:ascii="黑体" w:hAnsi="黑体" w:eastAsia="黑体"/>
+                <w:rFonts w:ascii="黑体" w:eastAsia="黑体" w:hAnsi="黑体" w:hint="eastAsia"/>
                 <w:b/>
-                <w:sz w:val="20"/>
+                <w:sz w:val="19"/>
               </w:rPr>
-              <w:t xml:space="preserve">常见信息工具</w:t>
+              <w:t>常见信息工具</w:t>
             </w:r>
           </w:p>
         </w:tc>
         <w:tc>
           <w:tcPr>
+            <w:tcW w:w="4329" w:type="dxa"/>
+            <w:shd w:val="clear" w:color="auto" w:fill="EDF2F7"/>
             <w:vAlign w:val="center"/>
-            <w:shd w:fill="EDF2F7"/>
-            <w:shd w:fill="EDF2F7"/>
           </w:tcPr>
           <w:p>
             <w:pPr>
               <w:pStyle w:val="Compact"/>
-              <w:spacing w:before="20" w:after="20" w:line="293" w:lineRule="auto"/>
-              <w:ind w:firstLine="0"/>
-              <w:jc w:val="left"/>
+              <w:spacing w:before="20" w:after="20"/>
             </w:pPr>
             <w:r>
               <w:rPr>
-                <w:rFonts w:hint="eastAsia" w:ascii="黑体" w:hAnsi="黑体" w:eastAsia="黑体"/>
+                <w:rFonts w:ascii="黑体" w:eastAsia="黑体" w:hAnsi="黑体" w:hint="eastAsia"/>
                 <w:b/>
-                <w:sz w:val="20"/>
+                <w:sz w:val="19"/>
               </w:rPr>
-              <w:t xml:space="preserve">主要本领与应用</w:t>
+              <w:t>主要本领与应用</w:t>
             </w:r>
           </w:p>
         </w:tc>
         <w:tc>
           <w:tcPr>
+            <w:tcW w:w="1689" w:type="dxa"/>
+            <w:shd w:val="clear" w:color="auto" w:fill="EDF2F7"/>
             <w:vAlign w:val="center"/>
-            <w:shd w:fill="EDF2F7"/>
-            <w:shd w:fill="EDF2F7"/>
           </w:tcPr>
           <w:p>
             <w:pPr>
               <w:pStyle w:val="Compact"/>
-              <w:spacing w:before="20" w:after="20" w:line="293" w:lineRule="auto"/>
-              <w:ind w:firstLine="0"/>
+              <w:spacing w:before="20" w:after="20"/>
               <w:jc w:val="center"/>
             </w:pPr>
             <w:r>
               <w:rPr>
-                <w:rFonts w:hint="eastAsia" w:ascii="黑体" w:hAnsi="黑体" w:eastAsia="黑体"/>
+                <w:rFonts w:ascii="黑体" w:eastAsia="黑体" w:hAnsi="黑体" w:hint="eastAsia"/>
                 <w:b/>
-                <w:sz w:val="20"/>
+                <w:sz w:val="19"/>
               </w:rPr>
-              <w:t xml:space="preserve">连线匹配</w:t>
+              <w:t>连线匹配</w:t>
             </w:r>
           </w:p>
         </w:tc>
       </w:tr>
       <w:tr>
+        <w:trPr>
+          <w:jc w:val="center"/>
+        </w:trPr>
         <w:tc>
           <w:tcPr>
+            <w:tcW w:w="1900" w:type="dxa"/>
             <w:vAlign w:val="center"/>
           </w:tcPr>
           <w:p>
             <w:pPr>
               <w:pStyle w:val="Compact"/>
-              <w:spacing w:before="20" w:after="20" w:line="293" w:lineRule="auto"/>
-              <w:ind w:firstLine="0"/>
-              <w:jc w:val="left"/>
+              <w:spacing w:before="20" w:after="20"/>
             </w:pPr>
             <w:r>
               <w:rPr>
-                <w:rFonts w:ascii="宋体" w:hAnsi="宋体" w:eastAsia="宋体"/>
+                <w:rFonts w:hAnsi="宋体"/>
                 <w:b/>
                 <w:bCs/>
-                <w:sz w:val="20"/>
+                <w:sz w:val="19"/>
               </w:rPr>
               <w:t xml:space="preserve">A. </w:t>
             </w:r>
             <w:r>
               <w:rPr>
-                <w:rFonts w:hint="eastAsia" w:ascii="宋体" w:hAnsi="宋体" w:eastAsia="宋体"/>
+                <w:rFonts w:hAnsi="宋体" w:hint="eastAsia"/>
                 <w:b/>
                 <w:bCs/>
-                <w:sz w:val="20"/>
+                <w:sz w:val="19"/>
               </w:rPr>
-              <w:t xml:space="preserve">测温枪</w:t>
+              <w:t>测温枪</w:t>
             </w:r>
           </w:p>
         </w:tc>
         <w:tc>
           <w:tcPr>
+            <w:tcW w:w="4329" w:type="dxa"/>
             <w:vAlign w:val="center"/>
           </w:tcPr>
           <w:p>
             <w:pPr>
               <w:pStyle w:val="Compact"/>
-              <w:spacing w:before="20" w:after="20" w:line="293" w:lineRule="auto"/>
-              <w:ind w:firstLine="0"/>
-              <w:jc w:val="left"/>
+              <w:spacing w:before="20" w:after="20"/>
             </w:pPr>
             <w:r>
               <w:rPr>
-                <w:rFonts w:ascii="宋体" w:hAnsi="宋体" w:eastAsia="宋体"/>
-                <w:sz w:val="20"/>
+                <w:rFonts w:hAnsi="宋体"/>
+                <w:sz w:val="19"/>
               </w:rPr>
               <w:t xml:space="preserve">① </w:t>
             </w:r>
             <w:r>
               <w:rPr>
-                <w:rFonts w:hint="eastAsia" w:ascii="宋体" w:hAnsi="宋体" w:eastAsia="宋体"/>
-                <w:sz w:val="20"/>
+                <w:rFonts w:hAnsi="宋体" w:hint="eastAsia"/>
+                <w:sz w:val="19"/>
               </w:rPr>
-              <w:t xml:space="preserve">液晶屏直显尺寸，精准测量零部件</w:t>
+              <w:t>液晶屏直显尺寸，精准测量零部件</w:t>
             </w:r>
           </w:p>
         </w:tc>
         <w:tc>
           <w:tcPr>
+            <w:tcW w:w="1689" w:type="dxa"/>
             <w:vAlign w:val="center"/>
           </w:tcPr>
           <w:p>
             <w:pPr>
               <w:pStyle w:val="Compact"/>
-              <w:spacing w:before="20" w:after="20" w:line="293" w:lineRule="auto"/>
-              <w:ind w:firstLine="0"/>
+              <w:spacing w:before="20" w:after="20"/>
               <w:jc w:val="center"/>
             </w:pPr>
             <w:r>
               <w:rPr>
-                <w:rFonts w:ascii="宋体" w:hAnsi="宋体" w:eastAsia="宋体"/>
-                <w:sz w:val="20"/>
+                <w:rFonts w:hAnsi="宋体"/>
+                <w:sz w:val="19"/>
               </w:rPr>
               <w:t xml:space="preserve">A ➔ </w:t>
             </w:r>
             <w:r>
               <w:rPr>
-                <w:rFonts w:hint="eastAsia" w:ascii="宋体" w:hAnsi="宋体" w:eastAsia="宋体"/>
-                <w:sz w:val="20"/>
+                <w:rFonts w:hAnsi="宋体" w:hint="eastAsia"/>
+                <w:sz w:val="19"/>
               </w:rPr>
-              <w:t xml:space="preserve">（</w:t>
+              <w:t>（</w:t>
             </w:r>
             <w:r>
               <w:rPr>
-                <w:rFonts w:ascii="宋体" w:hAnsi="宋体" w:eastAsia="宋体"/>
-                <w:sz w:val="20"/>
+                <w:rFonts w:hAnsi="宋体"/>
+                <w:sz w:val="19"/>
               </w:rPr>
               <w:t xml:space="preserve">   </w:t>
             </w:r>
             <w:r>
               <w:rPr>
-                <w:rFonts w:hint="eastAsia" w:ascii="宋体" w:hAnsi="宋体" w:eastAsia="宋体"/>
-                <w:sz w:val="20"/>
+                <w:rFonts w:hAnsi="宋体" w:hint="eastAsia"/>
+                <w:sz w:val="19"/>
               </w:rPr>
-              <w:t xml:space="preserve">）</w:t>
+              <w:t>）</w:t>
             </w:r>
           </w:p>
         </w:tc>
       </w:tr>
       <w:tr>
+        <w:trPr>
+          <w:jc w:val="center"/>
+        </w:trPr>
         <w:tc>
           <w:tcPr>
+            <w:tcW w:w="1900" w:type="dxa"/>
             <w:vAlign w:val="center"/>
           </w:tcPr>
           <w:p>
             <w:pPr>
               <w:pStyle w:val="Compact"/>
-              <w:spacing w:before="20" w:after="20" w:line="293" w:lineRule="auto"/>
-              <w:ind w:firstLine="0"/>
-              <w:jc w:val="left"/>
+              <w:spacing w:before="20" w:after="20"/>
             </w:pPr>
             <w:r>
               <w:rPr>
-                <w:rFonts w:ascii="宋体" w:hAnsi="宋体" w:eastAsia="宋体"/>
+                <w:rFonts w:hAnsi="宋体"/>
                 <w:b/>
                 <w:bCs/>
-                <w:sz w:val="20"/>
+                <w:sz w:val="19"/>
               </w:rPr>
               <w:t xml:space="preserve">B. </w:t>
             </w:r>
             <w:r>
               <w:rPr>
-                <w:rFonts w:hint="eastAsia" w:ascii="宋体" w:hAnsi="宋体" w:eastAsia="宋体"/>
+                <w:rFonts w:hAnsi="宋体" w:hint="eastAsia"/>
                 <w:b/>
                 <w:bCs/>
-                <w:sz w:val="20"/>
+                <w:sz w:val="19"/>
               </w:rPr>
-              <w:t xml:space="preserve">数显卡尺</w:t>
+              <w:t>数显卡尺</w:t>
             </w:r>
           </w:p>
         </w:tc>
         <w:tc>
           <w:tcPr>
+            <w:tcW w:w="4329" w:type="dxa"/>
             <w:vAlign w:val="center"/>
           </w:tcPr>
           <w:p>
             <w:pPr>
               <w:pStyle w:val="Compact"/>
-              <w:spacing w:before="20" w:after="20" w:line="293" w:lineRule="auto"/>
-              <w:ind w:firstLine="0"/>
-              <w:jc w:val="left"/>
+              <w:spacing w:before="20" w:after="20"/>
             </w:pPr>
             <w:r>
               <w:rPr>
-                <w:rFonts w:ascii="宋体" w:hAnsi="宋体" w:eastAsia="宋体"/>
-                <w:sz w:val="20"/>
+                <w:rFonts w:hAnsi="宋体"/>
+                <w:sz w:val="19"/>
               </w:rPr>
               <w:t xml:space="preserve">② </w:t>
             </w:r>
             <w:r>
               <w:rPr>
-                <w:rFonts w:hint="eastAsia" w:ascii="宋体" w:hAnsi="宋体" w:eastAsia="宋体"/>
-                <w:sz w:val="20"/>
+                <w:rFonts w:hAnsi="宋体" w:hint="eastAsia"/>
+                <w:sz w:val="19"/>
               </w:rPr>
-              <w:t xml:space="preserve">1秒快速测体温，守护身体健康</w:t>
+              <w:t>1秒快速测体温，守护身体健康</w:t>
             </w:r>
           </w:p>
         </w:tc>
         <w:tc>
           <w:tcPr>
+            <w:tcW w:w="1689" w:type="dxa"/>
             <w:vAlign w:val="center"/>
           </w:tcPr>
           <w:p>
             <w:pPr>
               <w:pStyle w:val="Compact"/>
-              <w:spacing w:before="20" w:after="20" w:line="293" w:lineRule="auto"/>
-              <w:ind w:firstLine="0"/>
+              <w:spacing w:before="20" w:after="20"/>
               <w:jc w:val="center"/>
             </w:pPr>
             <w:r>
               <w:rPr>
-                <w:rFonts w:ascii="宋体" w:hAnsi="宋体" w:eastAsia="宋体"/>
-                <w:sz w:val="20"/>
+                <w:rFonts w:hAnsi="宋体"/>
+                <w:sz w:val="19"/>
               </w:rPr>
               <w:t xml:space="preserve">B ➔ </w:t>
             </w:r>
             <w:r>
               <w:rPr>
-                <w:rFonts w:hint="eastAsia" w:ascii="宋体" w:hAnsi="宋体" w:eastAsia="宋体"/>
-                <w:sz w:val="20"/>
+                <w:rFonts w:hAnsi="宋体" w:hint="eastAsia"/>
+                <w:sz w:val="19"/>
               </w:rPr>
-              <w:t xml:space="preserve">（</w:t>
+              <w:t>（</w:t>
             </w:r>
             <w:r>
               <w:rPr>
-                <w:rFonts w:ascii="宋体" w:hAnsi="宋体" w:eastAsia="宋体"/>
-                <w:sz w:val="20"/>
+                <w:rFonts w:hAnsi="宋体"/>
+                <w:sz w:val="19"/>
               </w:rPr>
               <w:t xml:space="preserve">   </w:t>
             </w:r>
             <w:r>
               <w:rPr>
-                <w:rFonts w:hint="eastAsia" w:ascii="宋体" w:hAnsi="宋体" w:eastAsia="宋体"/>
-                <w:sz w:val="20"/>
+                <w:rFonts w:hAnsi="宋体" w:hint="eastAsia"/>
+                <w:sz w:val="19"/>
               </w:rPr>
-              <w:t xml:space="preserve">）</w:t>
+              <w:t>）</w:t>
             </w:r>
           </w:p>
         </w:tc>
       </w:tr>
       <w:tr>
+        <w:trPr>
+          <w:jc w:val="center"/>
+        </w:trPr>
         <w:tc>
           <w:tcPr>
+            <w:tcW w:w="1900" w:type="dxa"/>
             <w:vAlign w:val="center"/>
           </w:tcPr>
           <w:p>
             <w:pPr>
               <w:pStyle w:val="Compact"/>
-              <w:spacing w:before="20" w:after="20" w:line="293" w:lineRule="auto"/>
-              <w:ind w:firstLine="0"/>
-              <w:jc w:val="left"/>
+              <w:spacing w:before="20" w:after="20"/>
             </w:pPr>
             <w:r>
               <w:rPr>
-                <w:rFonts w:ascii="宋体" w:hAnsi="宋体" w:eastAsia="宋体"/>
+                <w:rFonts w:hAnsi="宋体"/>
                 <w:b/>
                 <w:bCs/>
-                <w:sz w:val="20"/>
+                <w:sz w:val="19"/>
               </w:rPr>
               <w:t xml:space="preserve">C. </w:t>
             </w:r>
             <w:r>
               <w:rPr>
-                <w:rFonts w:hint="eastAsia" w:ascii="宋体" w:hAnsi="宋体" w:eastAsia="宋体"/>
+                <w:rFonts w:hAnsi="宋体" w:hint="eastAsia"/>
                 <w:b/>
                 <w:bCs/>
-                <w:sz w:val="20"/>
+                <w:sz w:val="19"/>
               </w:rPr>
-              <w:t xml:space="preserve">智能道闸</w:t>
+              <w:t>智能道闸</w:t>
             </w:r>
           </w:p>
         </w:tc>
         <w:tc>
           <w:tcPr>
+            <w:tcW w:w="4329" w:type="dxa"/>
             <w:vAlign w:val="center"/>
           </w:tcPr>
           <w:p>
             <w:pPr>
               <w:pStyle w:val="Compact"/>
-              <w:spacing w:before="20" w:after="20" w:line="293" w:lineRule="auto"/>
-              <w:ind w:firstLine="0"/>
-              <w:jc w:val="left"/>
+              <w:spacing w:before="20" w:after="20"/>
             </w:pPr>
             <w:r>
               <w:rPr>
-                <w:rFonts w:ascii="宋体" w:hAnsi="宋体" w:eastAsia="宋体"/>
-                <w:sz w:val="20"/>
+                <w:rFonts w:hAnsi="宋体"/>
+                <w:sz w:val="19"/>
               </w:rPr>
               <w:t xml:space="preserve">③ </w:t>
             </w:r>
             <w:r>
               <w:rPr>
-                <w:rFonts w:hint="eastAsia" w:ascii="宋体" w:hAnsi="宋体" w:eastAsia="宋体"/>
-                <w:sz w:val="20"/>
+                <w:rFonts w:hAnsi="宋体" w:hint="eastAsia"/>
+                <w:sz w:val="19"/>
               </w:rPr>
-              <w:t xml:space="preserve">功能全面算力强，现代信息处理全能大师</w:t>
+              <w:t>功能全面算力强，现代信息处理全能大师</w:t>
             </w:r>
           </w:p>
         </w:tc>
         <w:tc>
           <w:tcPr>
+            <w:tcW w:w="1689" w:type="dxa"/>
             <w:vAlign w:val="center"/>
           </w:tcPr>
           <w:p>
             <w:pPr>
               <w:pStyle w:val="Compact"/>
-              <w:spacing w:before="20" w:after="20" w:line="293" w:lineRule="auto"/>
-              <w:ind w:firstLine="0"/>
+              <w:spacing w:before="20" w:after="20"/>
               <w:jc w:val="center"/>
             </w:pPr>
             <w:r>
               <w:rPr>
-                <w:rFonts w:ascii="宋体" w:hAnsi="宋体" w:eastAsia="宋体"/>
-                <w:sz w:val="20"/>
+                <w:rFonts w:hAnsi="宋体"/>
+                <w:sz w:val="19"/>
               </w:rPr>
               <w:t xml:space="preserve">C ➔ </w:t>
             </w:r>
             <w:r>
               <w:rPr>
-                <w:rFonts w:hint="eastAsia" w:ascii="宋体" w:hAnsi="宋体" w:eastAsia="宋体"/>
-                <w:sz w:val="20"/>
+                <w:rFonts w:hAnsi="宋体" w:hint="eastAsia"/>
+                <w:sz w:val="19"/>
               </w:rPr>
-              <w:t xml:space="preserve">（</w:t>
+              <w:t>（</w:t>
             </w:r>
             <w:r>
               <w:rPr>
-                <w:rFonts w:ascii="宋体" w:hAnsi="宋体" w:eastAsia="宋体"/>
-                <w:sz w:val="20"/>
+                <w:rFonts w:hAnsi="宋体"/>
+                <w:sz w:val="19"/>
               </w:rPr>
               <w:t xml:space="preserve">   </w:t>
             </w:r>
             <w:r>
               <w:rPr>
-                <w:rFonts w:hint="eastAsia" w:ascii="宋体" w:hAnsi="宋体" w:eastAsia="宋体"/>
-                <w:sz w:val="20"/>
+                <w:rFonts w:hAnsi="宋体" w:hint="eastAsia"/>
+                <w:sz w:val="19"/>
               </w:rPr>
-              <w:t xml:space="preserve">）</w:t>
+              <w:t>）</w:t>
             </w:r>
           </w:p>
         </w:tc>
       </w:tr>
       <w:tr>
+        <w:trPr>
+          <w:jc w:val="center"/>
+        </w:trPr>
         <w:tc>
           <w:tcPr>
+            <w:tcW w:w="1900" w:type="dxa"/>
             <w:vAlign w:val="center"/>
           </w:tcPr>
           <w:p>
             <w:pPr>
               <w:pStyle w:val="Compact"/>
-              <w:spacing w:before="20" w:after="20" w:line="293" w:lineRule="auto"/>
-              <w:ind w:firstLine="0"/>
-              <w:jc w:val="left"/>
+              <w:spacing w:before="20" w:after="20"/>
             </w:pPr>
             <w:r>
               <w:rPr>
-                <w:rFonts w:ascii="宋体" w:hAnsi="宋体" w:eastAsia="宋体"/>
+                <w:rFonts w:hAnsi="宋体"/>
                 <w:b/>
                 <w:bCs/>
-                <w:sz w:val="20"/>
+                <w:sz w:val="19"/>
               </w:rPr>
               <w:t xml:space="preserve">D. </w:t>
             </w:r>
             <w:r>
               <w:rPr>
-                <w:rFonts w:hint="eastAsia" w:ascii="宋体" w:hAnsi="宋体" w:eastAsia="宋体"/>
+                <w:rFonts w:hAnsi="宋体" w:hint="eastAsia"/>
                 <w:b/>
                 <w:bCs/>
-                <w:sz w:val="20"/>
+                <w:sz w:val="19"/>
               </w:rPr>
-              <w:t xml:space="preserve">电子计算机</w:t>
+              <w:t>电子计算机</w:t>
             </w:r>
           </w:p>
         </w:tc>
         <w:tc>
           <w:tcPr>
+            <w:tcW w:w="4329" w:type="dxa"/>
             <w:vAlign w:val="center"/>
           </w:tcPr>
           <w:p>
             <w:pPr>
               <w:pStyle w:val="Compact"/>
-              <w:spacing w:before="20" w:after="20" w:line="293" w:lineRule="auto"/>
-              <w:ind w:firstLine="0"/>
-              <w:jc w:val="left"/>
+              <w:spacing w:before="20" w:after="20"/>
             </w:pPr>
             <w:r>
               <w:rPr>
-                <w:rFonts w:ascii="宋体" w:hAnsi="宋体" w:eastAsia="宋体"/>
-                <w:sz w:val="20"/>
+                <w:rFonts w:hAnsi="宋体"/>
+                <w:sz w:val="19"/>
               </w:rPr>
               <w:t xml:space="preserve">④ </w:t>
             </w:r>
             <w:r>
               <w:rPr>
-                <w:rFonts w:hint="eastAsia" w:ascii="宋体" w:hAnsi="宋体" w:eastAsia="宋体"/>
-                <w:sz w:val="20"/>
+                <w:rFonts w:hAnsi="宋体" w:hint="eastAsia"/>
+                <w:sz w:val="19"/>
               </w:rPr>
-              <w:t xml:space="preserve">刷脸刷卡秒抬杆，快速记录人员出入</w:t>
+              <w:t>刷脸刷卡秒抬杆，快速记录人员出入</w:t>
             </w:r>
           </w:p>
         </w:tc>
         <w:tc>
           <w:tcPr>
+            <w:tcW w:w="1689" w:type="dxa"/>
             <w:vAlign w:val="center"/>
           </w:tcPr>
           <w:p>
             <w:pPr>
               <w:pStyle w:val="Compact"/>
-              <w:spacing w:before="20" w:after="20" w:line="293" w:lineRule="auto"/>
-              <w:ind w:firstLine="0"/>
+              <w:spacing w:before="20" w:after="20"/>
               <w:jc w:val="center"/>
             </w:pPr>
             <w:r>
               <w:rPr>
-                <w:rFonts w:ascii="宋体" w:hAnsi="宋体" w:eastAsia="宋体"/>
-                <w:sz w:val="20"/>
+                <w:rFonts w:hAnsi="宋体"/>
+                <w:sz w:val="19"/>
               </w:rPr>
               <w:t xml:space="preserve">D ➔ </w:t>
             </w:r>
             <w:r>
               <w:rPr>
-                <w:rFonts w:hint="eastAsia" w:ascii="宋体" w:hAnsi="宋体" w:eastAsia="宋体"/>
-                <w:sz w:val="20"/>
+                <w:rFonts w:hAnsi="宋体" w:hint="eastAsia"/>
+                <w:sz w:val="19"/>
               </w:rPr>
-              <w:t xml:space="preserve">（</w:t>
+              <w:t>（</w:t>
             </w:r>
             <w:r>
               <w:rPr>
-                <w:rFonts w:ascii="宋体" w:hAnsi="宋体" w:eastAsia="宋体"/>
-                <w:sz w:val="20"/>
+                <w:rFonts w:hAnsi="宋体"/>
+                <w:sz w:val="19"/>
               </w:rPr>
               <w:t xml:space="preserve">   </w:t>
             </w:r>
             <w:r>
               <w:rPr>
-                <w:rFonts w:hint="eastAsia" w:ascii="宋体" w:hAnsi="宋体" w:eastAsia="宋体"/>
-                <w:sz w:val="20"/>
+                <w:rFonts w:hAnsi="宋体" w:hint="eastAsia"/>
+                <w:sz w:val="19"/>
               </w:rPr>
-              <w:t xml:space="preserve">）</w:t>
+              <w:t>）</w:t>
             </w:r>
           </w:p>
         </w:tc>
@@ -783,646 +737,638 @@
     <w:p>
       <w:pPr>
         <w:pStyle w:val="FirstParagraph"/>
-        <w:spacing w:before="60" w:after="120" w:line="331" w:lineRule="auto"/>
-        <w:ind w:left="0" w:firstLine="420"/>
-      </w:pPr>
-      <w:r>
-        <w:rPr>
-          <w:rFonts w:ascii="宋体" w:hAnsi="宋体" w:eastAsia="宋体"/>
+        <w:spacing w:before="20" w:after="60" w:line="293" w:lineRule="auto"/>
+        <w:ind w:firstLine="420"/>
+      </w:pPr>
+      <w:r>
+        <w:rPr>
+          <w:rFonts w:ascii="宋体" w:hAnsi="宋体"/>
           <w:i/>
           <w:iCs/>
-          <w:sz w:val="21"/>
         </w:rPr>
         <w:t xml:space="preserve">💡 </w:t>
       </w:r>
       <w:r>
         <w:rPr>
-          <w:rFonts w:hint="eastAsia" w:ascii="宋体" w:hAnsi="宋体" w:eastAsia="宋体"/>
+          <w:rFonts w:ascii="宋体" w:hAnsi="宋体" w:hint="eastAsia"/>
           <w:i/>
           <w:iCs/>
-          <w:sz w:val="21"/>
-        </w:rPr>
-        <w:t xml:space="preserve">科技自立：openKylin（开放麒麟）与鸿蒙系统为信息安全护航！</w:t>
+        </w:rPr>
+        <w:t>科技自立：openKylin（开放麒麟）与鸿蒙系统为信息安全护航！</w:t>
       </w:r>
     </w:p>
-    <w:bookmarkEnd w:id="9"/>
-    <w:bookmarkStart w:id="10" w:name="_4aa939124c3eca048ec5260d2aea30742da7198"/>
     <w:p>
       <w:pPr>
         <w:pStyle w:val="3"/>
-        <w:spacing w:before="320" w:after="120" w:line="300" w:lineRule="auto"/>
-        <w:ind w:firstLine="0"/>
+        <w:spacing w:before="180" w:after="60" w:line="288" w:lineRule="auto"/>
         <w:jc w:val="left"/>
       </w:pPr>
-      <w:r>
-        <w:rPr>
-          <w:rFonts w:ascii="黑体" w:hAnsi="黑体" w:eastAsia="黑体"/>
+      <w:bookmarkStart w:id="2" w:name="_4aa939124c3eca048ec5260d2aea30742da7198"/>
+      <w:bookmarkEnd w:id="1"/>
+      <w:r>
+        <w:rPr>
+          <w:rFonts w:ascii="黑体" w:eastAsia="黑体" w:hAnsi="黑体"/>
           <w:b/>
           <w:color w:val="1F3A60"/>
-          <w:sz w:val="25"/>
+          <w:sz w:val="23"/>
         </w:rPr>
         <w:t xml:space="preserve">⭐⭐ </w:t>
       </w:r>
       <w:r>
         <w:rPr>
-          <w:rFonts w:hint="eastAsia" w:ascii="黑体" w:hAnsi="黑体" w:eastAsia="黑体"/>
+          <w:rFonts w:ascii="黑体" w:eastAsia="黑体" w:hAnsi="黑体" w:hint="eastAsia"/>
           <w:b/>
           <w:color w:val="1F3A60"/>
-          <w:sz w:val="25"/>
-        </w:rPr>
-        <w:t xml:space="preserve">第二关：透视机箱</w:t>
-      </w:r>
-      <w:r>
-        <w:rPr>
-          <w:rFonts w:ascii="黑体" w:hAnsi="黑体" w:eastAsia="黑体"/>
+          <w:sz w:val="23"/>
+        </w:rPr>
+        <w:t>第二关：透视机箱</w:t>
+      </w:r>
+      <w:r>
+        <w:rPr>
+          <w:rFonts w:ascii="黑体" w:eastAsia="黑体" w:hAnsi="黑体"/>
           <w:b/>
           <w:color w:val="1F3A60"/>
-          <w:sz w:val="25"/>
+          <w:sz w:val="23"/>
         </w:rPr>
         <w:t xml:space="preserve"> · </w:t>
       </w:r>
       <w:r>
         <w:rPr>
-          <w:rFonts w:hint="eastAsia" w:ascii="黑体" w:hAnsi="黑体" w:eastAsia="黑体"/>
+          <w:rFonts w:ascii="黑体" w:eastAsia="黑体" w:hAnsi="黑体" w:hint="eastAsia"/>
           <w:b/>
           <w:color w:val="1F3A60"/>
-          <w:sz w:val="25"/>
-        </w:rPr>
-        <w:t xml:space="preserve">核心构件小档案</w:t>
+          <w:sz w:val="23"/>
+        </w:rPr>
+        <w:t>核心构件小档案</w:t>
       </w:r>
     </w:p>
     <w:p>
       <w:pPr>
         <w:pStyle w:val="FirstParagraph"/>
-        <w:spacing w:before="60" w:after="120" w:line="331" w:lineRule="auto"/>
-        <w:ind w:left="0" w:firstLine="420"/>
-      </w:pPr>
-      <w:r>
-        <w:rPr>
-          <w:rFonts w:hint="eastAsia" w:ascii="宋体" w:hAnsi="宋体" w:eastAsia="宋体"/>
-          <w:sz w:val="21"/>
-        </w:rPr>
-        <w:t xml:space="preserve">观察主机箱内部，为下列部件选择</w:t>
-      </w:r>
-      <w:r>
-        <w:rPr>
-          <w:rFonts w:hint="eastAsia" w:ascii="宋体" w:hAnsi="宋体" w:eastAsia="宋体"/>
+        <w:spacing w:before="20" w:after="60" w:line="293" w:lineRule="auto"/>
+        <w:ind w:firstLine="420"/>
+      </w:pPr>
+      <w:r>
+        <w:rPr>
+          <w:rFonts w:ascii="宋体" w:hAnsi="宋体" w:hint="eastAsia"/>
+        </w:rPr>
+        <w:t>观察主机箱内部，为下列部件选择</w:t>
+      </w:r>
+      <w:r>
+        <w:rPr>
+          <w:rFonts w:ascii="宋体" w:hAnsi="宋体" w:hint="eastAsia"/>
           <w:b/>
           <w:bCs/>
-          <w:sz w:val="21"/>
-        </w:rPr>
-        <w:t xml:space="preserve">角色序号</w:t>
-      </w:r>
-      <w:r>
-        <w:rPr>
-          <w:rFonts w:hint="eastAsia" w:ascii="宋体" w:hAnsi="宋体" w:eastAsia="宋体"/>
-          <w:sz w:val="21"/>
-        </w:rPr>
-        <w:t xml:space="preserve">填入括号：</w:t>
-      </w:r>
-      <w:r>
-        <w:rPr>
-          <w:rFonts w:ascii="宋体" w:hAnsi="宋体" w:eastAsia="宋体"/>
-          <w:sz w:val="21"/>
+        </w:rPr>
+        <w:t>角色序号</w:t>
+      </w:r>
+      <w:r>
+        <w:rPr>
+          <w:rFonts w:ascii="宋体" w:hAnsi="宋体" w:hint="eastAsia"/>
+        </w:rPr>
+        <w:t>填入括号：</w:t>
+      </w:r>
+      <w:r>
+        <w:rPr>
+          <w:rFonts w:ascii="宋体" w:hAnsi="宋体"/>
         </w:rPr>
         <w:br/>
       </w:r>
       <w:r>
         <w:rPr>
-          <w:rFonts w:hint="eastAsia" w:ascii="宋体" w:hAnsi="宋体" w:eastAsia="宋体"/>
+          <w:rFonts w:ascii="宋体" w:hAnsi="宋体" w:hint="eastAsia"/>
           <w:b/>
           <w:bCs/>
-          <w:sz w:val="21"/>
-        </w:rPr>
-        <w:t xml:space="preserve">备选库</w:t>
-      </w:r>
-      <w:r>
-        <w:rPr>
-          <w:rFonts w:hint="eastAsia" w:ascii="宋体" w:hAnsi="宋体" w:eastAsia="宋体"/>
-          <w:sz w:val="21"/>
-        </w:rPr>
-        <w:t xml:space="preserve">：①</w:t>
-      </w:r>
-      <w:r>
-        <w:rPr>
-          <w:rFonts w:ascii="宋体" w:hAnsi="宋体" w:eastAsia="宋体"/>
-          <w:sz w:val="21"/>
+        </w:rPr>
+        <w:t>备选库</w:t>
+      </w:r>
+      <w:r>
+        <w:rPr>
+          <w:rFonts w:ascii="宋体" w:hAnsi="宋体" w:hint="eastAsia"/>
+        </w:rPr>
+        <w:t>：①</w:t>
+      </w:r>
+      <w:r>
+        <w:rPr>
+          <w:rFonts w:ascii="宋体" w:hAnsi="宋体"/>
         </w:rPr>
         <w:t xml:space="preserve"> </w:t>
       </w:r>
       <w:r>
         <w:rPr>
-          <w:rFonts w:hint="eastAsia" w:ascii="宋体" w:hAnsi="宋体" w:eastAsia="宋体"/>
-          <w:sz w:val="21"/>
-        </w:rPr>
-        <w:t xml:space="preserve">CPU（超级大脑）</w:t>
-      </w:r>
-      <w:r>
-        <w:rPr>
-          <w:rFonts w:ascii="宋体" w:hAnsi="宋体" w:eastAsia="宋体"/>
-          <w:sz w:val="21"/>
+          <w:rFonts w:ascii="宋体" w:hAnsi="宋体" w:hint="eastAsia"/>
+        </w:rPr>
+        <w:t>CPU（超级大脑）</w:t>
+      </w:r>
+      <w:r>
+        <w:rPr>
+          <w:rFonts w:ascii="宋体" w:hAnsi="宋体"/>
         </w:rPr>
         <w:t xml:space="preserve">    ② </w:t>
       </w:r>
       <w:r>
         <w:rPr>
-          <w:rFonts w:hint="eastAsia" w:ascii="宋体" w:hAnsi="宋体" w:eastAsia="宋体"/>
-          <w:sz w:val="21"/>
-        </w:rPr>
-        <w:t xml:space="preserve">硬盘（海量仓库）</w:t>
-      </w:r>
-      <w:r>
-        <w:rPr>
-          <w:rFonts w:ascii="宋体" w:hAnsi="宋体" w:eastAsia="宋体"/>
-          <w:sz w:val="21"/>
+          <w:rFonts w:ascii="宋体" w:hAnsi="宋体" w:hint="eastAsia"/>
+        </w:rPr>
+        <w:t>硬盘（海量仓库）</w:t>
+      </w:r>
+      <w:r>
+        <w:rPr>
+          <w:rFonts w:ascii="宋体" w:hAnsi="宋体"/>
         </w:rPr>
         <w:t xml:space="preserve">    ③ </w:t>
       </w:r>
       <w:r>
         <w:rPr>
-          <w:rFonts w:hint="eastAsia" w:ascii="宋体" w:hAnsi="宋体" w:eastAsia="宋体"/>
-          <w:sz w:val="21"/>
-        </w:rPr>
-        <w:t xml:space="preserve">主板（电路桥梁）</w:t>
-      </w:r>
-      <w:r>
-        <w:rPr>
-          <w:rFonts w:ascii="宋体" w:hAnsi="宋体" w:eastAsia="宋体"/>
-          <w:sz w:val="21"/>
+          <w:rFonts w:ascii="宋体" w:hAnsi="宋体" w:hint="eastAsia"/>
+        </w:rPr>
+        <w:t>主板（电路桥梁）</w:t>
+      </w:r>
+      <w:r>
+        <w:rPr>
+          <w:rFonts w:ascii="宋体" w:hAnsi="宋体"/>
         </w:rPr>
         <w:t xml:space="preserve">    ④ </w:t>
       </w:r>
       <w:r>
         <w:rPr>
-          <w:rFonts w:hint="eastAsia" w:ascii="宋体" w:hAnsi="宋体" w:eastAsia="宋体"/>
-          <w:sz w:val="21"/>
-        </w:rPr>
-        <w:t xml:space="preserve">风扇（降温空调）</w:t>
+          <w:rFonts w:ascii="宋体" w:hAnsi="宋体" w:hint="eastAsia"/>
+        </w:rPr>
+        <w:t>风扇（降温空调）</w:t>
       </w:r>
     </w:p>
     <w:p>
       <w:pPr>
         <w:pStyle w:val="Compact"/>
-        <w:spacing w:before="40" w:after="80" w:line="312" w:lineRule="auto"/>
-        <w:ind w:left="280" w:firstLine="0"/>
-      </w:pPr>
-      <w:r>
-        <w:rPr>
-          <w:rFonts w:hint="eastAsia" w:ascii="宋体" w:hAnsi="宋体" w:eastAsia="宋体"/>
-          <w:sz w:val="21"/>
-        </w:rPr>
-        <w:t xml:space="preserve">负责全机高速运算与发号施令的是（</w:t>
-      </w:r>
-      <w:r>
-        <w:rPr>
-          <w:rFonts w:ascii="宋体" w:hAnsi="宋体" w:eastAsia="宋体"/>
-          <w:sz w:val="21"/>
-        </w:rPr>
-        <w:t xml:space="preserve">    </w:t>
-      </w:r>
-      <w:r>
-        <w:rPr>
-          <w:rFonts w:hint="eastAsia" w:ascii="宋体" w:hAnsi="宋体" w:eastAsia="宋体"/>
-          <w:sz w:val="21"/>
-        </w:rPr>
-        <w:t xml:space="preserve">）。</w:t>
+        <w:spacing w:before="20" w:line="288" w:lineRule="auto"/>
+        <w:ind w:left="280"/>
+      </w:pPr>
+      <w:r>
+        <w:rPr>
+          <w:rFonts w:ascii="宋体" w:hAnsi="宋体" w:hint="eastAsia"/>
+          <w:sz w:val="20"/>
+        </w:rPr>
+        <w:t>负责全机高速运算与发号施令的是（</w:t>
+      </w:r>
+      <w:r>
+        <w:rPr>
+          <w:rFonts w:ascii="宋体" w:hAnsi="宋体"/>
+          <w:sz w:val="20"/>
+        </w:rPr>
+        <w:t>    </w:t>
+      </w:r>
+      <w:r>
+        <w:rPr>
+          <w:rFonts w:ascii="宋体" w:hAnsi="宋体" w:hint="eastAsia"/>
+          <w:sz w:val="20"/>
+        </w:rPr>
+        <w:t>）。</w:t>
       </w:r>
     </w:p>
     <w:p>
       <w:pPr>
         <w:pStyle w:val="Compact"/>
-        <w:spacing w:before="40" w:after="80" w:line="312" w:lineRule="auto"/>
-        <w:ind w:left="280" w:firstLine="0"/>
-      </w:pPr>
-      <w:r>
-        <w:rPr>
-          <w:rFonts w:hint="eastAsia" w:ascii="宋体" w:hAnsi="宋体" w:eastAsia="宋体"/>
-          <w:sz w:val="21"/>
-        </w:rPr>
-        <w:t xml:space="preserve">连接所有零部件、四通八达传递信号的是（</w:t>
-      </w:r>
-      <w:r>
-        <w:rPr>
-          <w:rFonts w:ascii="宋体" w:hAnsi="宋体" w:eastAsia="宋体"/>
-          <w:sz w:val="21"/>
-        </w:rPr>
-        <w:t xml:space="preserve">    </w:t>
-      </w:r>
-      <w:r>
-        <w:rPr>
-          <w:rFonts w:hint="eastAsia" w:ascii="宋体" w:hAnsi="宋体" w:eastAsia="宋体"/>
-          <w:sz w:val="21"/>
-        </w:rPr>
-        <w:t xml:space="preserve">）。</w:t>
+        <w:spacing w:before="20" w:line="288" w:lineRule="auto"/>
+        <w:ind w:left="280"/>
+      </w:pPr>
+      <w:r>
+        <w:rPr>
+          <w:rFonts w:ascii="宋体" w:hAnsi="宋体" w:hint="eastAsia"/>
+          <w:sz w:val="20"/>
+        </w:rPr>
+        <w:t>连接所有零部件、四通八达传递信号的是（</w:t>
+      </w:r>
+      <w:r>
+        <w:rPr>
+          <w:rFonts w:ascii="宋体" w:hAnsi="宋体"/>
+          <w:sz w:val="20"/>
+        </w:rPr>
+        <w:t>    </w:t>
+      </w:r>
+      <w:r>
+        <w:rPr>
+          <w:rFonts w:ascii="宋体" w:hAnsi="宋体" w:hint="eastAsia"/>
+          <w:sz w:val="20"/>
+        </w:rPr>
+        <w:t>）。</w:t>
       </w:r>
     </w:p>
     <w:p>
       <w:pPr>
         <w:pStyle w:val="Compact"/>
-        <w:spacing w:before="40" w:after="80" w:line="312" w:lineRule="auto"/>
-        <w:ind w:left="280" w:firstLine="0"/>
-      </w:pPr>
-      <w:r>
-        <w:rPr>
-          <w:rFonts w:hint="eastAsia" w:ascii="宋体" w:hAnsi="宋体" w:eastAsia="宋体"/>
-          <w:sz w:val="21"/>
-        </w:rPr>
-        <w:t xml:space="preserve">能够长久保存照片、文档与系统的是（</w:t>
-      </w:r>
-      <w:r>
-        <w:rPr>
-          <w:rFonts w:ascii="宋体" w:hAnsi="宋体" w:eastAsia="宋体"/>
-          <w:sz w:val="21"/>
-        </w:rPr>
-        <w:t xml:space="preserve">    </w:t>
-      </w:r>
-      <w:r>
-        <w:rPr>
-          <w:rFonts w:hint="eastAsia" w:ascii="宋体" w:hAnsi="宋体" w:eastAsia="宋体"/>
-          <w:sz w:val="21"/>
-        </w:rPr>
-        <w:t xml:space="preserve">）。</w:t>
+        <w:spacing w:before="20" w:line="288" w:lineRule="auto"/>
+        <w:ind w:left="280"/>
+      </w:pPr>
+      <w:r>
+        <w:rPr>
+          <w:rFonts w:ascii="宋体" w:hAnsi="宋体" w:hint="eastAsia"/>
+          <w:sz w:val="20"/>
+        </w:rPr>
+        <w:t>能够长久保存照片、文档与系统的是（</w:t>
+      </w:r>
+      <w:r>
+        <w:rPr>
+          <w:rFonts w:ascii="宋体" w:hAnsi="宋体"/>
+          <w:sz w:val="20"/>
+        </w:rPr>
+        <w:t>    </w:t>
+      </w:r>
+      <w:r>
+        <w:rPr>
+          <w:rFonts w:ascii="宋体" w:hAnsi="宋体" w:hint="eastAsia"/>
+          <w:sz w:val="20"/>
+        </w:rPr>
+        <w:t>）。</w:t>
       </w:r>
     </w:p>
     <w:p>
       <w:pPr>
         <w:pStyle w:val="Compact"/>
-        <w:spacing w:before="40" w:after="80" w:line="312" w:lineRule="auto"/>
-        <w:ind w:left="280" w:firstLine="0"/>
-      </w:pPr>
-      <w:r>
-        <w:rPr>
-          <w:rFonts w:hint="eastAsia" w:ascii="宋体" w:hAnsi="宋体" w:eastAsia="宋体"/>
-          <w:sz w:val="21"/>
-        </w:rPr>
-        <w:t xml:space="preserve">强力吹风散热，保障电脑冷静运行的是（</w:t>
-      </w:r>
-      <w:r>
-        <w:rPr>
-          <w:rFonts w:ascii="宋体" w:hAnsi="宋体" w:eastAsia="宋体"/>
-          <w:sz w:val="21"/>
-        </w:rPr>
-        <w:t xml:space="preserve">    </w:t>
-      </w:r>
-      <w:r>
-        <w:rPr>
-          <w:rFonts w:hint="eastAsia" w:ascii="宋体" w:hAnsi="宋体" w:eastAsia="宋体"/>
-          <w:sz w:val="21"/>
-        </w:rPr>
-        <w:t xml:space="preserve">）。</w:t>
+        <w:spacing w:before="20" w:line="288" w:lineRule="auto"/>
+        <w:ind w:left="280"/>
+      </w:pPr>
+      <w:r>
+        <w:rPr>
+          <w:rFonts w:ascii="宋体" w:hAnsi="宋体" w:hint="eastAsia"/>
+          <w:sz w:val="20"/>
+        </w:rPr>
+        <w:t>强力吹风散热，保障电脑冷静运行的是（</w:t>
+      </w:r>
+      <w:r>
+        <w:rPr>
+          <w:rFonts w:ascii="宋体" w:hAnsi="宋体"/>
+          <w:sz w:val="20"/>
+        </w:rPr>
+        <w:t>    </w:t>
+      </w:r>
+      <w:r>
+        <w:rPr>
+          <w:rFonts w:ascii="宋体" w:hAnsi="宋体" w:hint="eastAsia"/>
+          <w:sz w:val="20"/>
+        </w:rPr>
+        <w:t>）。</w:t>
       </w:r>
     </w:p>
-    <w:bookmarkEnd w:id="10"/>
-    <w:bookmarkStart w:id="11" w:name="_47daeaadc6bac15576c2c80bef3f0755ba7b740"/>
     <w:p>
       <w:pPr>
         <w:pStyle w:val="3"/>
-        <w:spacing w:before="320" w:after="120" w:line="300" w:lineRule="auto"/>
-        <w:ind w:firstLine="0"/>
+        <w:spacing w:before="180" w:after="60" w:line="288" w:lineRule="auto"/>
         <w:jc w:val="left"/>
       </w:pPr>
-      <w:r>
-        <w:rPr>
-          <w:rFonts w:ascii="黑体" w:hAnsi="黑体" w:eastAsia="黑体"/>
+      <w:bookmarkStart w:id="3" w:name="_47daeaadc6bac15576c2c80bef3f0755ba7b740"/>
+      <w:bookmarkEnd w:id="2"/>
+      <w:r>
+        <w:rPr>
+          <w:rFonts w:ascii="黑体" w:eastAsia="黑体" w:hAnsi="黑体"/>
           <w:b/>
           <w:color w:val="1F3A60"/>
-          <w:sz w:val="25"/>
+          <w:sz w:val="23"/>
         </w:rPr>
         <w:t xml:space="preserve">⭐⭐⭐ </w:t>
       </w:r>
       <w:r>
         <w:rPr>
-          <w:rFonts w:hint="eastAsia" w:ascii="黑体" w:hAnsi="黑体" w:eastAsia="黑体"/>
+          <w:rFonts w:ascii="黑体" w:eastAsia="黑体" w:hAnsi="黑体" w:hint="eastAsia"/>
           <w:b/>
           <w:color w:val="1F3A60"/>
-          <w:sz w:val="25"/>
-        </w:rPr>
-        <w:t xml:space="preserve">第三关：上机实操</w:t>
-      </w:r>
-      <w:r>
-        <w:rPr>
-          <w:rFonts w:ascii="黑体" w:hAnsi="黑体" w:eastAsia="黑体"/>
+          <w:sz w:val="23"/>
+        </w:rPr>
+        <w:t>第三关：上机实操</w:t>
+      </w:r>
+      <w:r>
+        <w:rPr>
+          <w:rFonts w:ascii="黑体" w:eastAsia="黑体" w:hAnsi="黑体"/>
           <w:b/>
           <w:color w:val="1F3A60"/>
-          <w:sz w:val="25"/>
+          <w:sz w:val="23"/>
         </w:rPr>
         <w:t xml:space="preserve"> · </w:t>
       </w:r>
       <w:r>
         <w:rPr>
-          <w:rFonts w:hint="eastAsia" w:ascii="黑体" w:hAnsi="黑体" w:eastAsia="黑体"/>
+          <w:rFonts w:ascii="黑体" w:eastAsia="黑体" w:hAnsi="黑体" w:hint="eastAsia"/>
           <w:b/>
           <w:color w:val="1F3A60"/>
-          <w:sz w:val="25"/>
-        </w:rPr>
-        <w:t xml:space="preserve">鼠标键盘大练兵</w:t>
+          <w:sz w:val="23"/>
+        </w:rPr>
+        <w:t>鼠标键盘大练兵</w:t>
       </w:r>
     </w:p>
     <w:p>
       <w:pPr>
         <w:pStyle w:val="FirstParagraph"/>
-        <w:spacing w:before="60" w:after="120" w:line="331" w:lineRule="auto"/>
-        <w:ind w:left="0" w:firstLine="420"/>
-      </w:pPr>
-      <w:r>
-        <w:rPr>
-          <w:rFonts w:hint="eastAsia" w:ascii="宋体" w:hAnsi="宋体" w:eastAsia="宋体"/>
-          <w:sz w:val="21"/>
-        </w:rPr>
-        <w:t xml:space="preserve">规范操作桌上的输入设备，完成一项就在方框里打“√”：</w:t>
+        <w:spacing w:before="20" w:after="60" w:line="293" w:lineRule="auto"/>
+        <w:ind w:firstLine="420"/>
+      </w:pPr>
+      <w:r>
+        <w:rPr>
+          <w:rFonts w:ascii="宋体" w:hAnsi="宋体" w:hint="eastAsia"/>
+        </w:rPr>
+        <w:t>规范操作桌上的输入设备，完成一项就在方框里打“√”：</w:t>
       </w:r>
     </w:p>
     <w:p>
       <w:pPr>
         <w:pStyle w:val="Compact"/>
-        <w:spacing w:before="40" w:after="80" w:line="312" w:lineRule="auto"/>
-        <w:ind w:left="280" w:firstLine="0"/>
-      </w:pPr>
-      <w:r>
-        <w:rPr>
-          <w:rFonts w:hint="eastAsia" w:ascii="宋体" w:hAnsi="宋体" w:eastAsia="宋体"/>
+        <w:spacing w:before="20" w:line="288" w:lineRule="auto"/>
+        <w:ind w:left="280"/>
+      </w:pPr>
+      <w:r>
+        <w:rPr>
+          <w:rFonts w:ascii="宋体" w:hAnsi="宋体" w:hint="eastAsia"/>
           <w:b/>
           <w:bCs/>
-          <w:sz w:val="21"/>
-        </w:rPr>
-        <w:t xml:space="preserve">规范握姿</w:t>
-      </w:r>
-      <w:r>
-        <w:rPr>
-          <w:rFonts w:hint="eastAsia" w:ascii="宋体" w:hAnsi="宋体" w:eastAsia="宋体"/>
-          <w:sz w:val="21"/>
-        </w:rPr>
-        <w:t xml:space="preserve">：食指放左键，中指放右键，食指拨中间滚轮。</w:t>
+          <w:sz w:val="20"/>
+        </w:rPr>
+        <w:t>规范握姿</w:t>
+      </w:r>
+      <w:r>
+        <w:rPr>
+          <w:rFonts w:ascii="宋体" w:hAnsi="宋体" w:hint="eastAsia"/>
+          <w:sz w:val="20"/>
+        </w:rPr>
+        <w:t>：食指放左键，中指放右键，食指拨中间滚轮。</w:t>
       </w:r>
     </w:p>
     <w:p>
       <w:pPr>
         <w:pStyle w:val="Compact"/>
-        <w:spacing w:before="40" w:after="80" w:line="312" w:lineRule="auto"/>
-        <w:ind w:left="280" w:firstLine="0"/>
-      </w:pPr>
-      <w:r>
-        <w:rPr>
-          <w:rFonts w:hint="eastAsia" w:ascii="宋体" w:hAnsi="宋体" w:eastAsia="宋体"/>
+        <w:spacing w:before="20" w:line="288" w:lineRule="auto"/>
+        <w:ind w:left="280"/>
+      </w:pPr>
+      <w:r>
+        <w:rPr>
+          <w:rFonts w:ascii="宋体" w:hAnsi="宋体" w:hint="eastAsia"/>
           <w:b/>
           <w:bCs/>
-          <w:sz w:val="21"/>
-        </w:rPr>
-        <w:t xml:space="preserve">双击启动</w:t>
-      </w:r>
-      <w:r>
-        <w:rPr>
-          <w:rFonts w:hint="eastAsia" w:ascii="宋体" w:hAnsi="宋体" w:eastAsia="宋体"/>
-          <w:sz w:val="21"/>
-        </w:rPr>
-        <w:t xml:space="preserve">：右手食指快速</w:t>
-      </w:r>
-      <w:r>
-        <w:rPr>
-          <w:rFonts w:hint="eastAsia" w:ascii="宋体" w:hAnsi="宋体" w:eastAsia="宋体"/>
+          <w:sz w:val="20"/>
+        </w:rPr>
+        <w:t>双击启动</w:t>
+      </w:r>
+      <w:r>
+        <w:rPr>
+          <w:rFonts w:ascii="宋体" w:hAnsi="宋体" w:hint="eastAsia"/>
+          <w:sz w:val="20"/>
+        </w:rPr>
+        <w:t>：右手食指快速</w:t>
+      </w:r>
+      <w:r>
+        <w:rPr>
+          <w:rFonts w:ascii="宋体" w:hAnsi="宋体" w:hint="eastAsia"/>
           <w:b/>
           <w:bCs/>
-          <w:sz w:val="21"/>
-        </w:rPr>
-        <w:t xml:space="preserve">双击左键</w:t>
-      </w:r>
-      <w:r>
-        <w:rPr>
-          <w:rFonts w:hint="eastAsia" w:ascii="宋体" w:hAnsi="宋体" w:eastAsia="宋体"/>
-          <w:sz w:val="21"/>
-        </w:rPr>
-        <w:t xml:space="preserve">，成功打开“记事本”。</w:t>
+          <w:sz w:val="20"/>
+        </w:rPr>
+        <w:t>双击左键</w:t>
+      </w:r>
+      <w:r>
+        <w:rPr>
+          <w:rFonts w:ascii="宋体" w:hAnsi="宋体" w:hint="eastAsia"/>
+          <w:sz w:val="20"/>
+        </w:rPr>
+        <w:t>，成功打开“记事本”。</w:t>
       </w:r>
     </w:p>
     <w:p>
       <w:pPr>
         <w:pStyle w:val="Compact"/>
-        <w:spacing w:before="40" w:after="80" w:line="312" w:lineRule="auto"/>
-        <w:ind w:left="280" w:firstLine="0"/>
-      </w:pPr>
-      <w:r>
-        <w:rPr>
-          <w:rFonts w:hint="eastAsia" w:ascii="宋体" w:hAnsi="宋体" w:eastAsia="宋体"/>
+        <w:spacing w:before="20" w:line="288" w:lineRule="auto"/>
+        <w:ind w:left="280"/>
+      </w:pPr>
+      <w:r>
+        <w:rPr>
+          <w:rFonts w:ascii="宋体" w:hAnsi="宋体" w:hint="eastAsia"/>
           <w:b/>
           <w:bCs/>
-          <w:sz w:val="21"/>
-        </w:rPr>
-        <w:t xml:space="preserve">键盘初体验</w:t>
-      </w:r>
-      <w:r>
-        <w:rPr>
-          <w:rFonts w:hint="eastAsia" w:ascii="宋体" w:hAnsi="宋体" w:eastAsia="宋体"/>
-          <w:sz w:val="21"/>
-        </w:rPr>
-        <w:t xml:space="preserve">：在记事本敲入自己的姓名拼音：</w:t>
+          <w:sz w:val="20"/>
+        </w:rPr>
+        <w:t>键盘初体验</w:t>
+      </w:r>
+      <w:r>
+        <w:rPr>
+          <w:rFonts w:ascii="宋体" w:hAnsi="宋体" w:hint="eastAsia"/>
+          <w:sz w:val="20"/>
+        </w:rPr>
+        <w:t>：在记事本敲入自己的姓名拼音：</w:t>
       </w:r>
       <w:r>
         <w:rPr>
           <w:rStyle w:val="VerbatimChar"/>
-          <w:rFonts w:ascii="宋体" w:hAnsi="宋体" w:eastAsia="宋体"/>
-          <w:sz w:val="21"/>
-        </w:rPr>
-        <w:t xml:space="preserve">__________</w:t>
+          <w:rFonts w:ascii="宋体" w:hAnsi="宋体"/>
+          <w:sz w:val="20"/>
+        </w:rPr>
+        <w:t>__________</w:t>
       </w:r>
     </w:p>
-    <w:bookmarkEnd w:id="11"/>
-    <w:bookmarkStart w:id="12" w:name="_机房好习惯与自评打卡"/>
     <w:p>
       <w:pPr>
         <w:pStyle w:val="3"/>
-        <w:spacing w:before="320" w:after="120" w:line="300" w:lineRule="auto"/>
-        <w:ind w:firstLine="0"/>
+        <w:spacing w:before="180" w:after="60" w:line="288" w:lineRule="auto"/>
         <w:jc w:val="left"/>
       </w:pPr>
-      <w:r>
-        <w:rPr>
-          <w:rFonts w:ascii="黑体" w:hAnsi="黑体" w:eastAsia="黑体"/>
+      <w:bookmarkStart w:id="4" w:name="_机房好习惯与自评打卡"/>
+      <w:bookmarkEnd w:id="3"/>
+      <w:r>
+        <w:rPr>
+          <w:rFonts w:ascii="黑体" w:eastAsia="黑体" w:hAnsi="黑体"/>
           <w:b/>
           <w:color w:val="1F3A60"/>
-          <w:sz w:val="25"/>
+          <w:sz w:val="23"/>
         </w:rPr>
         <w:t xml:space="preserve">🏆 </w:t>
       </w:r>
       <w:r>
         <w:rPr>
-          <w:rFonts w:hint="eastAsia" w:ascii="黑体" w:hAnsi="黑体" w:eastAsia="黑体"/>
+          <w:rFonts w:ascii="黑体" w:eastAsia="黑体" w:hAnsi="黑体" w:hint="eastAsia"/>
           <w:b/>
           <w:color w:val="1F3A60"/>
-          <w:sz w:val="25"/>
-        </w:rPr>
-        <w:t xml:space="preserve">机房好习惯与自评打卡</w:t>
+          <w:sz w:val="23"/>
+        </w:rPr>
+        <w:t>机房好习惯与自评打卡</w:t>
       </w:r>
     </w:p>
     <w:p>
       <w:pPr>
         <w:pStyle w:val="Compact"/>
-        <w:spacing w:before="40" w:after="80" w:line="312" w:lineRule="auto"/>
-        <w:ind w:left="280" w:firstLine="0"/>
-      </w:pPr>
-      <w:r>
-        <w:rPr>
-          <w:rFonts w:ascii="宋体" w:hAnsi="宋体" w:eastAsia="宋体"/>
-          <w:sz w:val="21"/>
-        </w:rPr>
-        <w:t>□</w:t>
-      </w:r>
-      <w:r>
-        <w:rPr>
-          <w:rFonts w:ascii="宋体" w:hAnsi="宋体" w:eastAsia="宋体"/>
-          <w:sz w:val="21"/>
-        </w:rPr>
-        <w:t xml:space="preserve"> </w:t>
-      </w:r>
-      <w:r>
-        <w:rPr>
-          <w:rFonts w:hint="eastAsia" w:ascii="宋体" w:hAnsi="宋体" w:eastAsia="宋体"/>
+        <w:spacing w:before="20" w:line="288" w:lineRule="auto"/>
+        <w:ind w:left="280"/>
+      </w:pPr>
+      <w:r>
+        <w:rPr>
+          <w:rFonts w:ascii="宋体" w:hAnsi="宋体"/>
+          <w:sz w:val="20"/>
+        </w:rPr>
+        <w:t xml:space="preserve">□ </w:t>
+      </w:r>
+      <w:r>
+        <w:rPr>
+          <w:rFonts w:ascii="宋体" w:hAnsi="宋体" w:hint="eastAsia"/>
           <w:b/>
           <w:bCs/>
-          <w:sz w:val="21"/>
-        </w:rPr>
-        <w:t xml:space="preserve">文明关机</w:t>
-      </w:r>
-      <w:r>
-        <w:rPr>
-          <w:rFonts w:hint="eastAsia" w:ascii="宋体" w:hAnsi="宋体" w:eastAsia="宋体"/>
-          <w:sz w:val="21"/>
-        </w:rPr>
-        <w:t xml:space="preserve">：下课点击【开始】➔【关机】，不直接拔电源。</w:t>
+          <w:sz w:val="20"/>
+        </w:rPr>
+        <w:t>文明关机</w:t>
+      </w:r>
+      <w:r>
+        <w:rPr>
+          <w:rFonts w:ascii="宋体" w:hAnsi="宋体" w:hint="eastAsia"/>
+          <w:sz w:val="20"/>
+        </w:rPr>
+        <w:t>：下课点击【开始】➔【关机】，不直接拔电源。</w:t>
       </w:r>
     </w:p>
     <w:p>
       <w:pPr>
         <w:pStyle w:val="Compact"/>
-        <w:spacing w:before="40" w:after="80" w:line="312" w:lineRule="auto"/>
-        <w:ind w:left="280" w:firstLine="0"/>
-      </w:pPr>
-      <w:r>
-        <w:rPr>
-          <w:rFonts w:ascii="宋体" w:hAnsi="宋体" w:eastAsia="宋体"/>
-          <w:sz w:val="21"/>
-        </w:rPr>
-        <w:t>□</w:t>
-      </w:r>
-      <w:r>
-        <w:rPr>
-          <w:rFonts w:ascii="宋体" w:hAnsi="宋体" w:eastAsia="宋体"/>
-          <w:sz w:val="21"/>
-        </w:rPr>
-        <w:t xml:space="preserve"> </w:t>
-      </w:r>
-      <w:r>
-        <w:rPr>
-          <w:rFonts w:hint="eastAsia" w:ascii="宋体" w:hAnsi="宋体" w:eastAsia="宋体"/>
+        <w:spacing w:before="20" w:line="288" w:lineRule="auto"/>
+        <w:ind w:left="280"/>
+      </w:pPr>
+      <w:r>
+        <w:rPr>
+          <w:rFonts w:ascii="宋体" w:hAnsi="宋体"/>
+          <w:sz w:val="20"/>
+        </w:rPr>
+        <w:t xml:space="preserve">□ </w:t>
+      </w:r>
+      <w:r>
+        <w:rPr>
+          <w:rFonts w:ascii="宋体" w:hAnsi="宋体" w:hint="eastAsia"/>
           <w:b/>
           <w:bCs/>
-          <w:sz w:val="21"/>
-        </w:rPr>
-        <w:t xml:space="preserve">工位归位</w:t>
-      </w:r>
-      <w:r>
-        <w:rPr>
-          <w:rFonts w:hint="eastAsia" w:ascii="宋体" w:hAnsi="宋体" w:eastAsia="宋体"/>
-          <w:sz w:val="21"/>
-        </w:rPr>
-        <w:t xml:space="preserve">：键盘推入键盘槽，鼠标摆正，椅子推入课桌。</w:t>
+          <w:sz w:val="20"/>
+        </w:rPr>
+        <w:t>工位归位</w:t>
+      </w:r>
+      <w:r>
+        <w:rPr>
+          <w:rFonts w:ascii="宋体" w:hAnsi="宋体" w:hint="eastAsia"/>
+          <w:sz w:val="20"/>
+        </w:rPr>
+        <w:t>：键盘推入键盘槽，鼠标摆正，椅子推入课桌。</w:t>
       </w:r>
     </w:p>
     <w:p>
       <w:pPr>
         <w:pStyle w:val="Compact"/>
-        <w:spacing w:before="160" w:after="120" w:line="312" w:lineRule="auto"/>
-        <w:ind w:left="0" w:firstLine="0"/>
-      </w:pPr>
-      <w:r>
-        <w:rPr>
-          <w:rFonts w:hint="eastAsia" w:ascii="宋体" w:hAnsi="宋体" w:eastAsia="宋体"/>
+        <w:spacing w:before="120"/>
+      </w:pPr>
+      <w:r>
+        <w:rPr>
+          <w:rFonts w:ascii="宋体" w:hAnsi="宋体" w:hint="eastAsia"/>
           <w:b/>
           <w:bCs/>
-          <w:sz w:val="21"/>
-        </w:rPr>
-        <w:t xml:space="preserve">今日我的自评</w:t>
-      </w:r>
-      <w:r>
-        <w:rPr>
-          <w:rFonts w:hint="eastAsia" w:ascii="宋体" w:hAnsi="宋体" w:eastAsia="宋体"/>
-          <w:sz w:val="21"/>
+          <w:sz w:val="20"/>
+        </w:rPr>
+        <w:t>今日我的自评</w:t>
+      </w:r>
+      <w:r>
+        <w:rPr>
+          <w:rFonts w:ascii="宋体" w:hAnsi="宋体" w:hint="eastAsia"/>
+          <w:sz w:val="20"/>
         </w:rPr>
         <w:t>：□</w:t>
       </w:r>
       <w:r>
         <w:rPr>
-          <w:rFonts w:ascii="宋体" w:hAnsi="宋体" w:eastAsia="宋体"/>
-          <w:sz w:val="21"/>
+          <w:rFonts w:ascii="宋体" w:hAnsi="宋体"/>
+          <w:sz w:val="20"/>
         </w:rPr>
         <w:t xml:space="preserve"> ⭐ </w:t>
       </w:r>
       <w:r>
         <w:rPr>
-          <w:rFonts w:hint="eastAsia" w:ascii="宋体" w:hAnsi="宋体" w:eastAsia="宋体"/>
-          <w:sz w:val="21"/>
-        </w:rPr>
-        <w:t xml:space="preserve">基础通关</w:t>
-      </w:r>
-      <w:r>
-        <w:rPr>
-          <w:rFonts w:ascii="宋体" w:hAnsi="宋体" w:eastAsia="宋体"/>
-          <w:sz w:val="21"/>
+          <w:rFonts w:ascii="宋体" w:hAnsi="宋体" w:hint="eastAsia"/>
+          <w:sz w:val="20"/>
+        </w:rPr>
+        <w:t>基础通关</w:t>
+      </w:r>
+      <w:r>
+        <w:rPr>
+          <w:rFonts w:ascii="宋体" w:hAnsi="宋体"/>
+          <w:sz w:val="20"/>
         </w:rPr>
         <w:t xml:space="preserve">    □ ⭐⭐ </w:t>
       </w:r>
       <w:r>
         <w:rPr>
-          <w:rFonts w:hint="eastAsia" w:ascii="宋体" w:hAnsi="宋体" w:eastAsia="宋体"/>
-          <w:sz w:val="21"/>
-        </w:rPr>
-        <w:t xml:space="preserve">熟练标兵</w:t>
-      </w:r>
-      <w:r>
-        <w:rPr>
-          <w:rFonts w:ascii="宋体" w:hAnsi="宋体" w:eastAsia="宋体"/>
-          <w:sz w:val="21"/>
+          <w:rFonts w:ascii="宋体" w:hAnsi="宋体" w:hint="eastAsia"/>
+          <w:sz w:val="20"/>
+        </w:rPr>
+        <w:t>熟练标兵</w:t>
+      </w:r>
+      <w:r>
+        <w:rPr>
+          <w:rFonts w:ascii="宋体" w:hAnsi="宋体"/>
+          <w:sz w:val="20"/>
         </w:rPr>
         <w:t xml:space="preserve">    □ ⭐⭐⭐ </w:t>
       </w:r>
       <w:r>
         <w:rPr>
-          <w:rFonts w:hint="eastAsia" w:ascii="宋体" w:hAnsi="宋体" w:eastAsia="宋体"/>
-          <w:sz w:val="21"/>
-        </w:rPr>
-        <w:t xml:space="preserve">探索小达人</w:t>
-      </w:r>
+          <w:rFonts w:ascii="宋体" w:hAnsi="宋体" w:hint="eastAsia"/>
+          <w:sz w:val="20"/>
+        </w:rPr>
+        <w:t>探索小达人</w:t>
+      </w:r>
+      <w:bookmarkEnd w:id="0"/>
+      <w:bookmarkEnd w:id="4"/>
     </w:p>
-    <w:bookmarkEnd w:id="12"/>
-    <w:bookmarkEnd w:id="13"/>
     <w:sectPr>
       <w:footnotePr>
         <w:numRestart w:val="eachSect"/>
       </w:footnotePr>
-      <w:pgSz w:h="16834" w:w="11909"/>
-      <w:pgMar w:bottom="1138" w:footer="720" w:gutter="0" w:header="720" w:left="1138" w:right="1138" w:top="1138"/>
+      <w:pgSz w:w="11909" w:h="16834"/>
+      <w:pgMar w:top="792" w:right="965" w:bottom="792" w:left="965" w:header="720" w:footer="720" w:gutter="0"/>
       <w:cols w:space="720"/>
     </w:sectPr>
   </w:body>
 </w:document>
 </file>
 
-<file path=word/comments.xml><?xml version="1.0" encoding="utf-8"?>
-<w:comments xmlns:w="http://schemas.openxmlformats.org/wordprocessingml/2006/main" xmlns:m="http://schemas.openxmlformats.org/officeDocument/2006/math" xmlns:r="http://schemas.openxmlformats.org/officeDocument/2006/relationships" xmlns:o="urn:schemas-microsoft-com:office:office" xmlns:v="urn:schemas-microsoft-com:vml" xmlns:w10="urn:schemas-microsoft-com:office:word" xmlns:a="http://schemas.openxmlformats.org/drawingml/2006/main" xmlns:pic="http://schemas.openxmlformats.org/drawingml/2006/picture" xmlns:wp="http://schemas.openxmlformats.org/drawingml/2006/wordprocessingDrawing"/>
+<file path=word/endnotes.xml><?xml version="1.0" encoding="utf-8"?>
+<w:endnotes xmlns:wpc="http://schemas.microsoft.com/office/word/2010/wordprocessingCanvas" xmlns:cx="http://schemas.microsoft.com/office/drawing/2014/chartex" xmlns:cx1="http://schemas.microsoft.com/office/drawing/2015/9/8/chartex" xmlns:cx2="http://schemas.microsoft.com/office/drawing/2015/10/21/chartex" xmlns:cx3="http://schemas.microsoft.com/office/drawing/2016/5/9/chartex" xmlns:cx4="http://schemas.microsoft.com/office/drawing/2016/5/10/chartex" xmlns:cx5="http://schemas.microsoft.com/office/drawing/2016/5/11/chartex" xmlns:cx6="http://schemas.microsoft.com/office/drawing/2016/5/12/chartex" xmlns:cx7="http://schemas.microsoft.com/office/drawing/2016/5/13/chartex" xmlns:cx8="http://schemas.microsoft.com/office/drawing/2016/5/14/chartex" xmlns:mc="http://schemas.openxmlformats.org/markup-compatibility/2006" xmlns:aink="http://schemas.microsoft.com/office/drawing/2016/ink" xmlns:am3d="http://schemas.microsoft.com/office/drawing/2017/model3d" xmlns:o="urn:schemas-microsoft-com:office:office" xmlns:oel="http://schemas.microsoft.com/office/2019/extlst" xmlns:r="http://schemas.openxmlformats.org/officeDocument/2006/relationships" xmlns:m="http://schemas.openxmlformats.org/officeDocument/2006/math" xmlns:v="urn:schemas-microsoft-com:vml" xmlns:wp14="http://schemas.microsoft.com/office/word/2010/wordprocessingDrawing" xmlns:wp="http://schemas.openxmlformats.org/drawingml/2006/wordprocessingDrawing" xmlns:w10="urn:schemas-microsoft-com:office:word" xmlns:w="http://schemas.openxmlformats.org/wordprocessingml/2006/main" xmlns:w14="http://schemas.microsoft.com/office/word/2010/wordml" xmlns:w15="http://schemas.microsoft.com/office/word/2012/wordml" xmlns:w16cex="http://schemas.microsoft.com/office/word/2018/wordml/cex" xmlns:w16cid="http://schemas.microsoft.com/office/word/2016/wordml/cid" xmlns:w16="http://schemas.microsoft.com/office/word/2018/wordml" xmlns:w16du="http://schemas.microsoft.com/office/word/2023/wordml/word16du" xmlns:w16sdtdh="http://schemas.microsoft.com/office/word/2020/wordml/sdtdatahash" xmlns:w16sdtfl="http://schemas.microsoft.com/office/word/2024/wordml/sdtformatlock" xmlns:w16se="http://schemas.microsoft.com/office/word/2015/wordml/symex" xmlns:wpg="http://schemas.microsoft.com/office/word/2010/wordprocessingGroup" xmlns:wpi="http://schemas.microsoft.com/office/word/2010/wordprocessingInk" xmlns:wne="http://schemas.microsoft.com/office/word/2006/wordml" xmlns:wps="http://schemas.microsoft.com/office/word/2010/wordprocessingShape" mc:Ignorable="w14 w15 w16se w16cid w16 w16cex w16sdtdh w16sdtfl w16du wp14">
+  <w:endnote w:type="separator" w:id="-1">
+    <w:p>
+      <w:pPr>
+        <w:spacing w:after="0" w:line="240" w:lineRule="auto"/>
+      </w:pPr>
+      <w:r>
+        <w:separator/>
+      </w:r>
+    </w:p>
+  </w:endnote>
+  <w:endnote w:type="continuationSeparator" w:id="0">
+    <w:p>
+      <w:pPr>
+        <w:spacing w:after="0" w:line="240" w:lineRule="auto"/>
+      </w:pPr>
+      <w:r>
+        <w:continuationSeparator/>
+      </w:r>
+    </w:p>
+  </w:endnote>
+</w:endnotes>
 </file>
 
 <file path=word/footnotes.xml><?xml version="1.0" encoding="utf-8"?>
-<w:footnotes xmlns:w="http://schemas.openxmlformats.org/wordprocessingml/2006/main" xmlns:m="http://schemas.openxmlformats.org/officeDocument/2006/math" xmlns:r="http://schemas.openxmlformats.org/officeDocument/2006/relationships" xmlns:o="urn:schemas-microsoft-com:office:office" xmlns:v="urn:schemas-microsoft-com:vml" xmlns:w10="urn:schemas-microsoft-com:office:word" xmlns:a="http://schemas.openxmlformats.org/drawingml/2006/main" xmlns:pic="http://schemas.openxmlformats.org/drawingml/2006/picture" xmlns:wp="http://schemas.openxmlformats.org/drawingml/2006/wordprocessingDrawing">
+<w:footnotes xmlns:wpc="http://schemas.microsoft.com/office/word/2010/wordprocessingCanvas" xmlns:cx="http://schemas.microsoft.com/office/drawing/2014/chartex" xmlns:cx1="http://schemas.microsoft.com/office/drawing/2015/9/8/chartex" xmlns:cx2="http://schemas.microsoft.com/office/drawing/2015/10/21/chartex" xmlns:cx3="http://schemas.microsoft.com/office/drawing/2016/5/9/chartex" xmlns:cx4="http://schemas.microsoft.com/office/drawing/2016/5/10/chartex" xmlns:cx5="http://schemas.microsoft.com/office/drawing/2016/5/11/chartex" xmlns:cx6="http://schemas.microsoft.com/office/drawing/2016/5/12/chartex" xmlns:cx7="http://schemas.microsoft.com/office/drawing/2016/5/13/chartex" xmlns:cx8="http://schemas.microsoft.com/office/drawing/2016/5/14/chartex" xmlns:mc="http://schemas.openxmlformats.org/markup-compatibility/2006" xmlns:aink="http://schemas.microsoft.com/office/drawing/2016/ink" xmlns:am3d="http://schemas.microsoft.com/office/drawing/2017/model3d" xmlns:o="urn:schemas-microsoft-com:office:office" xmlns:oel="http://schemas.microsoft.com/office/2019/extlst" xmlns:r="http://schemas.openxmlformats.org/officeDocument/2006/relationships" xmlns:m="http://schemas.openxmlformats.org/officeDocument/2006/math" xmlns:v="urn:schemas-microsoft-com:vml" xmlns:wp14="http://schemas.microsoft.com/office/word/2010/wordprocessingDrawing" xmlns:wp="http://schemas.openxmlformats.org/drawingml/2006/wordprocessingDrawing" xmlns:w10="urn:schemas-microsoft-com:office:word" xmlns:w="http://schemas.openxmlformats.org/wordprocessingml/2006/main" xmlns:w14="http://schemas.microsoft.com/office/word/2010/wordml" xmlns:w15="http://schemas.microsoft.com/office/word/2012/wordml" xmlns:w16cex="http://schemas.microsoft.com/office/word/2018/wordml/cex" xmlns:w16cid="http://schemas.microsoft.com/office/word/2016/wordml/cid" xmlns:w16="http://schemas.microsoft.com/office/word/2018/wordml" xmlns:w16du="http://schemas.microsoft.com/office/word/2023/wordml/word16du" xmlns:w16sdtdh="http://schemas.microsoft.com/office/word/2020/wordml/sdtdatahash" xmlns:w16sdtfl="http://schemas.microsoft.com/office/word/2024/wordml/sdtformatlock" xmlns:w16se="http://schemas.microsoft.com/office/word/2015/wordml/symex" xmlns:wpg="http://schemas.microsoft.com/office/word/2010/wordprocessingGroup" xmlns:wpi="http://schemas.microsoft.com/office/word/2010/wordprocessingInk" xmlns:wne="http://schemas.microsoft.com/office/word/2006/wordml" xmlns:wps="http://schemas.microsoft.com/office/word/2010/wordprocessingShape" mc:Ignorable="w14 w15 w16se w16cid w16 w16cex w16sdtdh w16sdtfl w16du wp14">
+  <w:footnote w:type="separator" w:id="-1">
+    <w:p>
+      <w:pPr>
+        <w:spacing w:after="0" w:line="240" w:lineRule="auto"/>
+      </w:pPr>
+      <w:r>
+        <w:separator/>
+      </w:r>
+    </w:p>
+  </w:footnote>
   <w:footnote w:type="continuationSeparator" w:id="0">
     <w:p>
+      <w:pPr>
+        <w:spacing w:after="0" w:line="240" w:lineRule="auto"/>
+      </w:pPr>
       <w:r>
         <w:continuationSeparator/>
-      </w:r>
-    </w:p>
-  </w:footnote>
-  <w:footnote w:type="separator" w:id="-1">
-    <w:p>
-      <w:r>
-        <w:separator/>
       </w:r>
     </w:p>
   </w:footnote>
@@ -1430,8 +1376,352 @@
 </file>
 
 <file path=word/numbering.xml><?xml version="1.0" encoding="utf-8"?>
-<w:numbering xmlns:aink="http://schemas.microsoft.com/office/drawing/2016/ink" xmlns:am3d="http://schemas.microsoft.com/office/drawing/2017/model3d" xmlns:cx="http://schemas.microsoft.com/office/drawing/2014/chartex" xmlns:cx1="http://schemas.microsoft.com/office/drawing/2015/9/8/chartex" xmlns:cx2="http://schemas.microsoft.com/office/drawing/2015/10/21/chartex" xmlns:cx3="http://schemas.microsoft.com/office/drawing/2016/5/9/chartex" xmlns:cx4="http://schemas.microsoft.com/office/drawing/2016/5/10/chartex" xmlns:cx5="http://schemas.microsoft.com/office/drawing/2016/5/11/chartex" xmlns:cx6="http://schemas.microsoft.com/office/drawing/2016/5/12/chartex" xmlns:cx7="http://schemas.microsoft.com/office/drawing/2016/5/13/chartex" xmlns:cx8="http://schemas.microsoft.com/office/drawing/2016/5/14/chartex" xmlns:m="http://schemas.openxmlformats.org/officeDocument/2006/math" xmlns:mc="http://schemas.openxmlformats.org/markup-compatibility/2006" xmlns:o="urn:schemas-microsoft-com:office:office" xmlns:oel="http://schemas.microsoft.com/office/2019/extlst" xmlns:r="http://schemas.openxmlformats.org/officeDocument/2006/relationships" xmlns:v="urn:schemas-microsoft-com:vml" xmlns:w="http://schemas.openxmlformats.org/wordprocessingml/2006/main" xmlns:w10="urn:schemas-microsoft-com:office:word" xmlns:w14="http://schemas.microsoft.com/office/word/2010/wordml" xmlns:w15="http://schemas.microsoft.com/office/word/2012/wordml" xmlns:w16="http://schemas.microsoft.com/office/word/2018/wordml" xmlns:w16cex="http://schemas.microsoft.com/office/word/2018/wordml/cex" xmlns:w16cid="http://schemas.microsoft.com/office/word/2016/wordml/cid" xmlns:w16du="http://schemas.microsoft.com/office/word/2023/wordml/word16du" xmlns:w16sdtdh="http://schemas.microsoft.com/office/word/2020/wordml/sdtdatahash" xmlns:w16sdtfl="http://schemas.microsoft.com/office/word/2024/wordml/sdtformatlock" xmlns:w16se="http://schemas.microsoft.com/office/word/2015/wordml/symex" xmlns:wne="http://schemas.microsoft.com/office/word/2006/wordml" xmlns:wp="http://schemas.openxmlformats.org/drawingml/2006/wordprocessingDrawing" xmlns:wp14="http://schemas.microsoft.com/office/word/2010/wordprocessingDrawing" xmlns:wpc="http://schemas.microsoft.com/office/word/2010/wordprocessingCanvas" xmlns:wpg="http://schemas.microsoft.com/office/word/2010/wordprocessingGroup" xmlns:wpi="http://schemas.microsoft.com/office/word/2010/wordprocessingInk" xmlns:wps="http://schemas.microsoft.com/office/word/2010/wordprocessingShape" mc:Ignorable="w14 w15 w16se w16cid w16 w16cex w16sdtdh w16sdtfl w16du wp14">
-  <w:abstractNum w15:restartNumberingAfterBreak="0" w:abstractNumId="0">
+<w:numbering xmlns:wpc="http://schemas.microsoft.com/office/word/2010/wordprocessingCanvas" xmlns:cx="http://schemas.microsoft.com/office/drawing/2014/chartex" xmlns:cx1="http://schemas.microsoft.com/office/drawing/2015/9/8/chartex" xmlns:cx2="http://schemas.microsoft.com/office/drawing/2015/10/21/chartex" xmlns:cx3="http://schemas.microsoft.com/office/drawing/2016/5/9/chartex" xmlns:cx4="http://schemas.microsoft.com/office/drawing/2016/5/10/chartex" xmlns:cx5="http://schemas.microsoft.com/office/drawing/2016/5/11/chartex" xmlns:cx6="http://schemas.microsoft.com/office/drawing/2016/5/12/chartex" xmlns:cx7="http://schemas.microsoft.com/office/drawing/2016/5/13/chartex" xmlns:cx8="http://schemas.microsoft.com/office/drawing/2016/5/14/chartex" xmlns:mc="http://schemas.openxmlformats.org/markup-compatibility/2006" xmlns:aink="http://schemas.microsoft.com/office/drawing/2016/ink" xmlns:am3d="http://schemas.microsoft.com/office/drawing/2017/model3d" xmlns:o="urn:schemas-microsoft-com:office:office" xmlns:oel="http://schemas.microsoft.com/office/2019/extlst" xmlns:r="http://schemas.openxmlformats.org/officeDocument/2006/relationships" xmlns:m="http://schemas.openxmlformats.org/officeDocument/2006/math" xmlns:v="urn:schemas-microsoft-com:vml" xmlns:wp14="http://schemas.microsoft.com/office/word/2010/wordprocessingDrawing" xmlns:wp="http://schemas.openxmlformats.org/drawingml/2006/wordprocessingDrawing" xmlns:w10="urn:schemas-microsoft-com:office:word" xmlns:w="http://schemas.openxmlformats.org/wordprocessingml/2006/main" xmlns:w14="http://schemas.microsoft.com/office/word/2010/wordml" xmlns:w15="http://schemas.microsoft.com/office/word/2012/wordml" xmlns:w16cex="http://schemas.microsoft.com/office/word/2018/wordml/cex" xmlns:w16cid="http://schemas.microsoft.com/office/word/2016/wordml/cid" xmlns:w16="http://schemas.microsoft.com/office/word/2018/wordml" xmlns:w16du="http://schemas.microsoft.com/office/word/2023/wordml/word16du" xmlns:w16sdtdh="http://schemas.microsoft.com/office/word/2020/wordml/sdtdatahash" xmlns:w16sdtfl="http://schemas.microsoft.com/office/word/2024/wordml/sdtformatlock" xmlns:w16se="http://schemas.microsoft.com/office/word/2015/wordml/symex" xmlns:wpg="http://schemas.microsoft.com/office/word/2010/wordprocessingGroup" xmlns:wpi="http://schemas.microsoft.com/office/word/2010/wordprocessingInk" xmlns:wne="http://schemas.microsoft.com/office/word/2006/wordml" xmlns:wps="http://schemas.microsoft.com/office/word/2010/wordprocessingShape" mc:Ignorable="w14 w15 w16se w16cid w16 w16cex w16sdtdh w16sdtfl w16du wp14">
+  <w:abstractNum w:abstractNumId="0" w15:restartNumberingAfterBreak="0">
+    <w:nsid w:val="0000A990"/>
+    <w:multiLevelType w:val="multilevel"/>
+    <w:tmpl w:val="D242C33A"/>
+    <w:lvl w:ilvl="0">
+      <w:numFmt w:val="bullet"/>
+      <w:lvlText w:val=" "/>
+      <w:lvlJc w:val="left"/>
+      <w:pPr>
+        <w:ind w:left="720" w:hanging="360"/>
+      </w:pPr>
+    </w:lvl>
+    <w:lvl w:ilvl="1">
+      <w:numFmt w:val="bullet"/>
+      <w:lvlText w:val=" "/>
+      <w:lvlJc w:val="left"/>
+      <w:pPr>
+        <w:ind w:left="1440" w:hanging="360"/>
+      </w:pPr>
+    </w:lvl>
+    <w:lvl w:ilvl="2">
+      <w:numFmt w:val="bullet"/>
+      <w:lvlText w:val=" "/>
+      <w:lvlJc w:val="left"/>
+      <w:pPr>
+        <w:ind w:left="2160" w:hanging="360"/>
+      </w:pPr>
+    </w:lvl>
+    <w:lvl w:ilvl="3">
+      <w:numFmt w:val="bullet"/>
+      <w:lvlText w:val=" "/>
+      <w:lvlJc w:val="left"/>
+      <w:pPr>
+        <w:ind w:left="2880" w:hanging="360"/>
+      </w:pPr>
+    </w:lvl>
+    <w:lvl w:ilvl="4">
+      <w:numFmt w:val="bullet"/>
+      <w:lvlText w:val=" "/>
+      <w:lvlJc w:val="left"/>
+      <w:pPr>
+        <w:ind w:left="3600" w:hanging="360"/>
+      </w:pPr>
+    </w:lvl>
+    <w:lvl w:ilvl="5">
+      <w:numFmt w:val="bullet"/>
+      <w:lvlText w:val=" "/>
+      <w:lvlJc w:val="left"/>
+      <w:pPr>
+        <w:ind w:left="4320" w:hanging="360"/>
+      </w:pPr>
+    </w:lvl>
+    <w:lvl w:ilvl="6">
+      <w:numFmt w:val="bullet"/>
+      <w:lvlText w:val=" "/>
+      <w:lvlJc w:val="left"/>
+      <w:pPr>
+        <w:ind w:left="5040" w:hanging="360"/>
+      </w:pPr>
+    </w:lvl>
+    <w:lvl w:ilvl="7">
+      <w:numFmt w:val="bullet"/>
+      <w:lvlText w:val=" "/>
+      <w:lvlJc w:val="left"/>
+      <w:pPr>
+        <w:ind w:left="5760" w:hanging="360"/>
+      </w:pPr>
+    </w:lvl>
+    <w:lvl w:ilvl="8">
+      <w:numFmt w:val="bullet"/>
+      <w:lvlText w:val=" "/>
+      <w:lvlJc w:val="left"/>
+      <w:pPr>
+        <w:ind w:left="6480" w:hanging="360"/>
+      </w:pPr>
+    </w:lvl>
+  </w:abstractNum>
+  <w:abstractNum w:abstractNumId="1" w15:restartNumberingAfterBreak="0">
+    <w:nsid w:val="0000A991"/>
+    <w:multiLevelType w:val="multilevel"/>
+    <w:tmpl w:val="995AB652"/>
+    <w:lvl w:ilvl="0">
+      <w:numFmt w:val="bullet"/>
+      <w:lvlText w:val=""/>
+      <w:lvlJc w:val="left"/>
+      <w:pPr>
+        <w:ind w:left="720" w:hanging="360"/>
+      </w:pPr>
+      <w:rPr>
+        <w:rFonts w:ascii="Symbol" w:hAnsi="Symbol" w:cs="Symbol" w:hint="default"/>
+      </w:rPr>
+    </w:lvl>
+    <w:lvl w:ilvl="1">
+      <w:numFmt w:val="bullet"/>
+      <w:lvlText w:val="o"/>
+      <w:lvlJc w:val="left"/>
+      <w:pPr>
+        <w:ind w:left="1440" w:hanging="360"/>
+      </w:pPr>
+      <w:rPr>
+        <w:rFonts w:ascii="Courier New" w:hAnsi="Courier New" w:cs="Courier New" w:hint="default"/>
+      </w:rPr>
+    </w:lvl>
+    <w:lvl w:ilvl="2">
+      <w:numFmt w:val="bullet"/>
+      <w:lvlText w:val=""/>
+      <w:lvlJc w:val="left"/>
+      <w:pPr>
+        <w:ind w:left="2160" w:hanging="360"/>
+      </w:pPr>
+      <w:rPr>
+        <w:rFonts w:ascii="Wingdings" w:hAnsi="Wingdings" w:cs="Wingdings" w:hint="default"/>
+      </w:rPr>
+    </w:lvl>
+    <w:lvl w:ilvl="3">
+      <w:numFmt w:val="bullet"/>
+      <w:lvlText w:val=""/>
+      <w:lvlJc w:val="left"/>
+      <w:pPr>
+        <w:ind w:left="2880" w:hanging="360"/>
+      </w:pPr>
+      <w:rPr>
+        <w:rFonts w:ascii="Symbol" w:hAnsi="Symbol" w:cs="Symbol" w:hint="default"/>
+      </w:rPr>
+    </w:lvl>
+    <w:lvl w:ilvl="4">
+      <w:numFmt w:val="bullet"/>
+      <w:lvlText w:val="o"/>
+      <w:lvlJc w:val="left"/>
+      <w:pPr>
+        <w:ind w:left="3600" w:hanging="360"/>
+      </w:pPr>
+      <w:rPr>
+        <w:rFonts w:ascii="Courier New" w:hAnsi="Courier New" w:cs="Courier New" w:hint="default"/>
+      </w:rPr>
+    </w:lvl>
+    <w:lvl w:ilvl="5">
+      <w:numFmt w:val="bullet"/>
+      <w:lvlText w:val=""/>
+      <w:lvlJc w:val="left"/>
+      <w:pPr>
+        <w:ind w:left="4320" w:hanging="360"/>
+      </w:pPr>
+      <w:rPr>
+        <w:rFonts w:ascii="Wingdings" w:hAnsi="Wingdings" w:cs="Wingdings" w:hint="default"/>
+      </w:rPr>
+    </w:lvl>
+    <w:lvl w:ilvl="6">
+      <w:numFmt w:val="bullet"/>
+      <w:lvlText w:val=""/>
+      <w:lvlJc w:val="left"/>
+      <w:pPr>
+        <w:ind w:left="5040" w:hanging="360"/>
+      </w:pPr>
+      <w:rPr>
+        <w:rFonts w:ascii="Symbol" w:hAnsi="Symbol" w:cs="Symbol" w:hint="default"/>
+      </w:rPr>
+    </w:lvl>
+    <w:lvl w:ilvl="7">
+      <w:numFmt w:val="bullet"/>
+      <w:lvlText w:val="o"/>
+      <w:lvlJc w:val="left"/>
+      <w:pPr>
+        <w:ind w:left="5760" w:hanging="360"/>
+      </w:pPr>
+      <w:rPr>
+        <w:rFonts w:ascii="Courier New" w:hAnsi="Courier New" w:cs="Courier New" w:hint="default"/>
+      </w:rPr>
+    </w:lvl>
+    <w:lvl w:ilvl="8">
+      <w:numFmt w:val="bullet"/>
+      <w:lvlText w:val=""/>
+      <w:lvlJc w:val="left"/>
+      <w:pPr>
+        <w:ind w:left="6480" w:hanging="360"/>
+      </w:pPr>
+      <w:rPr>
+        <w:rFonts w:ascii="Wingdings" w:hAnsi="Wingdings" w:cs="Wingdings" w:hint="default"/>
+      </w:rPr>
+    </w:lvl>
+  </w:abstractNum>
+  <w:abstractNum w:abstractNumId="2" w15:restartNumberingAfterBreak="0">
+    <w:nsid w:val="0000A992"/>
+    <w:multiLevelType w:val="multilevel"/>
+    <w:tmpl w:val="A2B20CF2"/>
+    <w:lvl w:ilvl="0">
+      <w:numFmt w:val="bullet"/>
+      <w:lvlText w:val="☐"/>
+      <w:lvlJc w:val="left"/>
+      <w:pPr>
+        <w:ind w:left="720" w:hanging="360"/>
+      </w:pPr>
+    </w:lvl>
+    <w:lvl w:ilvl="1">
+      <w:numFmt w:val="bullet"/>
+      <w:lvlText w:val="☐"/>
+      <w:lvlJc w:val="left"/>
+      <w:pPr>
+        <w:ind w:left="1440" w:hanging="360"/>
+      </w:pPr>
+    </w:lvl>
+    <w:lvl w:ilvl="2">
+      <w:numFmt w:val="bullet"/>
+      <w:lvlText w:val="☐"/>
+      <w:lvlJc w:val="left"/>
+      <w:pPr>
+        <w:ind w:left="2160" w:hanging="360"/>
+      </w:pPr>
+    </w:lvl>
+    <w:lvl w:ilvl="3">
+      <w:numFmt w:val="bullet"/>
+      <w:lvlText w:val="☐"/>
+      <w:lvlJc w:val="left"/>
+      <w:pPr>
+        <w:ind w:left="2880" w:hanging="360"/>
+      </w:pPr>
+    </w:lvl>
+    <w:lvl w:ilvl="4">
+      <w:numFmt w:val="bullet"/>
+      <w:lvlText w:val="☐"/>
+      <w:lvlJc w:val="left"/>
+      <w:pPr>
+        <w:ind w:left="3600" w:hanging="360"/>
+      </w:pPr>
+    </w:lvl>
+    <w:lvl w:ilvl="5">
+      <w:numFmt w:val="bullet"/>
+      <w:lvlText w:val="☐"/>
+      <w:lvlJc w:val="left"/>
+      <w:pPr>
+        <w:ind w:left="4320" w:hanging="360"/>
+      </w:pPr>
+    </w:lvl>
+    <w:lvl w:ilvl="6">
+      <w:numFmt w:val="bullet"/>
+      <w:lvlText w:val="☐"/>
+      <w:lvlJc w:val="left"/>
+      <w:pPr>
+        <w:ind w:left="5040" w:hanging="360"/>
+      </w:pPr>
+    </w:lvl>
+    <w:lvl w:ilvl="7">
+      <w:numFmt w:val="bullet"/>
+      <w:lvlText w:val="☐"/>
+      <w:lvlJc w:val="left"/>
+      <w:pPr>
+        <w:ind w:left="5760" w:hanging="360"/>
+      </w:pPr>
+    </w:lvl>
+    <w:lvl w:ilvl="8">
+      <w:numFmt w:val="bullet"/>
+      <w:lvlText w:val="☐"/>
+      <w:lvlJc w:val="left"/>
+      <w:pPr>
+        <w:ind w:left="6480" w:hanging="360"/>
+      </w:pPr>
+    </w:lvl>
+  </w:abstractNum>
+  <w:abstractNum w:abstractNumId="3" w15:restartNumberingAfterBreak="0">
+    <w:nsid w:val="00A99411"/>
+    <w:multiLevelType w:val="multilevel"/>
+    <w:tmpl w:val="3F9800DE"/>
+    <w:lvl w:ilvl="0">
+      <w:start w:val="1"/>
+      <w:numFmt w:val="decimal"/>
+      <w:lvlText w:val="%1."/>
+      <w:lvlJc w:val="left"/>
+      <w:pPr>
+        <w:ind w:left="720" w:hanging="360"/>
+      </w:pPr>
+    </w:lvl>
+    <w:lvl w:ilvl="1">
+      <w:start w:val="1"/>
+      <w:numFmt w:val="decimal"/>
+      <w:lvlText w:val="%2."/>
+      <w:lvlJc w:val="left"/>
+      <w:pPr>
+        <w:ind w:left="1440" w:hanging="360"/>
+      </w:pPr>
+    </w:lvl>
+    <w:lvl w:ilvl="2">
+      <w:start w:val="1"/>
+      <w:numFmt w:val="decimal"/>
+      <w:lvlText w:val="%3."/>
+      <w:lvlJc w:val="left"/>
+      <w:pPr>
+        <w:ind w:left="2160" w:hanging="360"/>
+      </w:pPr>
+    </w:lvl>
+    <w:lvl w:ilvl="3">
+      <w:start w:val="1"/>
+      <w:numFmt w:val="decimal"/>
+      <w:lvlText w:val="%4."/>
+      <w:lvlJc w:val="left"/>
+      <w:pPr>
+        <w:ind w:left="2880" w:hanging="360"/>
+      </w:pPr>
+    </w:lvl>
+    <w:lvl w:ilvl="4">
+      <w:start w:val="1"/>
+      <w:numFmt w:val="decimal"/>
+      <w:lvlText w:val="%5."/>
+      <w:lvlJc w:val="left"/>
+      <w:pPr>
+        <w:ind w:left="3600" w:hanging="360"/>
+      </w:pPr>
+    </w:lvl>
+    <w:lvl w:ilvl="5">
+      <w:start w:val="1"/>
+      <w:numFmt w:val="decimal"/>
+      <w:lvlText w:val="%6."/>
+      <w:lvlJc w:val="left"/>
+      <w:pPr>
+        <w:ind w:left="4320" w:hanging="360"/>
+      </w:pPr>
+    </w:lvl>
+    <w:lvl w:ilvl="6">
+      <w:start w:val="1"/>
+      <w:numFmt w:val="decimal"/>
+      <w:lvlText w:val="%7."/>
+      <w:lvlJc w:val="left"/>
+      <w:pPr>
+        <w:ind w:left="5040" w:hanging="360"/>
+      </w:pPr>
+    </w:lvl>
+    <w:lvl w:ilvl="7">
+      <w:start w:val="1"/>
+      <w:numFmt w:val="decimal"/>
+      <w:lvlText w:val="%8."/>
+      <w:lvlJc w:val="left"/>
+      <w:pPr>
+        <w:ind w:left="5760" w:hanging="360"/>
+      </w:pPr>
+    </w:lvl>
+    <w:lvl w:ilvl="8">
+      <w:start w:val="1"/>
+      <w:numFmt w:val="decimal"/>
+      <w:lvlText w:val="%9."/>
+      <w:lvlJc w:val="left"/>
+      <w:pPr>
+        <w:ind w:left="6480" w:hanging="360"/>
+      </w:pPr>
+    </w:lvl>
+  </w:abstractNum>
+  <w:abstractNum w:abstractNumId="4" w15:restartNumberingAfterBreak="0">
     <w:nsid w:val="170CD2DE"/>
     <w:multiLevelType w:val="multilevel"/>
     <w:tmpl w:val="F4A29296"/>
@@ -1441,9 +1731,9 @@
       <w:lvlJc w:val="left"/>
       <w:pPr>
         <w:tabs>
-          <w:tab w:pos="0" w:val="num"/>
+          <w:tab w:val="num" w:pos="0"/>
         </w:tabs>
-        <w:ind w:hanging="480" w:left="480"/>
+        <w:ind w:left="480" w:hanging="480"/>
       </w:pPr>
     </w:lvl>
     <w:lvl w:ilvl="1">
@@ -1452,9 +1742,9 @@
       <w:lvlJc w:val="left"/>
       <w:pPr>
         <w:tabs>
-          <w:tab w:pos="720" w:val="num"/>
+          <w:tab w:val="num" w:pos="720"/>
         </w:tabs>
-        <w:ind w:hanging="480" w:left="1200"/>
+        <w:ind w:left="1200" w:hanging="480"/>
       </w:pPr>
     </w:lvl>
     <w:lvl w:ilvl="2">
@@ -1463,9 +1753,9 @@
       <w:lvlJc w:val="left"/>
       <w:pPr>
         <w:tabs>
-          <w:tab w:pos="1440" w:val="num"/>
+          <w:tab w:val="num" w:pos="1440"/>
         </w:tabs>
-        <w:ind w:hanging="480" w:left="1920"/>
+        <w:ind w:left="1920" w:hanging="480"/>
       </w:pPr>
     </w:lvl>
     <w:lvl w:ilvl="3">
@@ -1474,9 +1764,9 @@
       <w:lvlJc w:val="left"/>
       <w:pPr>
         <w:tabs>
-          <w:tab w:pos="2160" w:val="num"/>
+          <w:tab w:val="num" w:pos="2160"/>
         </w:tabs>
-        <w:ind w:hanging="480" w:left="2640"/>
+        <w:ind w:left="2640" w:hanging="480"/>
       </w:pPr>
     </w:lvl>
     <w:lvl w:ilvl="4">
@@ -1485,9 +1775,9 @@
       <w:lvlJc w:val="left"/>
       <w:pPr>
         <w:tabs>
-          <w:tab w:pos="2880" w:val="num"/>
+          <w:tab w:val="num" w:pos="2880"/>
         </w:tabs>
-        <w:ind w:hanging="480" w:left="3360"/>
+        <w:ind w:left="3360" w:hanging="480"/>
       </w:pPr>
     </w:lvl>
     <w:lvl w:ilvl="5">
@@ -1496,9 +1786,9 @@
       <w:lvlJc w:val="left"/>
       <w:pPr>
         <w:tabs>
-          <w:tab w:pos="3600" w:val="num"/>
+          <w:tab w:val="num" w:pos="3600"/>
         </w:tabs>
-        <w:ind w:hanging="480" w:left="4080"/>
+        <w:ind w:left="4080" w:hanging="480"/>
       </w:pPr>
     </w:lvl>
     <w:lvl w:ilvl="6">
@@ -1507,9 +1797,9 @@
       <w:lvlJc w:val="left"/>
       <w:pPr>
         <w:tabs>
-          <w:tab w:pos="4320" w:val="num"/>
+          <w:tab w:val="num" w:pos="4320"/>
         </w:tabs>
-        <w:ind w:hanging="480" w:left="4800"/>
+        <w:ind w:left="4800" w:hanging="480"/>
       </w:pPr>
     </w:lvl>
     <w:lvl w:ilvl="7">
@@ -1518,9 +1808,9 @@
       <w:lvlJc w:val="left"/>
       <w:pPr>
         <w:tabs>
-          <w:tab w:pos="5040" w:val="num"/>
+          <w:tab w:val="num" w:pos="5040"/>
         </w:tabs>
-        <w:ind w:hanging="480" w:left="5520"/>
+        <w:ind w:left="5520" w:hanging="480"/>
       </w:pPr>
     </w:lvl>
     <w:lvl w:ilvl="8">
@@ -1529,360 +1819,20 @@
       <w:lvlJc w:val="left"/>
       <w:pPr>
         <w:tabs>
-          <w:tab w:pos="5760" w:val="num"/>
+          <w:tab w:val="num" w:pos="5760"/>
         </w:tabs>
-        <w:ind w:hanging="480" w:left="6240"/>
+        <w:ind w:left="6240" w:hanging="480"/>
       </w:pPr>
     </w:lvl>
   </w:abstractNum>
-  <w:abstractNum w:abstractNumId="990">
-    <w:nsid w:val="0000A990"/>
-    <w:multiLevelType w:val="multilevel"/>
-    <w:lvl w:ilvl="0">
-      <w:numFmt w:val="bullet"/>
-      <w:lvlText w:val=" "/>
-      <w:lvlJc w:val="left"/>
-      <w:pPr>
-        <w:ind w:left="720" w:hanging="360"/>
-      </w:pPr>
-    </w:lvl>
-    <w:lvl w:ilvl="1">
-      <w:numFmt w:val="bullet"/>
-      <w:lvlText w:val=" "/>
-      <w:lvlJc w:val="left"/>
-      <w:pPr>
-        <w:ind w:left="1440" w:hanging="360"/>
-      </w:pPr>
-    </w:lvl>
-    <w:lvl w:ilvl="2">
-      <w:numFmt w:val="bullet"/>
-      <w:lvlText w:val=" "/>
-      <w:lvlJc w:val="left"/>
-      <w:pPr>
-        <w:ind w:left="2160" w:hanging="360"/>
-      </w:pPr>
-    </w:lvl>
-    <w:lvl w:ilvl="3">
-      <w:numFmt w:val="bullet"/>
-      <w:lvlText w:val=" "/>
-      <w:lvlJc w:val="left"/>
-      <w:pPr>
-        <w:ind w:left="2880" w:hanging="360"/>
-      </w:pPr>
-    </w:lvl>
-    <w:lvl w:ilvl="4">
-      <w:numFmt w:val="bullet"/>
-      <w:lvlText w:val=" "/>
-      <w:lvlJc w:val="left"/>
-      <w:pPr>
-        <w:ind w:left="3600" w:hanging="360"/>
-      </w:pPr>
-    </w:lvl>
-    <w:lvl w:ilvl="5">
-      <w:numFmt w:val="bullet"/>
-      <w:lvlText w:val=" "/>
-      <w:lvlJc w:val="left"/>
-      <w:pPr>
-        <w:ind w:left="4320" w:hanging="360"/>
-      </w:pPr>
-    </w:lvl>
-    <w:lvl w:ilvl="6">
-      <w:numFmt w:val="bullet"/>
-      <w:lvlText w:val=" "/>
-      <w:lvlJc w:val="left"/>
-      <w:pPr>
-        <w:ind w:left="5040" w:hanging="360"/>
-      </w:pPr>
-    </w:lvl>
-    <w:lvl w:ilvl="7">
-      <w:numFmt w:val="bullet"/>
-      <w:lvlText w:val=" "/>
-      <w:lvlJc w:val="left"/>
-      <w:pPr>
-        <w:ind w:left="5760" w:hanging="360"/>
-      </w:pPr>
-    </w:lvl>
-    <w:lvl w:ilvl="8">
-      <w:numFmt w:val="bullet"/>
-      <w:lvlText w:val=" "/>
-      <w:lvlJc w:val="left"/>
-      <w:pPr>
-        <w:ind w:left="6480" w:hanging="360"/>
-      </w:pPr>
-    </w:lvl>
-  </w:abstractNum>
-  <w:abstractNum w:abstractNumId="99411">
-    <w:nsid w:val="00A99411"/>
-    <w:multiLevelType w:val="multilevel"/>
-    <w:lvl w:ilvl="0">
-      <w:start w:val="1"/>
-      <w:numFmt w:val="decimal"/>
-      <w:lvlText w:val="%1."/>
-      <w:lvlJc w:val="left"/>
-      <w:pPr>
-        <w:ind w:left="720" w:hanging="360"/>
-      </w:pPr>
-    </w:lvl>
-    <w:lvl w:ilvl="1">
-      <w:start w:val="1"/>
-      <w:numFmt w:val="decimal"/>
-      <w:lvlText w:val="%2."/>
-      <w:lvlJc w:val="left"/>
-      <w:pPr>
-        <w:ind w:left="1440" w:hanging="360"/>
-      </w:pPr>
-    </w:lvl>
-    <w:lvl w:ilvl="2">
-      <w:start w:val="1"/>
-      <w:numFmt w:val="decimal"/>
-      <w:lvlText w:val="%3."/>
-      <w:lvlJc w:val="left"/>
-      <w:pPr>
-        <w:ind w:left="2160" w:hanging="360"/>
-      </w:pPr>
-    </w:lvl>
-    <w:lvl w:ilvl="3">
-      <w:start w:val="1"/>
-      <w:numFmt w:val="decimal"/>
-      <w:lvlText w:val="%4."/>
-      <w:lvlJc w:val="left"/>
-      <w:pPr>
-        <w:ind w:left="2880" w:hanging="360"/>
-      </w:pPr>
-    </w:lvl>
-    <w:lvl w:ilvl="4">
-      <w:start w:val="1"/>
-      <w:numFmt w:val="decimal"/>
-      <w:lvlText w:val="%5."/>
-      <w:lvlJc w:val="left"/>
-      <w:pPr>
-        <w:ind w:left="3600" w:hanging="360"/>
-      </w:pPr>
-    </w:lvl>
-    <w:lvl w:ilvl="5">
-      <w:start w:val="1"/>
-      <w:numFmt w:val="decimal"/>
-      <w:lvlText w:val="%6."/>
-      <w:lvlJc w:val="left"/>
-      <w:pPr>
-        <w:ind w:left="4320" w:hanging="360"/>
-      </w:pPr>
-    </w:lvl>
-    <w:lvl w:ilvl="6">
-      <w:start w:val="1"/>
-      <w:numFmt w:val="decimal"/>
-      <w:lvlText w:val="%7."/>
-      <w:lvlJc w:val="left"/>
-      <w:pPr>
-        <w:ind w:left="5040" w:hanging="360"/>
-      </w:pPr>
-    </w:lvl>
-    <w:lvl w:ilvl="7">
-      <w:start w:val="1"/>
-      <w:numFmt w:val="decimal"/>
-      <w:lvlText w:val="%8."/>
-      <w:lvlJc w:val="left"/>
-      <w:pPr>
-        <w:ind w:left="5760" w:hanging="360"/>
-      </w:pPr>
-    </w:lvl>
-    <w:lvl w:ilvl="8">
-      <w:start w:val="1"/>
-      <w:numFmt w:val="decimal"/>
-      <w:lvlText w:val="%9."/>
-      <w:lvlJc w:val="left"/>
-      <w:pPr>
-        <w:ind w:left="6480" w:hanging="360"/>
-      </w:pPr>
-    </w:lvl>
-  </w:abstractNum>
-  <w:abstractNum w:abstractNumId="992">
-    <w:nsid w:val="0000A992"/>
-    <w:multiLevelType w:val="multilevel"/>
-    <w:lvl w:ilvl="0">
-      <w:numFmt w:val="bullet"/>
-      <w:lvlText w:val="☐"/>
-      <w:lvlJc w:val="left"/>
-      <w:pPr>
-        <w:ind w:left="720" w:hanging="360"/>
-      </w:pPr>
-    </w:lvl>
-    <w:lvl w:ilvl="1">
-      <w:numFmt w:val="bullet"/>
-      <w:lvlText w:val="☐"/>
-      <w:lvlJc w:val="left"/>
-      <w:pPr>
-        <w:ind w:left="1440" w:hanging="360"/>
-      </w:pPr>
-    </w:lvl>
-    <w:lvl w:ilvl="2">
-      <w:numFmt w:val="bullet"/>
-      <w:lvlText w:val="☐"/>
-      <w:lvlJc w:val="left"/>
-      <w:pPr>
-        <w:ind w:left="2160" w:hanging="360"/>
-      </w:pPr>
-    </w:lvl>
-    <w:lvl w:ilvl="3">
-      <w:numFmt w:val="bullet"/>
-      <w:lvlText w:val="☐"/>
-      <w:lvlJc w:val="left"/>
-      <w:pPr>
-        <w:ind w:left="2880" w:hanging="360"/>
-      </w:pPr>
-    </w:lvl>
-    <w:lvl w:ilvl="4">
-      <w:numFmt w:val="bullet"/>
-      <w:lvlText w:val="☐"/>
-      <w:lvlJc w:val="left"/>
-      <w:pPr>
-        <w:ind w:left="3600" w:hanging="360"/>
-      </w:pPr>
-    </w:lvl>
-    <w:lvl w:ilvl="5">
-      <w:numFmt w:val="bullet"/>
-      <w:lvlText w:val="☐"/>
-      <w:lvlJc w:val="left"/>
-      <w:pPr>
-        <w:ind w:left="4320" w:hanging="360"/>
-      </w:pPr>
-    </w:lvl>
-    <w:lvl w:ilvl="6">
-      <w:numFmt w:val="bullet"/>
-      <w:lvlText w:val="☐"/>
-      <w:lvlJc w:val="left"/>
-      <w:pPr>
-        <w:ind w:left="5040" w:hanging="360"/>
-      </w:pPr>
-    </w:lvl>
-    <w:lvl w:ilvl="7">
-      <w:numFmt w:val="bullet"/>
-      <w:lvlText w:val="☐"/>
-      <w:lvlJc w:val="left"/>
-      <w:pPr>
-        <w:ind w:left="5760" w:hanging="360"/>
-      </w:pPr>
-    </w:lvl>
-    <w:lvl w:ilvl="8">
-      <w:numFmt w:val="bullet"/>
-      <w:lvlText w:val="☐"/>
-      <w:lvlJc w:val="left"/>
-      <w:pPr>
-        <w:ind w:left="6480" w:hanging="360"/>
-      </w:pPr>
-    </w:lvl>
-  </w:abstractNum>
-  <w:abstractNum w:abstractNumId="991">
-    <w:nsid w:val="0000A991"/>
-    <w:multiLevelType w:val="multilevel"/>
-    <w:lvl w:ilvl="0">
-      <w:numFmt w:val="bullet"/>
-      <w:lvlText w:val=""/>
-      <w:lvlJc w:val="left"/>
-      <w:pPr>
-        <w:ind w:left="720" w:hanging="360"/>
-      </w:pPr>
-      <w:rPr>
-        <w:rFonts w:ascii="Symbol" w:hAnsi="Symbol" w:cs="Symbol" w:hint="default"/>
-      </w:rPr>
-    </w:lvl>
-    <w:lvl w:ilvl="1">
-      <w:numFmt w:val="bullet"/>
-      <w:lvlText w:val="o"/>
-      <w:lvlJc w:val="left"/>
-      <w:pPr>
-        <w:ind w:left="1440" w:hanging="360"/>
-      </w:pPr>
-      <w:rPr>
-        <w:rFonts w:ascii="Courier New" w:hAnsi="Courier New" w:cs="Courier New" w:hint="default"/>
-      </w:rPr>
-    </w:lvl>
-    <w:lvl w:ilvl="2">
-      <w:numFmt w:val="bullet"/>
-      <w:lvlText w:val=""/>
-      <w:lvlJc w:val="left"/>
-      <w:pPr>
-        <w:ind w:left="2160" w:hanging="360"/>
-      </w:pPr>
-      <w:rPr>
-        <w:rFonts w:ascii="Wingdings" w:hAnsi="Wingdings" w:cs="Wingdings" w:hint="default"/>
-      </w:rPr>
-    </w:lvl>
-    <w:lvl w:ilvl="3">
-      <w:numFmt w:val="bullet"/>
-      <w:lvlText w:val=""/>
-      <w:lvlJc w:val="left"/>
-      <w:pPr>
-        <w:ind w:left="2880" w:hanging="360"/>
-      </w:pPr>
-      <w:rPr>
-        <w:rFonts w:ascii="Symbol" w:hAnsi="Symbol" w:cs="Symbol" w:hint="default"/>
-      </w:rPr>
-    </w:lvl>
-    <w:lvl w:ilvl="4">
-      <w:numFmt w:val="bullet"/>
-      <w:lvlText w:val="o"/>
-      <w:lvlJc w:val="left"/>
-      <w:pPr>
-        <w:ind w:left="3600" w:hanging="360"/>
-      </w:pPr>
-      <w:rPr>
-        <w:rFonts w:ascii="Courier New" w:hAnsi="Courier New" w:cs="Courier New" w:hint="default"/>
-      </w:rPr>
-    </w:lvl>
-    <w:lvl w:ilvl="5">
-      <w:numFmt w:val="bullet"/>
-      <w:lvlText w:val=""/>
-      <w:lvlJc w:val="left"/>
-      <w:pPr>
-        <w:ind w:left="4320" w:hanging="360"/>
-      </w:pPr>
-      <w:rPr>
-        <w:rFonts w:ascii="Wingdings" w:hAnsi="Wingdings" w:cs="Wingdings" w:hint="default"/>
-      </w:rPr>
-    </w:lvl>
-    <w:lvl w:ilvl="6">
-      <w:numFmt w:val="bullet"/>
-      <w:lvlText w:val=""/>
-      <w:lvlJc w:val="left"/>
-      <w:pPr>
-        <w:ind w:left="5040" w:hanging="360"/>
-      </w:pPr>
-      <w:rPr>
-        <w:rFonts w:ascii="Symbol" w:hAnsi="Symbol" w:cs="Symbol" w:hint="default"/>
-      </w:rPr>
-    </w:lvl>
-    <w:lvl w:ilvl="7">
-      <w:numFmt w:val="bullet"/>
-      <w:lvlText w:val="o"/>
-      <w:lvlJc w:val="left"/>
-      <w:pPr>
-        <w:ind w:left="5760" w:hanging="360"/>
-      </w:pPr>
-      <w:rPr>
-        <w:rFonts w:ascii="Courier New" w:hAnsi="Courier New" w:cs="Courier New" w:hint="default"/>
-      </w:rPr>
-    </w:lvl>
-    <w:lvl w:ilvl="8">
-      <w:numFmt w:val="bullet"/>
-      <w:lvlText w:val=""/>
-      <w:lvlJc w:val="left"/>
-      <w:pPr>
-        <w:ind w:left="6480" w:hanging="360"/>
-      </w:pPr>
-      <w:rPr>
-        <w:rFonts w:ascii="Wingdings" w:hAnsi="Wingdings" w:cs="Wingdings" w:hint="default"/>
-      </w:rPr>
-    </w:lvl>
-  </w:abstractNum>
-  <w:num w16cid:durableId="1844859319" w:numId="1">
+  <w:num w:numId="1" w16cid:durableId="1844859319">
+    <w:abstractNumId w:val="4"/>
+  </w:num>
+  <w:num w:numId="2" w16cid:durableId="184952323">
     <w:abstractNumId w:val="0"/>
   </w:num>
-  <w:num w:numId="1000">
-    <w:abstractNumId w:val="990"/>
-  </w:num>
-  <w:num w:numId="1001">
-    <w:abstractNumId w:val="99411"/>
+  <w:num w:numId="3" w16cid:durableId="1065647381">
+    <w:abstractNumId w:val="3"/>
     <w:lvlOverride w:ilvl="0">
       <w:startOverride w:val="1"/>
     </w:lvlOverride>
@@ -1911,30 +1861,30 @@
       <w:startOverride w:val="1"/>
     </w:lvlOverride>
   </w:num>
-  <w:num w:numId="1002">
-    <w:abstractNumId w:val="992"/>
+  <w:num w:numId="4" w16cid:durableId="1346204916">
+    <w:abstractNumId w:val="2"/>
   </w:num>
-  <w:num w:numId="1003">
-    <w:abstractNumId w:val="992"/>
+  <w:num w:numId="5" w16cid:durableId="1788703">
+    <w:abstractNumId w:val="2"/>
   </w:num>
-  <w:num w:numId="1004">
-    <w:abstractNumId w:val="992"/>
+  <w:num w:numId="6" w16cid:durableId="2119710738">
+    <w:abstractNumId w:val="2"/>
   </w:num>
-  <w:num w:numId="1005">
-    <w:abstractNumId w:val="991"/>
+  <w:num w:numId="7" w16cid:durableId="368378326">
+    <w:abstractNumId w:val="1"/>
   </w:num>
 </w:numbering>
 </file>
 
 <file path=word/styles.xml><?xml version="1.0" encoding="utf-8"?>
-<w:styles xmlns:mc="http://schemas.openxmlformats.org/markup-compatibility/2006" xmlns:r="http://schemas.openxmlformats.org/officeDocument/2006/relationships" xmlns:w="http://schemas.openxmlformats.org/wordprocessingml/2006/main" xmlns:w14="http://schemas.microsoft.com/office/word/2010/wordml" xmlns:w15="http://schemas.microsoft.com/office/word/2012/wordml" xmlns:w16="http://schemas.microsoft.com/office/word/2018/wordml" xmlns:w16cex="http://schemas.microsoft.com/office/word/2018/wordml/cex" xmlns:w16cid="http://schemas.microsoft.com/office/word/2016/wordml/cid" xmlns:w16du="http://schemas.microsoft.com/office/word/2023/wordml/word16du" xmlns:w16sdtdh="http://schemas.microsoft.com/office/word/2020/wordml/sdtdatahash" xmlns:w16sdtfl="http://schemas.microsoft.com/office/word/2024/wordml/sdtformatlock" xmlns:w16se="http://schemas.microsoft.com/office/word/2015/wordml/symex" mc:Ignorable="w14 w15 w16se w16cid w16 w16cex w16sdtdh w16sdtfl w16du">
+<w:styles xmlns:mc="http://schemas.openxmlformats.org/markup-compatibility/2006" xmlns:r="http://schemas.openxmlformats.org/officeDocument/2006/relationships" xmlns:w="http://schemas.openxmlformats.org/wordprocessingml/2006/main" xmlns:w14="http://schemas.microsoft.com/office/word/2010/wordml" xmlns:w15="http://schemas.microsoft.com/office/word/2012/wordml" xmlns:w16cex="http://schemas.microsoft.com/office/word/2018/wordml/cex" xmlns:w16cid="http://schemas.microsoft.com/office/word/2016/wordml/cid" xmlns:w16="http://schemas.microsoft.com/office/word/2018/wordml" xmlns:w16du="http://schemas.microsoft.com/office/word/2023/wordml/word16du" xmlns:w16sdtdh="http://schemas.microsoft.com/office/word/2020/wordml/sdtdatahash" xmlns:w16sdtfl="http://schemas.microsoft.com/office/word/2024/wordml/sdtformatlock" xmlns:w16se="http://schemas.microsoft.com/office/word/2015/wordml/symex" mc:Ignorable="w14 w15 w16se w16cid w16 w16cex w16sdtdh w16sdtfl w16du">
   <w:docDefaults>
     <w:rPrDefault>
       <w:rPr>
-        <w:rFonts w:asciiTheme="minorHAnsi" w:cstheme="minorBidi" w:eastAsiaTheme="minorEastAsia" w:hAnsiTheme="minorHAnsi"/>
+        <w:rFonts w:asciiTheme="minorHAnsi" w:eastAsiaTheme="minorEastAsia" w:hAnsiTheme="minorHAnsi" w:cstheme="minorBidi"/>
         <w:sz w:val="24"/>
         <w:szCs w:val="24"/>
-        <w:lang w:bidi="ar-SA" w:eastAsia="zh-CN" w:val="en-US"/>
+        <w:lang w:val="en-US" w:eastAsia="zh-CN" w:bidi="ar-SA"/>
       </w:rPr>
     </w:rPrDefault>
     <w:pPrDefault>
@@ -1943,7 +1893,7 @@
       </w:pPr>
     </w:pPrDefault>
   </w:docDefaults>
-  <w:latentStyles w:count="376" w:defLockedState="0" w:defQFormat="0" w:defSemiHidden="0" w:defUIPriority="0" w:defUnhideWhenUsed="0">
+  <w:latentStyles w:defLockedState="0" w:defUIPriority="0" w:defSemiHidden="0" w:defUnhideWhenUsed="0" w:defQFormat="0" w:count="376">
     <w:lsdException w:name="Normal Table" w:semiHidden="1" w:unhideWhenUsed="1"/>
     <w:lsdException w:name="Table Simple 1" w:semiHidden="1" w:unhideWhenUsed="1"/>
     <w:lsdException w:name="Table Simple 2" w:semiHidden="1" w:unhideWhenUsed="1"/>
@@ -2187,17 +2137,17 @@
     <w:lsdException w:name="Unresolved Mention" w:semiHidden="1" w:uiPriority="99" w:unhideWhenUsed="1"/>
     <w:lsdException w:name="Smart Link" w:semiHidden="1" w:uiPriority="99" w:unhideWhenUsed="1"/>
   </w:latentStyles>
-  <w:style w:default="1" w:styleId="a" w:type="paragraph">
+  <w:style w:type="paragraph" w:default="1" w:styleId="a">
     <w:name w:val="Normal"/>
     <w:qFormat/>
     <w:pPr>
-      <w:spacing w:after="40" w:before="0" w:line="276" w:lineRule="auto"/>
+      <w:spacing w:after="40" w:line="276" w:lineRule="auto"/>
     </w:pPr>
     <w:rPr>
       <w:sz w:val="21"/>
     </w:rPr>
   </w:style>
-  <w:style w:styleId="1" w:type="paragraph">
+  <w:style w:type="paragraph" w:styleId="1">
     <w:name w:val="heading 1"/>
     <w:basedOn w:val="a"/>
     <w:next w:val="a0"/>
@@ -2208,18 +2158,18 @@
     <w:pPr>
       <w:keepNext/>
       <w:keepLines/>
-      <w:spacing w:after="80" w:before="120"/>
+      <w:spacing w:before="120" w:after="80"/>
       <w:jc w:val="center"/>
       <w:outlineLvl w:val="0"/>
     </w:pPr>
     <w:rPr>
-      <w:rFonts w:asciiTheme="majorHAnsi" w:cstheme="majorBidi" w:eastAsia="微软雅黑" w:hAnsiTheme="majorHAnsi"/>
-      <w:color w:themeColor="accent1" w:themeShade="BF" w:val="0F4761"/>
+      <w:rFonts w:asciiTheme="majorHAnsi" w:eastAsia="微软雅黑" w:hAnsiTheme="majorHAnsi" w:cstheme="majorBidi"/>
+      <w:color w:val="0F4761" w:themeColor="accent1" w:themeShade="BF"/>
       <w:sz w:val="32"/>
       <w:szCs w:val="40"/>
     </w:rPr>
   </w:style>
-  <w:style w:styleId="2" w:type="paragraph">
+  <w:style w:type="paragraph" w:styleId="2">
     <w:name w:val="heading 2"/>
     <w:basedOn w:val="a"/>
     <w:next w:val="a0"/>
@@ -2232,17 +2182,17 @@
     <w:pPr>
       <w:keepNext/>
       <w:keepLines/>
-      <w:spacing w:after="40" w:before="100"/>
+      <w:spacing w:before="100"/>
       <w:outlineLvl w:val="1"/>
     </w:pPr>
     <w:rPr>
-      <w:rFonts w:asciiTheme="majorHAnsi" w:cstheme="majorBidi" w:eastAsia="微软雅黑" w:hAnsiTheme="majorHAnsi"/>
-      <w:color w:themeColor="accent1" w:themeShade="BF" w:val="0F4761"/>
+      <w:rFonts w:asciiTheme="majorHAnsi" w:eastAsia="微软雅黑" w:hAnsiTheme="majorHAnsi" w:cstheme="majorBidi"/>
+      <w:color w:val="0F4761" w:themeColor="accent1" w:themeShade="BF"/>
       <w:sz w:val="26"/>
       <w:szCs w:val="32"/>
     </w:rPr>
   </w:style>
-  <w:style w:styleId="3" w:type="paragraph">
+  <w:style w:type="paragraph" w:styleId="3">
     <w:name w:val="heading 3"/>
     <w:basedOn w:val="a"/>
     <w:next w:val="a0"/>
@@ -2255,18 +2205,18 @@
     <w:pPr>
       <w:keepNext/>
       <w:keepLines/>
-      <w:spacing w:after="40" w:before="80"/>
+      <w:spacing w:before="80"/>
       <w:jc w:val="center"/>
       <w:outlineLvl w:val="2"/>
     </w:pPr>
     <w:rPr>
-      <w:rFonts w:cstheme="majorBidi" w:eastAsia="微软雅黑"/>
-      <w:color w:themeColor="accent1" w:themeShade="BF" w:val="0F4761"/>
+      <w:rFonts w:eastAsia="微软雅黑" w:cstheme="majorBidi"/>
+      <w:color w:val="0F4761" w:themeColor="accent1" w:themeShade="BF"/>
       <w:sz w:val="22"/>
       <w:szCs w:val="28"/>
     </w:rPr>
   </w:style>
-  <w:style w:styleId="4" w:type="paragraph">
+  <w:style w:type="paragraph" w:styleId="4">
     <w:name w:val="heading 4"/>
     <w:basedOn w:val="a"/>
     <w:next w:val="a0"/>
@@ -2279,17 +2229,17 @@
     <w:pPr>
       <w:keepNext/>
       <w:keepLines/>
-      <w:spacing w:after="40" w:before="80"/>
+      <w:spacing w:before="80"/>
       <w:jc w:val="center"/>
       <w:outlineLvl w:val="3"/>
     </w:pPr>
     <w:rPr>
-      <w:rFonts w:cstheme="majorBidi" w:eastAsia="黑体"/>
+      <w:rFonts w:eastAsia="黑体" w:cstheme="majorBidi"/>
       <w:iCs/>
       <w:sz w:val="28"/>
     </w:rPr>
   </w:style>
-  <w:style w:styleId="5" w:type="paragraph">
+  <w:style w:type="paragraph" w:styleId="5">
     <w:name w:val="heading 5"/>
     <w:basedOn w:val="a"/>
     <w:next w:val="a0"/>
@@ -2302,15 +2252,15 @@
     <w:pPr>
       <w:keepNext/>
       <w:keepLines/>
-      <w:spacing w:after="40" w:before="80"/>
+      <w:spacing w:before="80"/>
       <w:outlineLvl w:val="4"/>
     </w:pPr>
     <w:rPr>
-      <w:rFonts w:cstheme="majorBidi" w:eastAsiaTheme="majorEastAsia"/>
-      <w:color w:themeColor="accent1" w:themeShade="BF" w:val="0F4761"/>
-    </w:rPr>
-  </w:style>
-  <w:style w:styleId="6" w:type="paragraph">
+      <w:rFonts w:eastAsiaTheme="majorEastAsia" w:cstheme="majorBidi"/>
+      <w:color w:val="0F4761" w:themeColor="accent1" w:themeShade="BF"/>
+    </w:rPr>
+  </w:style>
+  <w:style w:type="paragraph" w:styleId="6">
     <w:name w:val="heading 6"/>
     <w:basedOn w:val="a"/>
     <w:next w:val="a0"/>
@@ -2323,17 +2273,17 @@
     <w:pPr>
       <w:keepNext/>
       <w:keepLines/>
-      <w:spacing w:after="0" w:before="40"/>
+      <w:spacing w:before="40" w:after="0"/>
       <w:outlineLvl w:val="5"/>
     </w:pPr>
     <w:rPr>
-      <w:rFonts w:cstheme="majorBidi" w:eastAsiaTheme="majorEastAsia"/>
+      <w:rFonts w:eastAsiaTheme="majorEastAsia" w:cstheme="majorBidi"/>
       <w:i/>
       <w:iCs/>
-      <w:color w:themeColor="text1" w:themeTint="A6" w:val="595959"/>
-    </w:rPr>
-  </w:style>
-  <w:style w:styleId="7" w:type="paragraph">
+      <w:color w:val="595959" w:themeColor="text1" w:themeTint="A6"/>
+    </w:rPr>
+  </w:style>
+  <w:style w:type="paragraph" w:styleId="7">
     <w:name w:val="heading 7"/>
     <w:basedOn w:val="a"/>
     <w:next w:val="a0"/>
@@ -2346,15 +2296,15 @@
     <w:pPr>
       <w:keepNext/>
       <w:keepLines/>
-      <w:spacing w:after="0" w:before="40"/>
+      <w:spacing w:before="40" w:after="0"/>
       <w:outlineLvl w:val="6"/>
     </w:pPr>
     <w:rPr>
-      <w:rFonts w:cstheme="majorBidi" w:eastAsiaTheme="majorEastAsia"/>
-      <w:color w:themeColor="text1" w:themeTint="A6" w:val="595959"/>
-    </w:rPr>
-  </w:style>
-  <w:style w:styleId="8" w:type="paragraph">
+      <w:rFonts w:eastAsiaTheme="majorEastAsia" w:cstheme="majorBidi"/>
+      <w:color w:val="595959" w:themeColor="text1" w:themeTint="A6"/>
+    </w:rPr>
+  </w:style>
+  <w:style w:type="paragraph" w:styleId="8">
     <w:name w:val="heading 8"/>
     <w:basedOn w:val="a"/>
     <w:next w:val="a0"/>
@@ -2371,13 +2321,13 @@
       <w:outlineLvl w:val="7"/>
     </w:pPr>
     <w:rPr>
-      <w:rFonts w:cstheme="majorBidi" w:eastAsiaTheme="majorEastAsia"/>
+      <w:rFonts w:eastAsiaTheme="majorEastAsia" w:cstheme="majorBidi"/>
       <w:i/>
       <w:iCs/>
-      <w:color w:themeColor="text1" w:themeTint="D8" w:val="272727"/>
-    </w:rPr>
-  </w:style>
-  <w:style w:styleId="9" w:type="paragraph">
+      <w:color w:val="272727" w:themeColor="text1" w:themeTint="D8"/>
+    </w:rPr>
+  </w:style>
+  <w:style w:type="paragraph" w:styleId="9">
     <w:name w:val="heading 9"/>
     <w:basedOn w:val="a"/>
     <w:next w:val="a0"/>
@@ -2394,75 +2344,59 @@
       <w:outlineLvl w:val="8"/>
     </w:pPr>
     <w:rPr>
-      <w:rFonts w:cstheme="majorBidi" w:eastAsiaTheme="majorEastAsia"/>
-      <w:color w:themeColor="text1" w:themeTint="D8" w:val="272727"/>
-    </w:rPr>
-  </w:style>
-  <w:style w:default="1" w:styleId="a1" w:type="character">
+      <w:rFonts w:eastAsiaTheme="majorEastAsia" w:cstheme="majorBidi"/>
+      <w:color w:val="272727" w:themeColor="text1" w:themeTint="D8"/>
+    </w:rPr>
+  </w:style>
+  <w:style w:type="character" w:default="1" w:styleId="a1">
     <w:name w:val="Default Paragraph Font"/>
     <w:uiPriority w:val="1"/>
     <w:semiHidden/>
     <w:unhideWhenUsed/>
   </w:style>
-  <w:style w:default="1" w:styleId="a2" w:type="table">
+  <w:style w:type="table" w:default="1" w:styleId="a2">
     <w:name w:val="Normal Table"/>
     <w:uiPriority w:val="99"/>
     <w:semiHidden/>
     <w:unhideWhenUsed/>
     <w:tblPr>
-      <w:tblInd w:type="dxa" w:w="0"/>
+      <w:tblInd w:w="0" w:type="dxa"/>
       <w:tblCellMar>
-        <w:top w:type="dxa" w:w="0"/>
-        <w:left w:type="dxa" w:w="108"/>
-        <w:bottom w:type="dxa" w:w="0"/>
-        <w:right w:type="dxa" w:w="108"/>
+        <w:top w:w="0" w:type="dxa"/>
+        <w:left w:w="108" w:type="dxa"/>
+        <w:bottom w:w="0" w:type="dxa"/>
+        <w:right w:w="108" w:type="dxa"/>
       </w:tblCellMar>
     </w:tblPr>
   </w:style>
-  <w:style w:default="1" w:styleId="a3" w:type="numbering">
+  <w:style w:type="numbering" w:default="1" w:styleId="a3">
     <w:name w:val="No List"/>
     <w:uiPriority w:val="99"/>
     <w:semiHidden/>
     <w:unhideWhenUsed/>
   </w:style>
-  <w:style w:styleId="a0" w:type="paragraph">
+  <w:style w:type="paragraph" w:styleId="a0">
     <w:name w:val="Body Text"/>
     <w:basedOn w:val="a"/>
     <w:qFormat/>
     <w:rsid w:val="005B72F6"/>
-    <w:pPr>
-      <w:spacing w:after="40" w:before="0" w:line="276" w:lineRule="auto"/>
-    </w:pPr>
     <w:rPr>
       <w:rFonts w:eastAsia="宋体"/>
-      <w:sz w:val="21"/>
-    </w:rPr>
-  </w:style>
-  <w:style w:customStyle="1" w:styleId="FirstParagraph" w:type="paragraph">
+    </w:rPr>
+  </w:style>
+  <w:style w:type="paragraph" w:customStyle="1" w:styleId="FirstParagraph">
     <w:name w:val="First Paragraph"/>
     <w:basedOn w:val="a0"/>
     <w:next w:val="a0"/>
     <w:qFormat/>
-    <w:pPr>
-      <w:spacing w:after="40" w:before="0" w:line="276" w:lineRule="auto"/>
-    </w:pPr>
-    <w:rPr>
-      <w:sz w:val="21"/>
-    </w:rPr>
-  </w:style>
-  <w:style w:customStyle="1" w:styleId="Compact" w:type="paragraph">
+  </w:style>
+  <w:style w:type="paragraph" w:customStyle="1" w:styleId="Compact">
     <w:name w:val="Compact"/>
     <w:basedOn w:val="a0"/>
     <w:qFormat/>
     <w:rsid w:val="00F920DC"/>
-    <w:pPr>
-      <w:spacing w:after="40" w:before="0" w:line="276" w:lineRule="auto"/>
-    </w:pPr>
-    <w:rPr>
-      <w:sz w:val="21"/>
-    </w:rPr>
-  </w:style>
-  <w:style w:styleId="a4" w:type="paragraph">
+  </w:style>
+  <w:style w:type="paragraph" w:styleId="a4">
     <w:name w:val="Title"/>
     <w:basedOn w:val="a"/>
     <w:next w:val="a0"/>
@@ -2476,24 +2410,24 @@
       <w:jc w:val="center"/>
     </w:pPr>
     <w:rPr>
-      <w:rFonts w:asciiTheme="majorHAnsi" w:cstheme="majorBidi" w:eastAsiaTheme="majorEastAsia" w:hAnsiTheme="majorHAnsi"/>
+      <w:rFonts w:asciiTheme="majorHAnsi" w:eastAsiaTheme="majorEastAsia" w:hAnsiTheme="majorHAnsi" w:cstheme="majorBidi"/>
       <w:sz w:val="56"/>
       <w:szCs w:val="56"/>
     </w:rPr>
   </w:style>
-  <w:style w:customStyle="1" w:styleId="a5" w:type="character">
+  <w:style w:type="character" w:customStyle="1" w:styleId="a5">
     <w:name w:val="标题 字符"/>
     <w:basedOn w:val="a1"/>
     <w:link w:val="a4"/>
     <w:uiPriority w:val="10"/>
     <w:rsid w:val="00A10FD9"/>
     <w:rPr>
-      <w:rFonts w:asciiTheme="majorHAnsi" w:cstheme="majorBidi" w:eastAsiaTheme="majorEastAsia" w:hAnsiTheme="majorHAnsi"/>
+      <w:rFonts w:asciiTheme="majorHAnsi" w:eastAsiaTheme="majorEastAsia" w:hAnsiTheme="majorHAnsi" w:cstheme="majorBidi"/>
       <w:sz w:val="56"/>
       <w:szCs w:val="56"/>
     </w:rPr>
   </w:style>
-  <w:style w:styleId="a6" w:type="paragraph">
+  <w:style w:type="paragraph" w:styleId="a6">
     <w:name w:val="Subtitle"/>
     <w:basedOn w:val="a4"/>
     <w:next w:val="a0"/>
@@ -2512,21 +2446,21 @@
       <w:szCs w:val="28"/>
     </w:rPr>
   </w:style>
-  <w:style w:customStyle="1" w:styleId="a7" w:type="character">
+  <w:style w:type="character" w:customStyle="1" w:styleId="a7">
     <w:name w:val="副标题 字符"/>
     <w:basedOn w:val="a1"/>
     <w:link w:val="a6"/>
     <w:uiPriority w:val="11"/>
     <w:rsid w:val="00A10FD9"/>
     <w:rPr>
-      <w:rFonts w:cstheme="majorBidi" w:eastAsiaTheme="majorEastAsia"/>
-      <w:color w:themeColor="text1" w:themeTint="A6" w:val="595959"/>
+      <w:rFonts w:eastAsiaTheme="majorEastAsia" w:cstheme="majorBidi"/>
+      <w:color w:val="595959" w:themeColor="text1" w:themeTint="A6"/>
       <w:spacing w:val="15"/>
       <w:sz w:val="28"/>
       <w:szCs w:val="28"/>
     </w:rPr>
   </w:style>
-  <w:style w:customStyle="1" w:styleId="Author" w:type="paragraph">
+  <w:style w:type="paragraph" w:customStyle="1" w:styleId="Author">
     <w:name w:val="Author"/>
     <w:basedOn w:val="a4"/>
     <w:next w:val="a0"/>
@@ -2540,7 +2474,7 @@
       <w:szCs w:val="24"/>
     </w:rPr>
   </w:style>
-  <w:style w:styleId="a8" w:type="paragraph">
+  <w:style w:type="paragraph" w:styleId="a8">
     <w:name w:val="Date"/>
     <w:basedOn w:val="a4"/>
     <w:next w:val="a0"/>
@@ -2554,7 +2488,7 @@
       <w:szCs w:val="24"/>
     </w:rPr>
   </w:style>
-  <w:style w:customStyle="1" w:styleId="AbstractTitle" w:type="paragraph">
+  <w:style w:type="paragraph" w:customStyle="1" w:styleId="AbstractTitle">
     <w:name w:val="Abstract Title"/>
     <w:basedOn w:val="a"/>
     <w:next w:val="Abstract"/>
@@ -2562,7 +2496,7 @@
     <w:pPr>
       <w:keepNext/>
       <w:keepLines/>
-      <w:spacing w:after="0" w:before="300"/>
+      <w:spacing w:before="300" w:after="0"/>
       <w:jc w:val="center"/>
     </w:pPr>
     <w:rPr>
@@ -2571,7 +2505,7 @@
       <w:szCs w:val="20"/>
     </w:rPr>
   </w:style>
-  <w:style w:customStyle="1" w:styleId="Abstract" w:type="paragraph">
+  <w:style w:type="paragraph" w:customStyle="1" w:styleId="Abstract">
     <w:name w:val="Abstract"/>
     <w:basedOn w:val="a"/>
     <w:next w:val="a0"/>
@@ -2579,32 +2513,32 @@
     <w:pPr>
       <w:keepNext/>
       <w:keepLines/>
-      <w:spacing w:after="300" w:before="100"/>
+      <w:spacing w:before="100" w:after="300"/>
     </w:pPr>
     <w:rPr>
       <w:sz w:val="20"/>
       <w:szCs w:val="20"/>
     </w:rPr>
   </w:style>
-  <w:style w:styleId="a9" w:type="paragraph">
+  <w:style w:type="paragraph" w:styleId="a9">
     <w:name w:val="Bibliography"/>
     <w:basedOn w:val="a"/>
     <w:qFormat/>
   </w:style>
-  <w:style w:customStyle="1" w:styleId="10" w:type="character">
+  <w:style w:type="character" w:customStyle="1" w:styleId="10">
     <w:name w:val="标题 1 字符"/>
     <w:basedOn w:val="a1"/>
     <w:link w:val="1"/>
     <w:uiPriority w:val="9"/>
     <w:rsid w:val="00C203DB"/>
     <w:rPr>
-      <w:rFonts w:asciiTheme="majorHAnsi" w:cstheme="majorBidi" w:eastAsia="微软雅黑" w:hAnsiTheme="majorHAnsi"/>
-      <w:color w:themeColor="accent1" w:themeShade="BF" w:val="0F4761"/>
+      <w:rFonts w:asciiTheme="majorHAnsi" w:eastAsia="微软雅黑" w:hAnsiTheme="majorHAnsi" w:cstheme="majorBidi"/>
+      <w:color w:val="0F4761" w:themeColor="accent1" w:themeShade="BF"/>
       <w:sz w:val="44"/>
       <w:szCs w:val="40"/>
     </w:rPr>
   </w:style>
-  <w:style w:customStyle="1" w:styleId="20" w:type="character">
+  <w:style w:type="character" w:customStyle="1" w:styleId="20">
     <w:name w:val="标题 2 字符"/>
     <w:basedOn w:val="a1"/>
     <w:link w:val="2"/>
@@ -2612,13 +2546,13 @@
     <w:semiHidden/>
     <w:rsid w:val="00C203DB"/>
     <w:rPr>
-      <w:rFonts w:asciiTheme="majorHAnsi" w:cstheme="majorBidi" w:eastAsia="微软雅黑" w:hAnsiTheme="majorHAnsi"/>
-      <w:color w:themeColor="accent1" w:themeShade="BF" w:val="0F4761"/>
+      <w:rFonts w:asciiTheme="majorHAnsi" w:eastAsia="微软雅黑" w:hAnsiTheme="majorHAnsi" w:cstheme="majorBidi"/>
+      <w:color w:val="0F4761" w:themeColor="accent1" w:themeShade="BF"/>
       <w:sz w:val="32"/>
       <w:szCs w:val="32"/>
     </w:rPr>
   </w:style>
-  <w:style w:customStyle="1" w:styleId="30" w:type="character">
+  <w:style w:type="character" w:customStyle="1" w:styleId="30">
     <w:name w:val="标题 3 字符"/>
     <w:basedOn w:val="a1"/>
     <w:link w:val="3"/>
@@ -2626,13 +2560,13 @@
     <w:semiHidden/>
     <w:rsid w:val="00C203DB"/>
     <w:rPr>
-      <w:rFonts w:cstheme="majorBidi" w:eastAsia="微软雅黑"/>
-      <w:color w:themeColor="accent1" w:themeShade="BF" w:val="0F4761"/>
+      <w:rFonts w:eastAsia="微软雅黑" w:cstheme="majorBidi"/>
+      <w:color w:val="0F4761" w:themeColor="accent1" w:themeShade="BF"/>
       <w:sz w:val="28"/>
       <w:szCs w:val="28"/>
     </w:rPr>
   </w:style>
-  <w:style w:customStyle="1" w:styleId="40" w:type="character">
+  <w:style w:type="character" w:customStyle="1" w:styleId="40">
     <w:name w:val="标题 4 字符"/>
     <w:basedOn w:val="a1"/>
     <w:link w:val="4"/>
@@ -2640,12 +2574,12 @@
     <w:semiHidden/>
     <w:rsid w:val="00C203DB"/>
     <w:rPr>
-      <w:rFonts w:cstheme="majorBidi" w:eastAsia="黑体"/>
+      <w:rFonts w:eastAsia="黑体" w:cstheme="majorBidi"/>
       <w:iCs/>
       <w:sz w:val="28"/>
     </w:rPr>
   </w:style>
-  <w:style w:customStyle="1" w:styleId="50" w:type="character">
+  <w:style w:type="character" w:customStyle="1" w:styleId="50">
     <w:name w:val="标题 5 字符"/>
     <w:basedOn w:val="a1"/>
     <w:link w:val="5"/>
@@ -2653,11 +2587,11 @@
     <w:semiHidden/>
     <w:rsid w:val="00A10FD9"/>
     <w:rPr>
-      <w:rFonts w:cstheme="majorBidi" w:eastAsiaTheme="majorEastAsia"/>
-      <w:color w:themeColor="accent1" w:themeShade="BF" w:val="0F4761"/>
-    </w:rPr>
-  </w:style>
-  <w:style w:customStyle="1" w:styleId="60" w:type="character">
+      <w:rFonts w:eastAsiaTheme="majorEastAsia" w:cstheme="majorBidi"/>
+      <w:color w:val="0F4761" w:themeColor="accent1" w:themeShade="BF"/>
+    </w:rPr>
+  </w:style>
+  <w:style w:type="character" w:customStyle="1" w:styleId="60">
     <w:name w:val="标题 6 字符"/>
     <w:basedOn w:val="a1"/>
     <w:link w:val="6"/>
@@ -2665,13 +2599,13 @@
     <w:semiHidden/>
     <w:rsid w:val="00A10FD9"/>
     <w:rPr>
-      <w:rFonts w:cstheme="majorBidi" w:eastAsiaTheme="majorEastAsia"/>
+      <w:rFonts w:eastAsiaTheme="majorEastAsia" w:cstheme="majorBidi"/>
       <w:i/>
       <w:iCs/>
-      <w:color w:themeColor="text1" w:themeTint="A6" w:val="595959"/>
-    </w:rPr>
-  </w:style>
-  <w:style w:customStyle="1" w:styleId="70" w:type="character">
+      <w:color w:val="595959" w:themeColor="text1" w:themeTint="A6"/>
+    </w:rPr>
+  </w:style>
+  <w:style w:type="character" w:customStyle="1" w:styleId="70">
     <w:name w:val="标题 7 字符"/>
     <w:basedOn w:val="a1"/>
     <w:link w:val="7"/>
@@ -2679,11 +2613,11 @@
     <w:semiHidden/>
     <w:rsid w:val="00A10FD9"/>
     <w:rPr>
-      <w:rFonts w:cstheme="majorBidi" w:eastAsiaTheme="majorEastAsia"/>
-      <w:color w:themeColor="text1" w:themeTint="A6" w:val="595959"/>
-    </w:rPr>
-  </w:style>
-  <w:style w:customStyle="1" w:styleId="80" w:type="character">
+      <w:rFonts w:eastAsiaTheme="majorEastAsia" w:cstheme="majorBidi"/>
+      <w:color w:val="595959" w:themeColor="text1" w:themeTint="A6"/>
+    </w:rPr>
+  </w:style>
+  <w:style w:type="character" w:customStyle="1" w:styleId="80">
     <w:name w:val="标题 8 字符"/>
     <w:basedOn w:val="a1"/>
     <w:link w:val="8"/>
@@ -2691,13 +2625,13 @@
     <w:semiHidden/>
     <w:rsid w:val="00A10FD9"/>
     <w:rPr>
-      <w:rFonts w:cstheme="majorBidi" w:eastAsiaTheme="majorEastAsia"/>
+      <w:rFonts w:eastAsiaTheme="majorEastAsia" w:cstheme="majorBidi"/>
       <w:i/>
       <w:iCs/>
-      <w:color w:themeColor="text1" w:themeTint="D8" w:val="272727"/>
-    </w:rPr>
-  </w:style>
-  <w:style w:customStyle="1" w:styleId="90" w:type="character">
+      <w:color w:val="272727" w:themeColor="text1" w:themeTint="D8"/>
+    </w:rPr>
+  </w:style>
+  <w:style w:type="character" w:customStyle="1" w:styleId="90">
     <w:name w:val="标题 9 字符"/>
     <w:basedOn w:val="a1"/>
     <w:link w:val="9"/>
@@ -2705,11 +2639,11 @@
     <w:semiHidden/>
     <w:rsid w:val="00A10FD9"/>
     <w:rPr>
-      <w:rFonts w:cstheme="majorBidi" w:eastAsiaTheme="majorEastAsia"/>
-      <w:color w:themeColor="text1" w:themeTint="D8" w:val="272727"/>
-    </w:rPr>
-  </w:style>
-  <w:style w:styleId="aa" w:type="paragraph">
+      <w:rFonts w:eastAsiaTheme="majorEastAsia" w:cstheme="majorBidi"/>
+      <w:color w:val="272727" w:themeColor="text1" w:themeTint="D8"/>
+    </w:rPr>
+  </w:style>
+  <w:style w:type="paragraph" w:styleId="aa">
     <w:name w:val="Block Text"/>
     <w:basedOn w:val="a0"/>
     <w:next w:val="a0"/>
@@ -2717,18 +2651,18 @@
     <w:unhideWhenUsed/>
     <w:qFormat/>
     <w:pPr>
-      <w:spacing w:after="100" w:before="100"/>
+      <w:spacing w:before="100" w:after="100"/>
       <w:ind w:left="480" w:right="480"/>
     </w:pPr>
   </w:style>
-  <w:style w:styleId="ab" w:type="paragraph">
+  <w:style w:type="paragraph" w:styleId="ab">
     <w:name w:val="footnote text"/>
     <w:basedOn w:val="a"/>
     <w:uiPriority w:val="9"/>
     <w:unhideWhenUsed/>
     <w:qFormat/>
   </w:style>
-  <w:style w:customStyle="1" w:styleId="FootnoteBlockText" w:type="paragraph">
+  <w:style w:type="paragraph" w:customStyle="1" w:styleId="FootnoteBlockText">
     <w:name w:val="Footnote Block Text"/>
     <w:basedOn w:val="ab"/>
     <w:next w:val="ab"/>
@@ -2736,11 +2670,11 @@
     <w:unhideWhenUsed/>
     <w:qFormat/>
     <w:pPr>
-      <w:spacing w:after="100" w:before="100"/>
+      <w:spacing w:before="100" w:after="100"/>
       <w:ind w:left="480" w:right="480"/>
     </w:pPr>
   </w:style>
-  <w:style w:customStyle="1" w:styleId="Table" w:type="table">
+  <w:style w:type="table" w:customStyle="1" w:styleId="Table">
     <w:name w:val="Table"/>
     <w:basedOn w:val="a2"/>
     <w:semiHidden/>
@@ -2753,25 +2687,25 @@
     </w:rPr>
     <w:tblPr>
       <w:tblBorders>
-        <w:top w:color="auto" w:space="0" w:sz="6" w:val="single"/>
-        <w:left w:color="auto" w:space="0" w:sz="6" w:val="single"/>
-        <w:bottom w:color="auto" w:space="0" w:sz="6" w:val="single"/>
-        <w:right w:color="auto" w:space="0" w:sz="6" w:val="single"/>
-        <w:insideH w:color="auto" w:space="0" w:sz="6" w:val="single"/>
-        <w:insideV w:color="auto" w:space="0" w:sz="6" w:val="single"/>
+        <w:top w:val="single" w:sz="6" w:space="0" w:color="auto"/>
+        <w:left w:val="single" w:sz="6" w:space="0" w:color="auto"/>
+        <w:bottom w:val="single" w:sz="6" w:space="0" w:color="auto"/>
+        <w:right w:val="single" w:sz="6" w:space="0" w:color="auto"/>
+        <w:insideH w:val="single" w:sz="6" w:space="0" w:color="auto"/>
+        <w:insideV w:val="single" w:sz="6" w:space="0" w:color="auto"/>
       </w:tblBorders>
     </w:tblPr>
     <w:tblStylePr w:type="firstRow">
       <w:tblPr/>
       <w:tcPr>
         <w:tcBorders>
-          <w:bottom w:color="auto" w:space="0" w:sz="0" w:val="single"/>
+          <w:bottom w:val="single" w:sz="0" w:space="0" w:color="auto"/>
         </w:tcBorders>
         <w:vAlign w:val="bottom"/>
       </w:tcPr>
     </w:tblStylePr>
   </w:style>
-  <w:style w:customStyle="1" w:styleId="DefinitionTerm" w:type="paragraph">
+  <w:style w:type="paragraph" w:customStyle="1" w:styleId="DefinitionTerm">
     <w:name w:val="Definition Term"/>
     <w:basedOn w:val="a"/>
     <w:next w:val="Definition"/>
@@ -2784,11 +2718,11 @@
       <w:b/>
     </w:rPr>
   </w:style>
-  <w:style w:customStyle="1" w:styleId="Definition" w:type="paragraph">
+  <w:style w:type="paragraph" w:customStyle="1" w:styleId="Definition">
     <w:name w:val="Definition"/>
     <w:basedOn w:val="a"/>
   </w:style>
-  <w:style w:styleId="ac" w:type="paragraph">
+  <w:style w:type="paragraph" w:styleId="ac">
     <w:name w:val="caption"/>
     <w:basedOn w:val="a"/>
     <w:link w:val="ad"/>
@@ -2799,13 +2733,13 @@
       <w:i/>
     </w:rPr>
   </w:style>
-  <w:style w:customStyle="1" w:styleId="TableCaption" w:type="paragraph">
+  <w:style w:type="paragraph" w:customStyle="1" w:styleId="TableCaption">
     <w:name w:val="Table Caption"/>
     <w:basedOn w:val="ac"/>
     <w:rsid w:val="005B72F6"/>
     <w:pPr>
       <w:keepNext/>
-      <w:spacing w:after="20" w:before="20" w:line="264" w:lineRule="auto"/>
+      <w:spacing w:before="20" w:after="20" w:line="264" w:lineRule="auto"/>
       <w:jc w:val="center"/>
     </w:pPr>
     <w:rPr>
@@ -2813,53 +2747,54 @@
       <w:sz w:val="19"/>
     </w:rPr>
   </w:style>
-  <w:style w:customStyle="1" w:styleId="ImageCaption" w:type="paragraph">
+  <w:style w:type="paragraph" w:customStyle="1" w:styleId="ImageCaption">
     <w:name w:val="Image Caption"/>
     <w:basedOn w:val="ac"/>
   </w:style>
-  <w:style w:customStyle="1" w:styleId="Figure" w:type="paragraph">
+  <w:style w:type="paragraph" w:customStyle="1" w:styleId="Figure">
     <w:name w:val="Figure"/>
     <w:basedOn w:val="a"/>
   </w:style>
-  <w:style w:customStyle="1" w:styleId="CaptionedFigure" w:type="paragraph">
+  <w:style w:type="paragraph" w:customStyle="1" w:styleId="CaptionedFigure">
     <w:name w:val="Captioned Figure"/>
     <w:basedOn w:val="Figure"/>
     <w:pPr>
       <w:keepNext/>
     </w:pPr>
   </w:style>
-  <w:style w:customStyle="1" w:styleId="ad" w:type="character">
+  <w:style w:type="character" w:customStyle="1" w:styleId="ad">
     <w:name w:val="题注 字符"/>
     <w:basedOn w:val="a1"/>
     <w:link w:val="ac"/>
   </w:style>
-  <w:style w:customStyle="1" w:styleId="VerbatimChar" w:type="character">
+  <w:style w:type="character" w:customStyle="1" w:styleId="VerbatimChar">
     <w:name w:val="Verbatim Char"/>
     <w:basedOn w:val="ad"/>
+    <w:link w:val="SourceCode"/>
     <w:rPr>
       <w:rFonts w:ascii="Consolas" w:hAnsi="Consolas"/>
       <w:sz w:val="22"/>
     </w:rPr>
   </w:style>
-  <w:style w:customStyle="1" w:styleId="SectionNumber" w:type="character">
+  <w:style w:type="character" w:customStyle="1" w:styleId="SectionNumber">
     <w:name w:val="Section Number"/>
     <w:basedOn w:val="ad"/>
   </w:style>
-  <w:style w:styleId="ae" w:type="character">
+  <w:style w:type="character" w:styleId="ae">
     <w:name w:val="footnote reference"/>
     <w:basedOn w:val="ad"/>
     <w:rPr>
       <w:vertAlign w:val="superscript"/>
     </w:rPr>
   </w:style>
-  <w:style w:styleId="af" w:type="character">
+  <w:style w:type="character" w:styleId="af">
     <w:name w:val="Hyperlink"/>
     <w:basedOn w:val="ad"/>
     <w:rPr>
-      <w:color w:themeColor="accent1" w:val="156082"/>
-    </w:rPr>
-  </w:style>
-  <w:style w:styleId="TOC" w:type="paragraph">
+      <w:color w:val="156082" w:themeColor="accent1"/>
+    </w:rPr>
+  </w:style>
+  <w:style w:type="paragraph" w:styleId="TOC">
     <w:name w:val="TOC Heading"/>
     <w:basedOn w:val="1"/>
     <w:next w:val="a0"/>
@@ -2874,7 +2809,7 @@
       <w:rFonts w:eastAsiaTheme="majorEastAsia"/>
     </w:rPr>
   </w:style>
-  <w:style w:styleId="af0" w:type="table">
+  <w:style w:type="table" w:styleId="af0">
     <w:name w:val="Table Grid"/>
     <w:basedOn w:val="a2"/>
     <w:rsid w:val="006B6FB7"/>
@@ -2886,24 +2821,24 @@
     </w:rPr>
     <w:tblPr>
       <w:tblBorders>
-        <w:top w:color="auto" w:space="0" w:sz="4" w:val="single"/>
-        <w:left w:color="auto" w:space="0" w:sz="4" w:val="single"/>
-        <w:bottom w:color="auto" w:space="0" w:sz="4" w:val="single"/>
-        <w:right w:color="auto" w:space="0" w:sz="4" w:val="single"/>
-        <w:insideH w:color="auto" w:space="0" w:sz="4" w:val="single"/>
-        <w:insideV w:color="auto" w:space="0" w:sz="4" w:val="single"/>
+        <w:top w:val="single" w:sz="4" w:space="0" w:color="auto"/>
+        <w:left w:val="single" w:sz="4" w:space="0" w:color="auto"/>
+        <w:bottom w:val="single" w:sz="4" w:space="0" w:color="auto"/>
+        <w:right w:val="single" w:sz="4" w:space="0" w:color="auto"/>
+        <w:insideH w:val="single" w:sz="4" w:space="0" w:color="auto"/>
+        <w:insideV w:val="single" w:sz="4" w:space="0" w:color="auto"/>
       </w:tblBorders>
     </w:tblPr>
   </w:style>
-  <w:style w:styleId="af1" w:type="paragraph">
+  <w:style w:type="paragraph" w:styleId="af1">
     <w:name w:val="header"/>
     <w:basedOn w:val="a"/>
     <w:link w:val="af2"/>
     <w:rsid w:val="000766DA"/>
     <w:pPr>
       <w:tabs>
-        <w:tab w:pos="4153" w:val="center"/>
-        <w:tab w:pos="8306" w:val="right"/>
+        <w:tab w:val="center" w:pos="4153"/>
+        <w:tab w:val="right" w:pos="8306"/>
       </w:tabs>
       <w:snapToGrid w:val="0"/>
       <w:jc w:val="center"/>
@@ -2913,7 +2848,7 @@
       <w:szCs w:val="18"/>
     </w:rPr>
   </w:style>
-  <w:style w:customStyle="1" w:styleId="af2" w:type="character">
+  <w:style w:type="character" w:customStyle="1" w:styleId="af2">
     <w:name w:val="页眉 字符"/>
     <w:basedOn w:val="a1"/>
     <w:link w:val="af1"/>
@@ -2923,15 +2858,15 @@
       <w:szCs w:val="18"/>
     </w:rPr>
   </w:style>
-  <w:style w:styleId="af3" w:type="paragraph">
+  <w:style w:type="paragraph" w:styleId="af3">
     <w:name w:val="footer"/>
     <w:basedOn w:val="a"/>
     <w:link w:val="af4"/>
     <w:rsid w:val="000766DA"/>
     <w:pPr>
       <w:tabs>
-        <w:tab w:pos="4153" w:val="center"/>
-        <w:tab w:pos="8306" w:val="right"/>
+        <w:tab w:val="center" w:pos="4153"/>
+        <w:tab w:val="right" w:pos="8306"/>
       </w:tabs>
       <w:snapToGrid w:val="0"/>
     </w:pPr>
@@ -2940,7 +2875,7 @@
       <w:szCs w:val="18"/>
     </w:rPr>
   </w:style>
-  <w:style w:customStyle="1" w:styleId="af4" w:type="character">
+  <w:style w:type="character" w:customStyle="1" w:styleId="af4">
     <w:name w:val="页脚 字符"/>
     <w:basedOn w:val="a1"/>
     <w:link w:val="af3"/>
@@ -2950,7 +2885,7 @@
       <w:szCs w:val="18"/>
     </w:rPr>
   </w:style>
-  <w:style w:customStyle="1" w:styleId="InfoCellCenter" w:type="paragraph">
+  <w:style w:type="paragraph" w:customStyle="1" w:styleId="InfoCellCenter">
     <w:name w:val="InfoCellCenter"/>
     <w:basedOn w:val="a4"/>
     <w:qFormat/>
@@ -2962,237 +2897,301 @@
   </w:style>
   <w:style w:type="paragraph" w:customStyle="1" w:styleId="SourceCode">
     <w:name w:val="Source Code"/>
-    <w:basedOn w:val="Normal"/>
     <w:link w:val="VerbatimChar"/>
     <w:pPr>
-      <w:wordWrap w:val="off"/>
+      <w:wordWrap w:val="0"/>
     </w:pPr>
   </w:style>
   <w:style w:type="character" w:customStyle="1" w:styleId="KeywordTok">
     <w:name w:val="KeywordTok"/>
     <w:basedOn w:val="VerbatimChar"/>
     <w:rPr>
+      <w:rFonts w:ascii="Consolas" w:hAnsi="Consolas"/>
       <w:b/>
       <w:color w:val="007020"/>
+      <w:sz w:val="22"/>
     </w:rPr>
   </w:style>
   <w:style w:type="character" w:customStyle="1" w:styleId="DataTypeTok">
     <w:name w:val="DataTypeTok"/>
     <w:basedOn w:val="VerbatimChar"/>
     <w:rPr>
+      <w:rFonts w:ascii="Consolas" w:hAnsi="Consolas"/>
       <w:color w:val="902000"/>
+      <w:sz w:val="22"/>
     </w:rPr>
   </w:style>
   <w:style w:type="character" w:customStyle="1" w:styleId="DecValTok">
     <w:name w:val="DecValTok"/>
     <w:basedOn w:val="VerbatimChar"/>
     <w:rPr>
-      <w:color w:val="40a070"/>
+      <w:rFonts w:ascii="Consolas" w:hAnsi="Consolas"/>
+      <w:color w:val="40A070"/>
+      <w:sz w:val="22"/>
     </w:rPr>
   </w:style>
   <w:style w:type="character" w:customStyle="1" w:styleId="BaseNTok">
     <w:name w:val="BaseNTok"/>
     <w:basedOn w:val="VerbatimChar"/>
     <w:rPr>
-      <w:color w:val="40a070"/>
+      <w:rFonts w:ascii="Consolas" w:hAnsi="Consolas"/>
+      <w:color w:val="40A070"/>
+      <w:sz w:val="22"/>
     </w:rPr>
   </w:style>
   <w:style w:type="character" w:customStyle="1" w:styleId="FloatTok">
     <w:name w:val="FloatTok"/>
     <w:basedOn w:val="VerbatimChar"/>
     <w:rPr>
-      <w:color w:val="40a070"/>
+      <w:rFonts w:ascii="Consolas" w:hAnsi="Consolas"/>
+      <w:color w:val="40A070"/>
+      <w:sz w:val="22"/>
     </w:rPr>
   </w:style>
   <w:style w:type="character" w:customStyle="1" w:styleId="ConstantTok">
     <w:name w:val="ConstantTok"/>
     <w:basedOn w:val="VerbatimChar"/>
     <w:rPr>
+      <w:rFonts w:ascii="Consolas" w:hAnsi="Consolas"/>
       <w:color w:val="880000"/>
+      <w:sz w:val="22"/>
     </w:rPr>
   </w:style>
   <w:style w:type="character" w:customStyle="1" w:styleId="CharTok">
     <w:name w:val="CharTok"/>
     <w:basedOn w:val="VerbatimChar"/>
     <w:rPr>
-      <w:color w:val="4070a0"/>
+      <w:rFonts w:ascii="Consolas" w:hAnsi="Consolas"/>
+      <w:color w:val="4070A0"/>
+      <w:sz w:val="22"/>
     </w:rPr>
   </w:style>
   <w:style w:type="character" w:customStyle="1" w:styleId="SpecialCharTok">
     <w:name w:val="SpecialCharTok"/>
     <w:basedOn w:val="VerbatimChar"/>
     <w:rPr>
-      <w:color w:val="4070a0"/>
+      <w:rFonts w:ascii="Consolas" w:hAnsi="Consolas"/>
+      <w:color w:val="4070A0"/>
+      <w:sz w:val="22"/>
     </w:rPr>
   </w:style>
   <w:style w:type="character" w:customStyle="1" w:styleId="StringTok">
     <w:name w:val="StringTok"/>
     <w:basedOn w:val="VerbatimChar"/>
     <w:rPr>
-      <w:color w:val="4070a0"/>
+      <w:rFonts w:ascii="Consolas" w:hAnsi="Consolas"/>
+      <w:color w:val="4070A0"/>
+      <w:sz w:val="22"/>
     </w:rPr>
   </w:style>
   <w:style w:type="character" w:customStyle="1" w:styleId="VerbatimStringTok">
     <w:name w:val="VerbatimStringTok"/>
     <w:basedOn w:val="VerbatimChar"/>
     <w:rPr>
-      <w:color w:val="4070a0"/>
+      <w:rFonts w:ascii="Consolas" w:hAnsi="Consolas"/>
+      <w:color w:val="4070A0"/>
+      <w:sz w:val="22"/>
     </w:rPr>
   </w:style>
   <w:style w:type="character" w:customStyle="1" w:styleId="SpecialStringTok">
     <w:name w:val="SpecialStringTok"/>
     <w:basedOn w:val="VerbatimChar"/>
     <w:rPr>
-      <w:color w:val="bb6688"/>
+      <w:rFonts w:ascii="Consolas" w:hAnsi="Consolas"/>
+      <w:color w:val="BB6688"/>
+      <w:sz w:val="22"/>
     </w:rPr>
   </w:style>
   <w:style w:type="character" w:customStyle="1" w:styleId="ImportTok">
     <w:name w:val="ImportTok"/>
     <w:basedOn w:val="VerbatimChar"/>
     <w:rPr>
+      <w:rFonts w:ascii="Consolas" w:hAnsi="Consolas"/>
       <w:b/>
       <w:color w:val="008000"/>
+      <w:sz w:val="22"/>
     </w:rPr>
   </w:style>
   <w:style w:type="character" w:customStyle="1" w:styleId="CommentTok">
     <w:name w:val="CommentTok"/>
     <w:basedOn w:val="VerbatimChar"/>
     <w:rPr>
+      <w:rFonts w:ascii="Consolas" w:hAnsi="Consolas"/>
       <w:i/>
-      <w:color w:val="60a0b0"/>
+      <w:color w:val="60A0B0"/>
+      <w:sz w:val="22"/>
     </w:rPr>
   </w:style>
   <w:style w:type="character" w:customStyle="1" w:styleId="DocumentationTok">
     <w:name w:val="DocumentationTok"/>
     <w:basedOn w:val="VerbatimChar"/>
     <w:rPr>
+      <w:rFonts w:ascii="Consolas" w:hAnsi="Consolas"/>
       <w:i/>
-      <w:color w:val="ba2121"/>
+      <w:color w:val="BA2121"/>
+      <w:sz w:val="22"/>
     </w:rPr>
   </w:style>
   <w:style w:type="character" w:customStyle="1" w:styleId="AnnotationTok">
     <w:name w:val="AnnotationTok"/>
     <w:basedOn w:val="VerbatimChar"/>
     <w:rPr>
+      <w:rFonts w:ascii="Consolas" w:hAnsi="Consolas"/>
       <w:b/>
       <w:i/>
-      <w:color w:val="60a0b0"/>
+      <w:color w:val="60A0B0"/>
+      <w:sz w:val="22"/>
     </w:rPr>
   </w:style>
   <w:style w:type="character" w:customStyle="1" w:styleId="CommentVarTok">
     <w:name w:val="CommentVarTok"/>
     <w:basedOn w:val="VerbatimChar"/>
     <w:rPr>
+      <w:rFonts w:ascii="Consolas" w:hAnsi="Consolas"/>
       <w:b/>
       <w:i/>
-      <w:color w:val="60a0b0"/>
+      <w:color w:val="60A0B0"/>
+      <w:sz w:val="22"/>
     </w:rPr>
   </w:style>
   <w:style w:type="character" w:customStyle="1" w:styleId="OtherTok">
     <w:name w:val="OtherTok"/>
     <w:basedOn w:val="VerbatimChar"/>
     <w:rPr>
+      <w:rFonts w:ascii="Consolas" w:hAnsi="Consolas"/>
       <w:color w:val="007020"/>
+      <w:sz w:val="22"/>
     </w:rPr>
   </w:style>
   <w:style w:type="character" w:customStyle="1" w:styleId="FunctionTok">
     <w:name w:val="FunctionTok"/>
     <w:basedOn w:val="VerbatimChar"/>
     <w:rPr>
-      <w:color w:val="06287e"/>
+      <w:rFonts w:ascii="Consolas" w:hAnsi="Consolas"/>
+      <w:color w:val="06287E"/>
+      <w:sz w:val="22"/>
     </w:rPr>
   </w:style>
   <w:style w:type="character" w:customStyle="1" w:styleId="VariableTok">
     <w:name w:val="VariableTok"/>
     <w:basedOn w:val="VerbatimChar"/>
     <w:rPr>
-      <w:color w:val="19177c"/>
+      <w:rFonts w:ascii="Consolas" w:hAnsi="Consolas"/>
+      <w:color w:val="19177C"/>
+      <w:sz w:val="22"/>
     </w:rPr>
   </w:style>
   <w:style w:type="character" w:customStyle="1" w:styleId="ControlFlowTok">
     <w:name w:val="ControlFlowTok"/>
     <w:basedOn w:val="VerbatimChar"/>
     <w:rPr>
+      <w:rFonts w:ascii="Consolas" w:hAnsi="Consolas"/>
       <w:b/>
       <w:color w:val="007020"/>
+      <w:sz w:val="22"/>
     </w:rPr>
   </w:style>
   <w:style w:type="character" w:customStyle="1" w:styleId="OperatorTok">
     <w:name w:val="OperatorTok"/>
     <w:basedOn w:val="VerbatimChar"/>
     <w:rPr>
+      <w:rFonts w:ascii="Consolas" w:hAnsi="Consolas"/>
       <w:color w:val="666666"/>
+      <w:sz w:val="22"/>
     </w:rPr>
   </w:style>
   <w:style w:type="character" w:customStyle="1" w:styleId="BuiltInTok">
     <w:name w:val="BuiltInTok"/>
     <w:basedOn w:val="VerbatimChar"/>
     <w:rPr>
+      <w:rFonts w:ascii="Consolas" w:hAnsi="Consolas"/>
       <w:color w:val="008000"/>
+      <w:sz w:val="22"/>
     </w:rPr>
   </w:style>
   <w:style w:type="character" w:customStyle="1" w:styleId="ExtensionTok">
     <w:name w:val="ExtensionTok"/>
     <w:basedOn w:val="VerbatimChar"/>
-    <w:rPr/>
+    <w:rPr>
+      <w:rFonts w:ascii="Consolas" w:hAnsi="Consolas"/>
+      <w:sz w:val="22"/>
+    </w:rPr>
   </w:style>
   <w:style w:type="character" w:customStyle="1" w:styleId="PreprocessorTok">
     <w:name w:val="PreprocessorTok"/>
     <w:basedOn w:val="VerbatimChar"/>
     <w:rPr>
-      <w:color w:val="bc7a00"/>
+      <w:rFonts w:ascii="Consolas" w:hAnsi="Consolas"/>
+      <w:color w:val="BC7A00"/>
+      <w:sz w:val="22"/>
     </w:rPr>
   </w:style>
   <w:style w:type="character" w:customStyle="1" w:styleId="AttributeTok">
     <w:name w:val="AttributeTok"/>
     <w:basedOn w:val="VerbatimChar"/>
     <w:rPr>
-      <w:color w:val="7d9029"/>
+      <w:rFonts w:ascii="Consolas" w:hAnsi="Consolas"/>
+      <w:color w:val="7D9029"/>
+      <w:sz w:val="22"/>
     </w:rPr>
   </w:style>
   <w:style w:type="character" w:customStyle="1" w:styleId="RegionMarkerTok">
     <w:name w:val="RegionMarkerTok"/>
     <w:basedOn w:val="VerbatimChar"/>
-    <w:rPr/>
+    <w:rPr>
+      <w:rFonts w:ascii="Consolas" w:hAnsi="Consolas"/>
+      <w:sz w:val="22"/>
+    </w:rPr>
   </w:style>
   <w:style w:type="character" w:customStyle="1" w:styleId="InformationTok">
     <w:name w:val="InformationTok"/>
     <w:basedOn w:val="VerbatimChar"/>
     <w:rPr>
+      <w:rFonts w:ascii="Consolas" w:hAnsi="Consolas"/>
       <w:b/>
       <w:i/>
-      <w:color w:val="60a0b0"/>
+      <w:color w:val="60A0B0"/>
+      <w:sz w:val="22"/>
     </w:rPr>
   </w:style>
   <w:style w:type="character" w:customStyle="1" w:styleId="WarningTok">
     <w:name w:val="WarningTok"/>
     <w:basedOn w:val="VerbatimChar"/>
     <w:rPr>
+      <w:rFonts w:ascii="Consolas" w:hAnsi="Consolas"/>
       <w:b/>
       <w:i/>
-      <w:color w:val="60a0b0"/>
+      <w:color w:val="60A0B0"/>
+      <w:sz w:val="22"/>
     </w:rPr>
   </w:style>
   <w:style w:type="character" w:customStyle="1" w:styleId="AlertTok">
     <w:name w:val="AlertTok"/>
     <w:basedOn w:val="VerbatimChar"/>
     <w:rPr>
+      <w:rFonts w:ascii="Consolas" w:hAnsi="Consolas"/>
       <w:b/>
-      <w:color w:val="ff0000"/>
+      <w:color w:val="FF0000"/>
+      <w:sz w:val="22"/>
     </w:rPr>
   </w:style>
   <w:style w:type="character" w:customStyle="1" w:styleId="ErrorTok">
     <w:name w:val="ErrorTok"/>
     <w:basedOn w:val="VerbatimChar"/>
     <w:rPr>
+      <w:rFonts w:ascii="Consolas" w:hAnsi="Consolas"/>
       <w:b/>
-      <w:color w:val="ff0000"/>
+      <w:color w:val="FF0000"/>
+      <w:sz w:val="22"/>
     </w:rPr>
   </w:style>
   <w:style w:type="character" w:customStyle="1" w:styleId="NormalTok">
     <w:name w:val="NormalTok"/>
     <w:basedOn w:val="VerbatimChar"/>
-    <w:rPr/>
+    <w:rPr>
+      <w:rFonts w:ascii="Consolas" w:hAnsi="Consolas"/>
+      <w:sz w:val="22"/>
+    </w:rPr>
   </w:style>
 </w:styles>
 </file>

</xml_diff>